<commit_message>
Release 1.21 - EEP 1.0
</commit_message>
<xml_diff>
--- a/documentation/CHANGELOG_EET_Calculator.docx
+++ b/documentation/CHANGELOG_EET_Calculator.docx
@@ -5,30 +5,26 @@
     <w:p>
       <w:pPr>
         <w:pStyle w:val="Titre"/>
-        <w:rPr>
-          <w:lang w:val="fr-FR"/>
-        </w:rPr>
-      </w:pPr>
-      <w:r>
-        <w:rPr>
-          <w:lang w:val="fr-FR"/>
-        </w:rPr>
-        <w:t xml:space="preserve">EET </w:t>
-      </w:r>
-      <w:proofErr w:type="spellStart"/>
-      <w:r>
-        <w:rPr>
-          <w:lang w:val="fr-FR"/>
-        </w:rPr>
-        <w:t>Calculator</w:t>
-      </w:r>
-      <w:proofErr w:type="spellEnd"/>
-      <w:r>
-        <w:rPr>
-          <w:lang w:val="fr-FR"/>
-        </w:rPr>
-        <w:t xml:space="preserve"> - Changelog</w:t>
-      </w:r>
+      </w:pPr>
+      <w:r>
+        <w:t>EET Calculator - Changelog</w:t>
+      </w:r>
+    </w:p>
+    <w:p>
+      <w:pPr>
+        <w:spacing w:before="100" w:beforeAutospacing="1" w:after="100" w:afterAutospacing="1" w:line="240" w:lineRule="auto"/>
+        <w:outlineLvl w:val="0"/>
+        <w:rPr>
+          <w:rFonts w:asciiTheme="majorHAnsi" w:eastAsia="Times New Roman" w:hAnsiTheme="majorHAnsi" w:cstheme="majorHAnsi"/>
+          <w:b/>
+          <w:bCs/>
+          <w:color w:val="365F91" w:themeColor="accent1" w:themeShade="BF"/>
+          <w:kern w:val="36"/>
+          <w:sz w:val="28"/>
+          <w:szCs w:val="28"/>
+          <w:lang w:eastAsia="fr-FR"/>
+        </w:rPr>
+      </w:pPr>
     </w:p>
     <w:p>
       <w:pPr>
@@ -56,9 +52,789 @@
           <w:szCs w:val="28"/>
           <w:lang w:val="fr-FR" w:eastAsia="fr-FR"/>
         </w:rPr>
-        <w:t>Version</w:t>
-      </w:r>
-      <w:r>
+        <w:t>Version 2.01 / APP_VERSION 1.21 – juillet 2026</w:t>
+      </w:r>
+    </w:p>
+    <w:p>
+      <w:pPr>
+        <w:spacing w:before="100" w:beforeAutospacing="1" w:after="100" w:afterAutospacing="1" w:line="240" w:lineRule="auto"/>
+        <w:outlineLvl w:val="0"/>
+        <w:rPr>
+          <w:rFonts w:eastAsia="Times New Roman" w:cstheme="majorHAnsi"/>
+          <w:b/>
+          <w:bCs/>
+          <w:color w:val="365F91" w:themeColor="accent1" w:themeShade="BF"/>
+          <w:kern w:val="36"/>
+          <w:lang w:val="fr-FR" w:eastAsia="fr-FR"/>
+        </w:rPr>
+      </w:pPr>
+      <w:r>
+        <w:rPr>
+          <w:rFonts w:eastAsia="Times New Roman" w:cstheme="majorHAnsi"/>
+          <w:b/>
+          <w:bCs/>
+          <w:color w:val="000000" w:themeColor="text1"/>
+          <w:kern w:val="36"/>
+          <w:lang w:val="fr-FR" w:eastAsia="fr-FR"/>
+        </w:rPr>
+        <w:t>Architecture</w:t>
+      </w:r>
+    </w:p>
+    <w:p>
+      <w:pPr>
+        <w:pStyle w:val="Paragraphedeliste"/>
+        <w:numPr>
+          <w:ilvl w:val="0"/>
+          <w:numId w:val="21"/>
+        </w:numPr>
+        <w:spacing w:before="100" w:beforeAutospacing="1" w:after="100" w:afterAutospacing="1" w:line="240" w:lineRule="auto"/>
+        <w:outlineLvl w:val="0"/>
+        <w:rPr>
+          <w:rFonts w:eastAsia="Times New Roman" w:cstheme="majorHAnsi"/>
+          <w:color w:val="000000" w:themeColor="text1"/>
+          <w:kern w:val="36"/>
+          <w:lang w:val="fr-FR" w:eastAsia="fr-FR"/>
+        </w:rPr>
+      </w:pPr>
+      <w:r>
+        <w:rPr>
+          <w:rFonts w:eastAsia="Times New Roman" w:cstheme="majorHAnsi"/>
+          <w:color w:val="000000" w:themeColor="text1"/>
+          <w:kern w:val="36"/>
+          <w:lang w:val="fr-FR" w:eastAsia="fr-FR"/>
+        </w:rPr>
+        <w:t>Finalisation de l'architecture basée sur RACE_SCHEMA (protocole d'échange) et RACE_MODEL (modèle métier).</w:t>
+      </w:r>
+    </w:p>
+    <w:p>
+      <w:pPr>
+        <w:pStyle w:val="Paragraphedeliste"/>
+        <w:numPr>
+          <w:ilvl w:val="0"/>
+          <w:numId w:val="21"/>
+        </w:numPr>
+        <w:spacing w:before="100" w:beforeAutospacing="1" w:after="100" w:afterAutospacing="1" w:line="240" w:lineRule="auto"/>
+        <w:outlineLvl w:val="0"/>
+        <w:rPr>
+          <w:rFonts w:eastAsia="Times New Roman" w:cstheme="majorHAnsi"/>
+          <w:color w:val="000000" w:themeColor="text1"/>
+          <w:kern w:val="36"/>
+          <w:lang w:val="fr-FR" w:eastAsia="fr-FR"/>
+        </w:rPr>
+      </w:pPr>
+      <w:r>
+        <w:rPr>
+          <w:rFonts w:eastAsia="Times New Roman" w:cstheme="majorHAnsi"/>
+          <w:color w:val="000000" w:themeColor="text1"/>
+          <w:kern w:val="36"/>
+          <w:lang w:val="fr-FR" w:eastAsia="fr-FR"/>
+        </w:rPr>
+        <w:t>Première version conforme au protocole d'échange EEP 1.0.</w:t>
+      </w:r>
+    </w:p>
+    <w:p>
+      <w:pPr>
+        <w:pStyle w:val="Paragraphedeliste"/>
+        <w:numPr>
+          <w:ilvl w:val="0"/>
+          <w:numId w:val="21"/>
+        </w:numPr>
+        <w:spacing w:before="100" w:beforeAutospacing="1" w:after="100" w:afterAutospacing="1" w:line="240" w:lineRule="auto"/>
+        <w:outlineLvl w:val="0"/>
+        <w:rPr>
+          <w:rFonts w:eastAsia="Times New Roman" w:cstheme="majorHAnsi"/>
+          <w:color w:val="000000" w:themeColor="text1"/>
+          <w:kern w:val="36"/>
+          <w:lang w:val="fr-FR" w:eastAsia="fr-FR"/>
+        </w:rPr>
+      </w:pPr>
+      <w:r>
+        <w:rPr>
+          <w:rFonts w:eastAsia="Times New Roman" w:cstheme="majorHAnsi"/>
+          <w:color w:val="000000" w:themeColor="text1"/>
+          <w:kern w:val="36"/>
+          <w:lang w:val="fr-FR" w:eastAsia="fr-FR"/>
+        </w:rPr>
+        <w:t>Clarification des responsabilités entre les services, le modèle métier et la génération des rapports PDF.</w:t>
+      </w:r>
+    </w:p>
+    <w:p>
+      <w:pPr>
+        <w:spacing w:before="100" w:beforeAutospacing="1" w:after="100" w:afterAutospacing="1" w:line="240" w:lineRule="auto"/>
+        <w:outlineLvl w:val="0"/>
+        <w:rPr>
+          <w:rFonts w:eastAsia="Times New Roman" w:cstheme="majorHAnsi"/>
+          <w:b/>
+          <w:bCs/>
+          <w:color w:val="000000" w:themeColor="text1"/>
+          <w:kern w:val="36"/>
+          <w:lang w:val="fr-FR" w:eastAsia="fr-FR"/>
+        </w:rPr>
+      </w:pPr>
+      <w:r>
+        <w:rPr>
+          <w:rFonts w:eastAsia="Times New Roman" w:cstheme="majorHAnsi"/>
+          <w:b/>
+          <w:bCs/>
+          <w:color w:val="000000" w:themeColor="text1"/>
+          <w:kern w:val="36"/>
+          <w:lang w:val="fr-FR" w:eastAsia="fr-FR"/>
+        </w:rPr>
+        <w:t>Nouvelles fonctionnalités</w:t>
+      </w:r>
+    </w:p>
+    <w:p>
+      <w:pPr>
+        <w:pStyle w:val="Paragraphedeliste"/>
+        <w:numPr>
+          <w:ilvl w:val="0"/>
+          <w:numId w:val="21"/>
+        </w:numPr>
+        <w:spacing w:before="100" w:beforeAutospacing="1" w:after="100" w:afterAutospacing="1" w:line="240" w:lineRule="auto"/>
+        <w:outlineLvl w:val="0"/>
+        <w:rPr>
+          <w:rFonts w:eastAsia="Times New Roman" w:cstheme="majorHAnsi"/>
+          <w:color w:val="000000" w:themeColor="text1"/>
+          <w:kern w:val="36"/>
+          <w:lang w:val="fr-FR" w:eastAsia="fr-FR"/>
+        </w:rPr>
+      </w:pPr>
+      <w:r>
+        <w:rPr>
+          <w:rFonts w:eastAsia="Times New Roman" w:cstheme="majorHAnsi"/>
+          <w:color w:val="000000" w:themeColor="text1"/>
+          <w:kern w:val="36"/>
+          <w:lang w:val="fr-FR" w:eastAsia="fr-FR"/>
+        </w:rPr>
+        <w:t>Recherche publique d'un calcul par Calculation ID.</w:t>
+      </w:r>
+    </w:p>
+    <w:p>
+      <w:pPr>
+        <w:pStyle w:val="Paragraphedeliste"/>
+        <w:numPr>
+          <w:ilvl w:val="0"/>
+          <w:numId w:val="21"/>
+        </w:numPr>
+        <w:spacing w:before="100" w:beforeAutospacing="1" w:after="100" w:afterAutospacing="1" w:line="240" w:lineRule="auto"/>
+        <w:outlineLvl w:val="0"/>
+        <w:rPr>
+          <w:rFonts w:eastAsia="Times New Roman" w:cstheme="majorHAnsi"/>
+          <w:color w:val="000000" w:themeColor="text1"/>
+          <w:kern w:val="36"/>
+          <w:lang w:val="fr-FR" w:eastAsia="fr-FR"/>
+        </w:rPr>
+      </w:pPr>
+      <w:r>
+        <w:rPr>
+          <w:rFonts w:eastAsia="Times New Roman" w:cstheme="majorHAnsi"/>
+          <w:color w:val="000000" w:themeColor="text1"/>
+          <w:kern w:val="36"/>
+          <w:lang w:val="fr-FR" w:eastAsia="fr-FR"/>
+        </w:rPr>
+        <w:t>Rappel d'un calcul pour modification à partir de son Calculation ID.</w:t>
+      </w:r>
+    </w:p>
+    <w:p>
+      <w:pPr>
+        <w:pStyle w:val="Paragraphedeliste"/>
+        <w:numPr>
+          <w:ilvl w:val="0"/>
+          <w:numId w:val="21"/>
+        </w:numPr>
+        <w:spacing w:before="100" w:beforeAutospacing="1" w:after="100" w:afterAutospacing="1" w:line="240" w:lineRule="auto"/>
+        <w:outlineLvl w:val="0"/>
+        <w:rPr>
+          <w:rFonts w:eastAsia="Times New Roman" w:cstheme="majorHAnsi"/>
+          <w:color w:val="000000" w:themeColor="text1"/>
+          <w:kern w:val="36"/>
+          <w:lang w:val="fr-FR" w:eastAsia="fr-FR"/>
+        </w:rPr>
+      </w:pPr>
+      <w:r>
+        <w:rPr>
+          <w:rFonts w:eastAsia="Times New Roman" w:cstheme="majorHAnsi"/>
+          <w:color w:val="000000" w:themeColor="text1"/>
+          <w:kern w:val="36"/>
+          <w:lang w:val="fr-FR" w:eastAsia="fr-FR"/>
+        </w:rPr>
+        <w:t>Gestion du contexte de travail permettant la production automatique :</w:t>
+      </w:r>
+    </w:p>
+    <w:p>
+      <w:pPr>
+        <w:pStyle w:val="Paragraphedeliste"/>
+        <w:numPr>
+          <w:ilvl w:val="1"/>
+          <w:numId w:val="21"/>
+        </w:numPr>
+        <w:spacing w:before="100" w:beforeAutospacing="1" w:after="100" w:afterAutospacing="1" w:line="240" w:lineRule="auto"/>
+        <w:outlineLvl w:val="0"/>
+        <w:rPr>
+          <w:rFonts w:eastAsia="Times New Roman" w:cstheme="majorHAnsi"/>
+          <w:color w:val="000000" w:themeColor="text1"/>
+          <w:kern w:val="36"/>
+          <w:lang w:val="fr-FR" w:eastAsia="fr-FR"/>
+        </w:rPr>
+      </w:pPr>
+      <w:proofErr w:type="gramStart"/>
+      <w:r>
+        <w:rPr>
+          <w:rFonts w:eastAsia="Times New Roman" w:cstheme="majorHAnsi"/>
+          <w:color w:val="000000" w:themeColor="text1"/>
+          <w:kern w:val="36"/>
+          <w:lang w:val="fr-FR" w:eastAsia="fr-FR"/>
+        </w:rPr>
+        <w:t>d'un</w:t>
+      </w:r>
+      <w:proofErr w:type="gramEnd"/>
+      <w:r>
+        <w:rPr>
+          <w:rFonts w:eastAsia="Times New Roman" w:cstheme="majorHAnsi"/>
+          <w:color w:val="000000" w:themeColor="text1"/>
+          <w:kern w:val="36"/>
+          <w:lang w:val="fr-FR" w:eastAsia="fr-FR"/>
+        </w:rPr>
+        <w:t xml:space="preserve"> PDF anonymisé en consultation publique ;</w:t>
+      </w:r>
+    </w:p>
+    <w:p>
+      <w:pPr>
+        <w:pStyle w:val="Paragraphedeliste"/>
+        <w:numPr>
+          <w:ilvl w:val="1"/>
+          <w:numId w:val="21"/>
+        </w:numPr>
+        <w:spacing w:before="100" w:beforeAutospacing="1" w:after="100" w:afterAutospacing="1" w:line="240" w:lineRule="auto"/>
+        <w:outlineLvl w:val="0"/>
+        <w:rPr>
+          <w:rFonts w:eastAsia="Times New Roman" w:cstheme="majorHAnsi"/>
+          <w:color w:val="000000" w:themeColor="text1"/>
+          <w:kern w:val="36"/>
+          <w:lang w:val="fr-FR" w:eastAsia="fr-FR"/>
+        </w:rPr>
+      </w:pPr>
+      <w:proofErr w:type="gramStart"/>
+      <w:r>
+        <w:rPr>
+          <w:rFonts w:eastAsia="Times New Roman" w:cstheme="majorHAnsi"/>
+          <w:color w:val="000000" w:themeColor="text1"/>
+          <w:kern w:val="36"/>
+          <w:lang w:val="fr-FR" w:eastAsia="fr-FR"/>
+        </w:rPr>
+        <w:t>d'un</w:t>
+      </w:r>
+      <w:proofErr w:type="gramEnd"/>
+      <w:r>
+        <w:rPr>
+          <w:rFonts w:eastAsia="Times New Roman" w:cstheme="majorHAnsi"/>
+          <w:color w:val="000000" w:themeColor="text1"/>
+          <w:kern w:val="36"/>
+          <w:lang w:val="fr-FR" w:eastAsia="fr-FR"/>
+        </w:rPr>
+        <w:t xml:space="preserve"> PDF nominatif lors du rappel d'un calcul.</w:t>
+      </w:r>
+    </w:p>
+    <w:p>
+      <w:pPr>
+        <w:spacing w:before="100" w:beforeAutospacing="1" w:after="100" w:afterAutospacing="1" w:line="240" w:lineRule="auto"/>
+        <w:outlineLvl w:val="0"/>
+        <w:rPr>
+          <w:rFonts w:eastAsia="Times New Roman" w:cstheme="majorHAnsi"/>
+          <w:b/>
+          <w:bCs/>
+          <w:color w:val="000000" w:themeColor="text1"/>
+          <w:kern w:val="36"/>
+          <w:lang w:val="fr-FR" w:eastAsia="fr-FR"/>
+        </w:rPr>
+      </w:pPr>
+      <w:r>
+        <w:rPr>
+          <w:rFonts w:eastAsia="Times New Roman" w:cstheme="majorHAnsi"/>
+          <w:b/>
+          <w:bCs/>
+          <w:color w:val="000000" w:themeColor="text1"/>
+          <w:kern w:val="36"/>
+          <w:lang w:val="fr-FR" w:eastAsia="fr-FR"/>
+        </w:rPr>
+        <w:t>Sessions Flask</w:t>
+      </w:r>
+    </w:p>
+    <w:p>
+      <w:pPr>
+        <w:pStyle w:val="Paragraphedeliste"/>
+        <w:numPr>
+          <w:ilvl w:val="0"/>
+          <w:numId w:val="21"/>
+        </w:numPr>
+        <w:spacing w:before="100" w:beforeAutospacing="1" w:after="100" w:afterAutospacing="1" w:line="240" w:lineRule="auto"/>
+        <w:outlineLvl w:val="0"/>
+        <w:rPr>
+          <w:rFonts w:eastAsia="Times New Roman" w:cstheme="majorHAnsi"/>
+          <w:color w:val="000000" w:themeColor="text1"/>
+          <w:kern w:val="36"/>
+          <w:lang w:val="fr-FR" w:eastAsia="fr-FR"/>
+        </w:rPr>
+      </w:pPr>
+      <w:r>
+        <w:rPr>
+          <w:rFonts w:eastAsia="Times New Roman" w:cstheme="majorHAnsi"/>
+          <w:color w:val="000000" w:themeColor="text1"/>
+          <w:kern w:val="36"/>
+          <w:lang w:val="fr-FR" w:eastAsia="fr-FR"/>
+        </w:rPr>
+        <w:t>Stabilisation de la permutation entre le document courant et le document précédent.</w:t>
+      </w:r>
+    </w:p>
+    <w:p>
+      <w:pPr>
+        <w:pStyle w:val="Paragraphedeliste"/>
+        <w:numPr>
+          <w:ilvl w:val="0"/>
+          <w:numId w:val="21"/>
+        </w:numPr>
+        <w:spacing w:before="100" w:beforeAutospacing="1" w:after="100" w:afterAutospacing="1" w:line="240" w:lineRule="auto"/>
+        <w:outlineLvl w:val="0"/>
+        <w:rPr>
+          <w:rFonts w:eastAsia="Times New Roman" w:cstheme="majorHAnsi"/>
+          <w:color w:val="000000" w:themeColor="text1"/>
+          <w:kern w:val="36"/>
+          <w:lang w:val="fr-FR" w:eastAsia="fr-FR"/>
+        </w:rPr>
+      </w:pPr>
+      <w:r>
+        <w:rPr>
+          <w:rFonts w:eastAsia="Times New Roman" w:cstheme="majorHAnsi"/>
+          <w:color w:val="000000" w:themeColor="text1"/>
+          <w:kern w:val="36"/>
+          <w:lang w:val="fr-FR" w:eastAsia="fr-FR"/>
+        </w:rPr>
+        <w:t>Validation complète de la conservation et du rappel des documents de travail dans la session utilisateur.</w:t>
+      </w:r>
+    </w:p>
+    <w:p>
+      <w:pPr>
+        <w:spacing w:before="100" w:beforeAutospacing="1" w:after="100" w:afterAutospacing="1" w:line="240" w:lineRule="auto"/>
+        <w:outlineLvl w:val="0"/>
+        <w:rPr>
+          <w:rFonts w:eastAsia="Times New Roman" w:cstheme="majorHAnsi"/>
+          <w:b/>
+          <w:bCs/>
+          <w:color w:val="000000" w:themeColor="text1"/>
+          <w:kern w:val="36"/>
+          <w:lang w:val="fr-FR" w:eastAsia="fr-FR"/>
+        </w:rPr>
+      </w:pPr>
+      <w:r>
+        <w:rPr>
+          <w:rFonts w:eastAsia="Times New Roman" w:cstheme="majorHAnsi"/>
+          <w:b/>
+          <w:bCs/>
+          <w:color w:val="000000" w:themeColor="text1"/>
+          <w:kern w:val="36"/>
+          <w:lang w:val="fr-FR" w:eastAsia="fr-FR"/>
+        </w:rPr>
+        <w:t>Corrections</w:t>
+      </w:r>
+    </w:p>
+    <w:p>
+      <w:pPr>
+        <w:pStyle w:val="Paragraphedeliste"/>
+        <w:numPr>
+          <w:ilvl w:val="0"/>
+          <w:numId w:val="21"/>
+        </w:numPr>
+        <w:spacing w:before="100" w:beforeAutospacing="1" w:after="100" w:afterAutospacing="1" w:line="240" w:lineRule="auto"/>
+        <w:outlineLvl w:val="0"/>
+        <w:rPr>
+          <w:rFonts w:eastAsia="Times New Roman" w:cstheme="majorHAnsi"/>
+          <w:color w:val="000000" w:themeColor="text1"/>
+          <w:kern w:val="36"/>
+          <w:lang w:val="fr-FR" w:eastAsia="fr-FR"/>
+        </w:rPr>
+      </w:pPr>
+      <w:r>
+        <w:rPr>
+          <w:rFonts w:eastAsia="Times New Roman" w:cstheme="majorHAnsi"/>
+          <w:color w:val="000000" w:themeColor="text1"/>
+          <w:kern w:val="36"/>
+          <w:lang w:val="fr-FR" w:eastAsia="fr-FR"/>
+        </w:rPr>
+        <w:t>Correction de plusieurs cas limites liés au rappel des calculs.</w:t>
+      </w:r>
+    </w:p>
+    <w:p>
+      <w:pPr>
+        <w:pStyle w:val="Paragraphedeliste"/>
+        <w:numPr>
+          <w:ilvl w:val="0"/>
+          <w:numId w:val="21"/>
+        </w:numPr>
+        <w:spacing w:before="100" w:beforeAutospacing="1" w:after="100" w:afterAutospacing="1" w:line="240" w:lineRule="auto"/>
+        <w:outlineLvl w:val="0"/>
+        <w:rPr>
+          <w:rFonts w:eastAsia="Times New Roman" w:cstheme="majorHAnsi"/>
+          <w:color w:val="000000" w:themeColor="text1"/>
+          <w:kern w:val="36"/>
+          <w:lang w:val="fr-FR" w:eastAsia="fr-FR"/>
+        </w:rPr>
+      </w:pPr>
+      <w:r>
+        <w:rPr>
+          <w:rFonts w:eastAsia="Times New Roman" w:cstheme="majorHAnsi"/>
+          <w:color w:val="000000" w:themeColor="text1"/>
+          <w:kern w:val="36"/>
+          <w:lang w:val="fr-FR" w:eastAsia="fr-FR"/>
+        </w:rPr>
+        <w:t>Gestion des Calculation ID inexistants avec message utilisateur explicite.</w:t>
+      </w:r>
+    </w:p>
+    <w:p>
+      <w:pPr>
+        <w:pStyle w:val="Paragraphedeliste"/>
+        <w:numPr>
+          <w:ilvl w:val="0"/>
+          <w:numId w:val="21"/>
+        </w:numPr>
+        <w:spacing w:before="100" w:beforeAutospacing="1" w:after="100" w:afterAutospacing="1" w:line="240" w:lineRule="auto"/>
+        <w:outlineLvl w:val="0"/>
+        <w:rPr>
+          <w:rFonts w:eastAsia="Times New Roman" w:cstheme="majorHAnsi"/>
+          <w:color w:val="000000" w:themeColor="text1"/>
+          <w:kern w:val="36"/>
+          <w:lang w:val="fr-FR" w:eastAsia="fr-FR"/>
+        </w:rPr>
+      </w:pPr>
+      <w:r>
+        <w:rPr>
+          <w:rFonts w:eastAsia="Times New Roman" w:cstheme="majorHAnsi"/>
+          <w:color w:val="000000" w:themeColor="text1"/>
+          <w:kern w:val="36"/>
+          <w:lang w:val="fr-FR" w:eastAsia="fr-FR"/>
+        </w:rPr>
+        <w:t>Renforcement de la robustesse des traitements en mode lecture seule.</w:t>
+      </w:r>
+    </w:p>
+    <w:p>
+      <w:pPr>
+        <w:pStyle w:val="Paragraphedeliste"/>
+        <w:numPr>
+          <w:ilvl w:val="0"/>
+          <w:numId w:val="21"/>
+        </w:numPr>
+        <w:spacing w:before="100" w:beforeAutospacing="1" w:after="100" w:afterAutospacing="1" w:line="240" w:lineRule="auto"/>
+        <w:outlineLvl w:val="0"/>
+        <w:rPr>
+          <w:rFonts w:eastAsia="Times New Roman" w:cstheme="majorHAnsi"/>
+          <w:color w:val="000000" w:themeColor="text1"/>
+          <w:kern w:val="36"/>
+          <w:lang w:val="fr-FR" w:eastAsia="fr-FR"/>
+        </w:rPr>
+      </w:pPr>
+      <w:r>
+        <w:rPr>
+          <w:rFonts w:eastAsia="Times New Roman" w:cstheme="majorHAnsi"/>
+          <w:color w:val="000000" w:themeColor="text1"/>
+          <w:kern w:val="36"/>
+          <w:lang w:val="fr-FR" w:eastAsia="fr-FR"/>
+        </w:rPr>
+        <w:t>Diverses corrections mineures d'interface et de workflow.</w:t>
+      </w:r>
+    </w:p>
+    <w:p>
+      <w:pPr>
+        <w:spacing w:before="100" w:beforeAutospacing="1" w:after="100" w:afterAutospacing="1" w:line="240" w:lineRule="auto"/>
+        <w:outlineLvl w:val="0"/>
+        <w:rPr>
+          <w:rFonts w:eastAsia="Times New Roman" w:cstheme="majorHAnsi"/>
+          <w:b/>
+          <w:bCs/>
+          <w:color w:val="000000" w:themeColor="text1"/>
+          <w:kern w:val="36"/>
+          <w:lang w:val="fr-FR" w:eastAsia="fr-FR"/>
+        </w:rPr>
+      </w:pPr>
+      <w:r>
+        <w:rPr>
+          <w:rFonts w:eastAsia="Times New Roman" w:cstheme="majorHAnsi"/>
+          <w:b/>
+          <w:bCs/>
+          <w:color w:val="000000" w:themeColor="text1"/>
+          <w:kern w:val="36"/>
+          <w:lang w:val="fr-FR" w:eastAsia="fr-FR"/>
+        </w:rPr>
+        <w:t>Validation</w:t>
+      </w:r>
+    </w:p>
+    <w:p>
+      <w:pPr>
+        <w:pStyle w:val="Paragraphedeliste"/>
+        <w:numPr>
+          <w:ilvl w:val="0"/>
+          <w:numId w:val="21"/>
+        </w:numPr>
+        <w:spacing w:before="100" w:beforeAutospacing="1" w:after="100" w:afterAutospacing="1" w:line="240" w:lineRule="auto"/>
+        <w:outlineLvl w:val="0"/>
+        <w:rPr>
+          <w:rFonts w:eastAsia="Times New Roman" w:cstheme="majorHAnsi"/>
+          <w:color w:val="000000" w:themeColor="text1"/>
+          <w:kern w:val="36"/>
+          <w:lang w:val="fr-FR" w:eastAsia="fr-FR"/>
+        </w:rPr>
+      </w:pPr>
+      <w:r>
+        <w:rPr>
+          <w:rFonts w:eastAsia="Times New Roman" w:cstheme="majorHAnsi"/>
+          <w:color w:val="000000" w:themeColor="text1"/>
+          <w:kern w:val="36"/>
+          <w:lang w:val="fr-FR" w:eastAsia="fr-FR"/>
+        </w:rPr>
+        <w:t>Validation complète sous Windows.</w:t>
+      </w:r>
+    </w:p>
+    <w:p>
+      <w:pPr>
+        <w:pStyle w:val="Paragraphedeliste"/>
+        <w:numPr>
+          <w:ilvl w:val="0"/>
+          <w:numId w:val="21"/>
+        </w:numPr>
+        <w:spacing w:before="100" w:beforeAutospacing="1" w:after="100" w:afterAutospacing="1" w:line="240" w:lineRule="auto"/>
+        <w:outlineLvl w:val="0"/>
+        <w:rPr>
+          <w:rFonts w:eastAsia="Times New Roman" w:cstheme="majorHAnsi"/>
+          <w:color w:val="000000" w:themeColor="text1"/>
+          <w:kern w:val="36"/>
+          <w:lang w:val="fr-FR" w:eastAsia="fr-FR"/>
+        </w:rPr>
+      </w:pPr>
+      <w:r>
+        <w:rPr>
+          <w:rFonts w:eastAsia="Times New Roman" w:cstheme="majorHAnsi"/>
+          <w:color w:val="000000" w:themeColor="text1"/>
+          <w:kern w:val="36"/>
+          <w:lang w:val="fr-FR" w:eastAsia="fr-FR"/>
+        </w:rPr>
+        <w:t>Validation complète sous Ubuntu Linux (</w:t>
+      </w:r>
+      <w:proofErr w:type="spellStart"/>
+      <w:r>
+        <w:rPr>
+          <w:rFonts w:eastAsia="Times New Roman" w:cstheme="majorHAnsi"/>
+          <w:color w:val="000000" w:themeColor="text1"/>
+          <w:kern w:val="36"/>
+          <w:lang w:val="fr-FR" w:eastAsia="fr-FR"/>
+        </w:rPr>
+        <w:t>Gunicorn</w:t>
+      </w:r>
+      <w:proofErr w:type="spellEnd"/>
+      <w:r>
+        <w:rPr>
+          <w:rFonts w:eastAsia="Times New Roman" w:cstheme="majorHAnsi"/>
+          <w:color w:val="000000" w:themeColor="text1"/>
+          <w:kern w:val="36"/>
+          <w:lang w:val="fr-FR" w:eastAsia="fr-FR"/>
+        </w:rPr>
+        <w:t xml:space="preserve"> + </w:t>
+      </w:r>
+      <w:proofErr w:type="spellStart"/>
+      <w:r>
+        <w:rPr>
+          <w:rFonts w:eastAsia="Times New Roman" w:cstheme="majorHAnsi"/>
+          <w:color w:val="000000" w:themeColor="text1"/>
+          <w:kern w:val="36"/>
+          <w:lang w:val="fr-FR" w:eastAsia="fr-FR"/>
+        </w:rPr>
+        <w:t>nginx</w:t>
+      </w:r>
+      <w:proofErr w:type="spellEnd"/>
+      <w:r>
+        <w:rPr>
+          <w:rFonts w:eastAsia="Times New Roman" w:cstheme="majorHAnsi"/>
+          <w:color w:val="000000" w:themeColor="text1"/>
+          <w:kern w:val="36"/>
+          <w:lang w:val="fr-FR" w:eastAsia="fr-FR"/>
+        </w:rPr>
+        <w:t>).</w:t>
+      </w:r>
+    </w:p>
+    <w:p>
+      <w:pPr>
+        <w:pStyle w:val="Paragraphedeliste"/>
+        <w:numPr>
+          <w:ilvl w:val="0"/>
+          <w:numId w:val="21"/>
+        </w:numPr>
+        <w:spacing w:before="100" w:beforeAutospacing="1" w:after="100" w:afterAutospacing="1" w:line="240" w:lineRule="auto"/>
+        <w:outlineLvl w:val="0"/>
+        <w:rPr>
+          <w:rFonts w:eastAsia="Times New Roman" w:cstheme="majorHAnsi"/>
+          <w:color w:val="000000" w:themeColor="text1"/>
+          <w:kern w:val="36"/>
+          <w:lang w:val="fr-FR" w:eastAsia="fr-FR"/>
+        </w:rPr>
+      </w:pPr>
+      <w:r>
+        <w:rPr>
+          <w:rFonts w:eastAsia="Times New Roman" w:cstheme="majorHAnsi"/>
+          <w:color w:val="000000" w:themeColor="text1"/>
+          <w:kern w:val="36"/>
+          <w:lang w:val="fr-FR" w:eastAsia="fr-FR"/>
+        </w:rPr>
+        <w:t>Validation des workflows de calcul, recherche publique, rappel, génération PDF et gestion des sessions.</w:t>
+      </w:r>
+    </w:p>
+    <w:p>
+      <w:pPr>
+        <w:spacing w:before="100" w:beforeAutospacing="1" w:after="100" w:afterAutospacing="1" w:line="240" w:lineRule="auto"/>
+        <w:outlineLvl w:val="0"/>
+        <w:rPr>
+          <w:rFonts w:asciiTheme="majorHAnsi" w:eastAsia="Times New Roman" w:hAnsiTheme="majorHAnsi" w:cstheme="majorHAnsi"/>
+          <w:b/>
+          <w:bCs/>
+          <w:color w:val="365F91" w:themeColor="accent1" w:themeShade="BF"/>
+          <w:kern w:val="36"/>
+          <w:sz w:val="28"/>
+          <w:szCs w:val="28"/>
+          <w:lang w:eastAsia="fr-FR"/>
+        </w:rPr>
+      </w:pPr>
+      <w:r>
+        <w:rPr>
+          <w:rFonts w:asciiTheme="majorHAnsi" w:eastAsia="Times New Roman" w:hAnsiTheme="majorHAnsi" w:cstheme="majorHAnsi"/>
+          <w:b/>
+          <w:bCs/>
+          <w:color w:val="365F91" w:themeColor="accent1" w:themeShade="BF"/>
+          <w:kern w:val="36"/>
+          <w:sz w:val="28"/>
+          <w:szCs w:val="28"/>
+          <w:lang w:eastAsia="fr-FR"/>
+        </w:rPr>
+        <w:t xml:space="preserve">Version </w:t>
+      </w:r>
+      <w:r>
+        <w:rPr>
+          <w:rFonts w:asciiTheme="majorHAnsi" w:eastAsia="Times New Roman" w:hAnsiTheme="majorHAnsi" w:cstheme="majorHAnsi"/>
+          <w:b/>
+          <w:bCs/>
+          <w:color w:val="365F91" w:themeColor="accent1" w:themeShade="BF"/>
+          <w:kern w:val="36"/>
+          <w:sz w:val="28"/>
+          <w:szCs w:val="28"/>
+          <w:lang w:eastAsia="fr-FR"/>
+        </w:rPr>
+        <w:t>1.2</w:t>
+      </w:r>
+      <w:r>
+        <w:rPr>
+          <w:rFonts w:asciiTheme="majorHAnsi" w:eastAsia="Times New Roman" w:hAnsiTheme="majorHAnsi" w:cstheme="majorHAnsi"/>
+          <w:b/>
+          <w:bCs/>
+          <w:color w:val="365F91" w:themeColor="accent1" w:themeShade="BF"/>
+          <w:kern w:val="36"/>
+          <w:sz w:val="28"/>
+          <w:szCs w:val="28"/>
+          <w:lang w:eastAsia="fr-FR"/>
+        </w:rPr>
+        <w:t xml:space="preserve"> – </w:t>
+      </w:r>
+      <w:proofErr w:type="spellStart"/>
+      <w:r>
+        <w:rPr>
+          <w:rFonts w:asciiTheme="majorHAnsi" w:eastAsia="Times New Roman" w:hAnsiTheme="majorHAnsi" w:cstheme="majorHAnsi"/>
+          <w:b/>
+          <w:bCs/>
+          <w:color w:val="365F91" w:themeColor="accent1" w:themeShade="BF"/>
+          <w:kern w:val="36"/>
+          <w:sz w:val="28"/>
+          <w:szCs w:val="28"/>
+          <w:lang w:eastAsia="fr-FR"/>
+        </w:rPr>
+        <w:t>jui</w:t>
+      </w:r>
+      <w:r>
+        <w:rPr>
+          <w:rFonts w:asciiTheme="majorHAnsi" w:eastAsia="Times New Roman" w:hAnsiTheme="majorHAnsi" w:cstheme="majorHAnsi"/>
+          <w:b/>
+          <w:bCs/>
+          <w:color w:val="365F91" w:themeColor="accent1" w:themeShade="BF"/>
+          <w:kern w:val="36"/>
+          <w:sz w:val="28"/>
+          <w:szCs w:val="28"/>
+          <w:lang w:eastAsia="fr-FR"/>
+        </w:rPr>
+        <w:t>let</w:t>
+      </w:r>
+      <w:proofErr w:type="spellEnd"/>
+      <w:r>
+        <w:rPr>
+          <w:rFonts w:asciiTheme="majorHAnsi" w:eastAsia="Times New Roman" w:hAnsiTheme="majorHAnsi" w:cstheme="majorHAnsi"/>
+          <w:b/>
+          <w:bCs/>
+          <w:color w:val="365F91" w:themeColor="accent1" w:themeShade="BF"/>
+          <w:kern w:val="36"/>
+          <w:sz w:val="28"/>
+          <w:szCs w:val="28"/>
+          <w:lang w:eastAsia="fr-FR"/>
+        </w:rPr>
+        <w:t xml:space="preserve"> 2026</w:t>
+      </w:r>
+      <w:r>
+        <w:rPr>
+          <w:rFonts w:asciiTheme="majorHAnsi" w:eastAsia="Times New Roman" w:hAnsiTheme="majorHAnsi" w:cstheme="majorHAnsi"/>
+          <w:b/>
+          <w:bCs/>
+          <w:color w:val="365F91" w:themeColor="accent1" w:themeShade="BF"/>
+          <w:kern w:val="36"/>
+          <w:sz w:val="28"/>
+          <w:szCs w:val="28"/>
+          <w:lang w:eastAsia="fr-FR"/>
+        </w:rPr>
+        <w:t xml:space="preserve"> </w:t>
+      </w:r>
+    </w:p>
+    <w:p>
+      <w:pPr>
+        <w:spacing w:before="100" w:beforeAutospacing="1" w:after="100" w:afterAutospacing="1" w:line="240" w:lineRule="auto"/>
+        <w:outlineLvl w:val="0"/>
+        <w:rPr>
+          <w:rFonts w:eastAsia="Times New Roman" w:cstheme="majorHAnsi"/>
+          <w:b/>
+          <w:bCs/>
+          <w:kern w:val="36"/>
+          <w:lang w:val="fr-FR" w:eastAsia="fr-FR"/>
+        </w:rPr>
+      </w:pPr>
+      <w:r>
+        <w:rPr>
+          <w:rFonts w:eastAsia="Times New Roman" w:cstheme="majorHAnsi"/>
+          <w:b/>
+          <w:bCs/>
+          <w:kern w:val="36"/>
+          <w:lang w:val="fr-FR" w:eastAsia="fr-FR"/>
+        </w:rPr>
+        <w:t>Création du modèle métier (services/document.py).</w:t>
+      </w:r>
+    </w:p>
+    <w:p>
+      <w:pPr>
+        <w:spacing w:before="100" w:beforeAutospacing="1" w:after="100" w:afterAutospacing="1" w:line="240" w:lineRule="auto"/>
+        <w:outlineLvl w:val="0"/>
+        <w:rPr>
+          <w:rFonts w:eastAsia="Times New Roman" w:cstheme="majorHAnsi"/>
+          <w:b/>
+          <w:bCs/>
+          <w:kern w:val="36"/>
+          <w:sz w:val="24"/>
+          <w:szCs w:val="24"/>
+          <w:lang w:val="fr-FR" w:eastAsia="fr-FR"/>
+        </w:rPr>
+      </w:pPr>
+    </w:p>
+    <w:p>
+      <w:pPr>
+        <w:spacing w:before="100" w:beforeAutospacing="1" w:after="100" w:afterAutospacing="1" w:line="240" w:lineRule="auto"/>
+        <w:outlineLvl w:val="0"/>
         <w:rPr>
           <w:rFonts w:asciiTheme="majorHAnsi" w:eastAsia="Times New Roman" w:hAnsiTheme="majorHAnsi" w:cstheme="majorHAnsi"/>
           <w:b/>
@@ -69,8 +845,7 @@
           <w:szCs w:val="28"/>
           <w:lang w:val="fr-FR" w:eastAsia="fr-FR"/>
         </w:rPr>
-        <w:t xml:space="preserve"> </w:t>
-      </w:r>
+      </w:pPr>
       <w:r>
         <w:rPr>
           <w:rFonts w:asciiTheme="majorHAnsi" w:eastAsia="Times New Roman" w:hAnsiTheme="majorHAnsi" w:cstheme="majorHAnsi"/>
@@ -82,179 +857,7 @@
           <w:szCs w:val="28"/>
           <w:lang w:val="fr-FR" w:eastAsia="fr-FR"/>
         </w:rPr>
-        <w:t>2</w:t>
-      </w:r>
-      <w:r>
-        <w:rPr>
-          <w:rFonts w:asciiTheme="majorHAnsi" w:eastAsia="Times New Roman" w:hAnsiTheme="majorHAnsi" w:cstheme="majorHAnsi"/>
-          <w:b/>
-          <w:bCs/>
-          <w:color w:val="365F91" w:themeColor="accent1" w:themeShade="BF"/>
-          <w:kern w:val="36"/>
-          <w:sz w:val="28"/>
-          <w:szCs w:val="28"/>
-          <w:lang w:val="fr-FR" w:eastAsia="fr-FR"/>
-        </w:rPr>
-        <w:t>.</w:t>
-      </w:r>
-      <w:r>
-        <w:rPr>
-          <w:rFonts w:asciiTheme="majorHAnsi" w:eastAsia="Times New Roman" w:hAnsiTheme="majorHAnsi" w:cstheme="majorHAnsi"/>
-          <w:b/>
-          <w:bCs/>
-          <w:color w:val="365F91" w:themeColor="accent1" w:themeShade="BF"/>
-          <w:kern w:val="36"/>
-          <w:sz w:val="28"/>
-          <w:szCs w:val="28"/>
-          <w:lang w:val="fr-FR" w:eastAsia="fr-FR"/>
-        </w:rPr>
-        <w:t>0</w:t>
-      </w:r>
-      <w:r>
-        <w:rPr>
-          <w:rFonts w:asciiTheme="majorHAnsi" w:eastAsia="Times New Roman" w:hAnsiTheme="majorHAnsi" w:cstheme="majorHAnsi"/>
-          <w:b/>
-          <w:bCs/>
-          <w:color w:val="365F91" w:themeColor="accent1" w:themeShade="BF"/>
-          <w:kern w:val="36"/>
-          <w:sz w:val="28"/>
-          <w:szCs w:val="28"/>
-          <w:lang w:val="fr-FR" w:eastAsia="fr-FR"/>
-        </w:rPr>
-        <w:t>0</w:t>
-      </w:r>
-      <w:r>
-        <w:rPr>
-          <w:rFonts w:asciiTheme="majorHAnsi" w:eastAsia="Times New Roman" w:hAnsiTheme="majorHAnsi" w:cstheme="majorHAnsi"/>
-          <w:b/>
-          <w:bCs/>
-          <w:color w:val="365F91" w:themeColor="accent1" w:themeShade="BF"/>
-          <w:kern w:val="36"/>
-          <w:sz w:val="28"/>
-          <w:szCs w:val="28"/>
-          <w:lang w:val="fr-FR" w:eastAsia="fr-FR"/>
-        </w:rPr>
-        <w:t xml:space="preserve"> – </w:t>
-      </w:r>
-      <w:proofErr w:type="spellStart"/>
-      <w:r>
-        <w:rPr>
-          <w:rFonts w:asciiTheme="majorHAnsi" w:eastAsia="Times New Roman" w:hAnsiTheme="majorHAnsi" w:cstheme="majorHAnsi"/>
-          <w:b/>
-          <w:bCs/>
-          <w:color w:val="365F91" w:themeColor="accent1" w:themeShade="BF"/>
-          <w:kern w:val="36"/>
-          <w:sz w:val="28"/>
-          <w:szCs w:val="28"/>
-          <w:lang w:val="fr-FR" w:eastAsia="fr-FR"/>
-        </w:rPr>
-        <w:t>jui</w:t>
-      </w:r>
-      <w:r>
-        <w:rPr>
-          <w:rFonts w:asciiTheme="majorHAnsi" w:eastAsia="Times New Roman" w:hAnsiTheme="majorHAnsi" w:cstheme="majorHAnsi"/>
-          <w:b/>
-          <w:bCs/>
-          <w:color w:val="365F91" w:themeColor="accent1" w:themeShade="BF"/>
-          <w:kern w:val="36"/>
-          <w:sz w:val="28"/>
-          <w:szCs w:val="28"/>
-          <w:lang w:val="fr-FR" w:eastAsia="fr-FR"/>
-        </w:rPr>
-        <w:t>let</w:t>
-      </w:r>
-      <w:proofErr w:type="spellEnd"/>
-      <w:r>
-        <w:rPr>
-          <w:rFonts w:asciiTheme="majorHAnsi" w:eastAsia="Times New Roman" w:hAnsiTheme="majorHAnsi" w:cstheme="majorHAnsi"/>
-          <w:b/>
-          <w:bCs/>
-          <w:color w:val="365F91" w:themeColor="accent1" w:themeShade="BF"/>
-          <w:kern w:val="36"/>
-          <w:sz w:val="28"/>
-          <w:szCs w:val="28"/>
-          <w:lang w:val="fr-FR" w:eastAsia="fr-FR"/>
-        </w:rPr>
-        <w:t xml:space="preserve"> 2026</w:t>
-      </w:r>
-      <w:r>
-        <w:rPr>
-          <w:rFonts w:asciiTheme="majorHAnsi" w:eastAsia="Times New Roman" w:hAnsiTheme="majorHAnsi" w:cstheme="majorHAnsi"/>
-          <w:b/>
-          <w:bCs/>
-          <w:color w:val="365F91" w:themeColor="accent1" w:themeShade="BF"/>
-          <w:kern w:val="36"/>
-          <w:sz w:val="28"/>
-          <w:szCs w:val="28"/>
-          <w:lang w:val="fr-FR" w:eastAsia="fr-FR"/>
-        </w:rPr>
-        <w:t xml:space="preserve"> </w:t>
-      </w:r>
-    </w:p>
-    <w:p>
-      <w:pPr>
-        <w:spacing w:before="100" w:beforeAutospacing="1" w:after="100" w:afterAutospacing="1" w:line="240" w:lineRule="auto"/>
-        <w:outlineLvl w:val="0"/>
-        <w:rPr>
-          <w:rFonts w:eastAsia="Times New Roman" w:cstheme="majorHAnsi"/>
-          <w:b/>
-          <w:bCs/>
-          <w:kern w:val="36"/>
-          <w:lang w:val="fr-FR" w:eastAsia="fr-FR"/>
-        </w:rPr>
-      </w:pPr>
-      <w:r>
-        <w:rPr>
-          <w:rFonts w:eastAsia="Times New Roman" w:cstheme="majorHAnsi"/>
-          <w:b/>
-          <w:bCs/>
-          <w:kern w:val="36"/>
-          <w:lang w:val="fr-FR" w:eastAsia="fr-FR"/>
-        </w:rPr>
-        <w:t>Création du modèle métier (services/document.py).</w:t>
-      </w:r>
-    </w:p>
-    <w:p>
-      <w:pPr>
-        <w:spacing w:before="100" w:beforeAutospacing="1" w:after="100" w:afterAutospacing="1" w:line="240" w:lineRule="auto"/>
-        <w:outlineLvl w:val="0"/>
-        <w:rPr>
-          <w:rFonts w:eastAsia="Times New Roman" w:cstheme="majorHAnsi"/>
-          <w:b/>
-          <w:bCs/>
-          <w:kern w:val="36"/>
-          <w:sz w:val="24"/>
-          <w:szCs w:val="24"/>
-          <w:lang w:val="fr-FR" w:eastAsia="fr-FR"/>
-        </w:rPr>
-      </w:pPr>
-    </w:p>
-    <w:p>
-      <w:pPr>
-        <w:spacing w:before="100" w:beforeAutospacing="1" w:after="100" w:afterAutospacing="1" w:line="240" w:lineRule="auto"/>
-        <w:outlineLvl w:val="0"/>
-        <w:rPr>
-          <w:rFonts w:asciiTheme="majorHAnsi" w:eastAsia="Times New Roman" w:hAnsiTheme="majorHAnsi" w:cstheme="majorHAnsi"/>
-          <w:b/>
-          <w:bCs/>
-          <w:color w:val="365F91" w:themeColor="accent1" w:themeShade="BF"/>
-          <w:kern w:val="36"/>
-          <w:sz w:val="28"/>
-          <w:szCs w:val="28"/>
-          <w:lang w:val="fr-FR" w:eastAsia="fr-FR"/>
-        </w:rPr>
-      </w:pPr>
-      <w:r>
-        <w:rPr>
-          <w:rFonts w:asciiTheme="majorHAnsi" w:eastAsia="Times New Roman" w:hAnsiTheme="majorHAnsi" w:cstheme="majorHAnsi"/>
-          <w:b/>
-          <w:bCs/>
-          <w:color w:val="365F91" w:themeColor="accent1" w:themeShade="BF"/>
-          <w:kern w:val="36"/>
-          <w:sz w:val="28"/>
-          <w:szCs w:val="28"/>
-          <w:lang w:val="fr-FR" w:eastAsia="fr-FR"/>
-        </w:rPr>
+        <w:lastRenderedPageBreak/>
         <w:t>Version</w:t>
       </w:r>
       <w:r>
@@ -826,7 +1429,6 @@
           <w:szCs w:val="24"/>
           <w:lang w:val="fr-FR" w:eastAsia="fr-FR"/>
         </w:rPr>
-        <w:lastRenderedPageBreak/>
         <w:t>Amélioration du référencement (SEO) :</w:t>
       </w:r>
     </w:p>
@@ -1112,6 +1714,7 @@
           <w:szCs w:val="24"/>
           <w:lang w:val="fr-FR" w:eastAsia="fr-FR"/>
         </w:rPr>
+        <w:lastRenderedPageBreak/>
         <w:t>Harmonisation de plusieurs traductions allemandes.</w:t>
       </w:r>
     </w:p>
@@ -1627,7 +2230,6 @@
         <w:rPr>
           <w:lang w:val="fr-FR"/>
         </w:rPr>
-        <w:lastRenderedPageBreak/>
         <w:t>Versionnage des ressources en javascript</w:t>
       </w:r>
     </w:p>
@@ -1746,6 +2348,7 @@
           <w:szCs w:val="26"/>
           <w:lang w:val="fr-FR"/>
         </w:rPr>
+        <w:lastRenderedPageBreak/>
         <w:t>Nouvelles fonctionnalités</w:t>
       </w:r>
     </w:p>
@@ -2256,127 +2859,127 @@
         <w:rPr>
           <w:lang w:val="fr-FR"/>
         </w:rPr>
+        <w:t>Version 1.02 - Juin 2026</w:t>
+      </w:r>
+    </w:p>
+    <w:p>
+      <w:pPr>
+        <w:pStyle w:val="Titre2"/>
+        <w:rPr>
+          <w:lang w:val="fr-FR"/>
+        </w:rPr>
+      </w:pPr>
+      <w:r>
+        <w:rPr>
+          <w:lang w:val="fr-FR"/>
+        </w:rPr>
+        <w:t>Nouvelles fonctionnalités</w:t>
+      </w:r>
+    </w:p>
+    <w:p>
+      <w:pPr>
+        <w:pStyle w:val="Listepuces"/>
+        <w:rPr>
+          <w:lang w:val="fr-FR"/>
+        </w:rPr>
+      </w:pPr>
+      <w:r>
+        <w:rPr>
+          <w:lang w:val="fr-FR"/>
+        </w:rPr>
+        <w:t>Ajout de l’historique de session avec conservation du calcul courant et du calcul précédent.</w:t>
+      </w:r>
+    </w:p>
+    <w:p>
+      <w:pPr>
+        <w:pStyle w:val="Listepuces"/>
+        <w:rPr>
+          <w:lang w:val="fr-FR"/>
+        </w:rPr>
+      </w:pPr>
+      <w:r>
+        <w:rPr>
+          <w:lang w:val="fr-FR"/>
+        </w:rPr>
+        <w:t>Ajout du panneau « Calcul précédent » dans la zone Résultat.</w:t>
+      </w:r>
+    </w:p>
+    <w:p>
+      <w:pPr>
+        <w:pStyle w:val="Listepuces"/>
+        <w:rPr>
+          <w:lang w:val="fr-FR"/>
+        </w:rPr>
+      </w:pPr>
+      <w:r>
+        <w:rPr>
+          <w:lang w:val="fr-FR"/>
+        </w:rPr>
+        <w:t>Ajout du bouton « Recharger » permettant de permuter instantanément les deux calculs mémorisés.</w:t>
+      </w:r>
+    </w:p>
+    <w:p>
+      <w:pPr>
+        <w:pStyle w:val="Listepuces"/>
+        <w:rPr>
+          <w:lang w:val="fr-FR"/>
+        </w:rPr>
+      </w:pPr>
+      <w:r>
+        <w:rPr>
+          <w:lang w:val="fr-FR"/>
+        </w:rPr>
+        <w:t>Conservation de l’historique après rechargement de la page.</w:t>
+      </w:r>
+    </w:p>
+    <w:p>
+      <w:pPr>
+        <w:pStyle w:val="Listepuces"/>
+        <w:rPr>
+          <w:lang w:val="fr-FR"/>
+        </w:rPr>
+      </w:pPr>
+      <w:r>
+        <w:rPr>
+          <w:lang w:val="fr-FR"/>
+        </w:rPr>
+        <w:t>Conservation de l’historique après fermeture et réouverture de l’onglet navigateur.</w:t>
+      </w:r>
+    </w:p>
+    <w:p>
+      <w:pPr>
+        <w:pStyle w:val="Titre2"/>
+      </w:pPr>
+      <w:r>
+        <w:t>Corrections</w:t>
+      </w:r>
+    </w:p>
+    <w:p>
+      <w:pPr>
+        <w:pStyle w:val="Listepuces"/>
+        <w:rPr>
+          <w:lang w:val="fr-FR"/>
+        </w:rPr>
+      </w:pPr>
+      <w:r>
+        <w:rPr>
+          <w:lang w:val="fr-FR"/>
+        </w:rPr>
+        <w:t>Correction de l’affichage du calcul précédent immédiatement après un nouveau calcul.</w:t>
+      </w:r>
+    </w:p>
+    <w:p>
+      <w:pPr>
+        <w:pStyle w:val="Listepuces"/>
+        <w:rPr>
+          <w:lang w:val="fr-FR"/>
+        </w:rPr>
+      </w:pPr>
+      <w:r>
+        <w:rPr>
+          <w:lang w:val="fr-FR"/>
+        </w:rPr>
         <w:lastRenderedPageBreak/>
-        <w:t>Version 1.02 - Juin 2026</w:t>
-      </w:r>
-    </w:p>
-    <w:p>
-      <w:pPr>
-        <w:pStyle w:val="Titre2"/>
-        <w:rPr>
-          <w:lang w:val="fr-FR"/>
-        </w:rPr>
-      </w:pPr>
-      <w:r>
-        <w:rPr>
-          <w:lang w:val="fr-FR"/>
-        </w:rPr>
-        <w:t>Nouvelles fonctionnalités</w:t>
-      </w:r>
-    </w:p>
-    <w:p>
-      <w:pPr>
-        <w:pStyle w:val="Listepuces"/>
-        <w:rPr>
-          <w:lang w:val="fr-FR"/>
-        </w:rPr>
-      </w:pPr>
-      <w:r>
-        <w:rPr>
-          <w:lang w:val="fr-FR"/>
-        </w:rPr>
-        <w:t>Ajout de l’historique de session avec conservation du calcul courant et du calcul précédent.</w:t>
-      </w:r>
-    </w:p>
-    <w:p>
-      <w:pPr>
-        <w:pStyle w:val="Listepuces"/>
-        <w:rPr>
-          <w:lang w:val="fr-FR"/>
-        </w:rPr>
-      </w:pPr>
-      <w:r>
-        <w:rPr>
-          <w:lang w:val="fr-FR"/>
-        </w:rPr>
-        <w:t>Ajout du panneau « Calcul précédent » dans la zone Résultat.</w:t>
-      </w:r>
-    </w:p>
-    <w:p>
-      <w:pPr>
-        <w:pStyle w:val="Listepuces"/>
-        <w:rPr>
-          <w:lang w:val="fr-FR"/>
-        </w:rPr>
-      </w:pPr>
-      <w:r>
-        <w:rPr>
-          <w:lang w:val="fr-FR"/>
-        </w:rPr>
-        <w:t>Ajout du bouton « Recharger » permettant de permuter instantanément les deux calculs mémorisés.</w:t>
-      </w:r>
-    </w:p>
-    <w:p>
-      <w:pPr>
-        <w:pStyle w:val="Listepuces"/>
-        <w:rPr>
-          <w:lang w:val="fr-FR"/>
-        </w:rPr>
-      </w:pPr>
-      <w:r>
-        <w:rPr>
-          <w:lang w:val="fr-FR"/>
-        </w:rPr>
-        <w:t>Conservation de l’historique après rechargement de la page.</w:t>
-      </w:r>
-    </w:p>
-    <w:p>
-      <w:pPr>
-        <w:pStyle w:val="Listepuces"/>
-        <w:rPr>
-          <w:lang w:val="fr-FR"/>
-        </w:rPr>
-      </w:pPr>
-      <w:r>
-        <w:rPr>
-          <w:lang w:val="fr-FR"/>
-        </w:rPr>
-        <w:t>Conservation de l’historique après fermeture et réouverture de l’onglet navigateur.</w:t>
-      </w:r>
-    </w:p>
-    <w:p>
-      <w:pPr>
-        <w:pStyle w:val="Titre2"/>
-      </w:pPr>
-      <w:r>
-        <w:t>Corrections</w:t>
-      </w:r>
-    </w:p>
-    <w:p>
-      <w:pPr>
-        <w:pStyle w:val="Listepuces"/>
-        <w:rPr>
-          <w:lang w:val="fr-FR"/>
-        </w:rPr>
-      </w:pPr>
-      <w:r>
-        <w:rPr>
-          <w:lang w:val="fr-FR"/>
-        </w:rPr>
-        <w:t>Correction de l’affichage du calcul précédent immédiatement après un nouveau calcul.</w:t>
-      </w:r>
-    </w:p>
-    <w:p>
-      <w:pPr>
-        <w:pStyle w:val="Listepuces"/>
-        <w:rPr>
-          <w:lang w:val="fr-FR"/>
-        </w:rPr>
-      </w:pPr>
-      <w:r>
-        <w:rPr>
-          <w:lang w:val="fr-FR"/>
-        </w:rPr>
         <w:t>Correction de la gestion de la langue lors du rechargement de la page.</w:t>
       </w:r>
     </w:p>
@@ -2840,51 +3443,595 @@
         <w:rPr>
           <w:lang w:val="fr-FR"/>
         </w:rPr>
+        <w:t xml:space="preserve">EET </w:t>
+      </w:r>
+      <w:proofErr w:type="spellStart"/>
+      <w:r>
+        <w:rPr>
+          <w:lang w:val="fr-FR"/>
+        </w:rPr>
+        <w:t>Calculator</w:t>
+      </w:r>
+      <w:proofErr w:type="spellEnd"/>
+      <w:r>
+        <w:rPr>
+          <w:lang w:val="fr-FR"/>
+        </w:rPr>
+        <w:t xml:space="preserve"> - Changelog</w:t>
+      </w:r>
+    </w:p>
+    <w:p>
+      <w:pPr>
+        <w:pStyle w:val="Titre2"/>
+        <w:rPr>
+          <w:lang w:val="fr-FR"/>
+        </w:rPr>
+      </w:pPr>
+      <w:r>
+        <w:rPr>
+          <w:lang w:val="fr-FR"/>
+        </w:rPr>
+        <w:t>Version 1.01 - Juin 2026</w:t>
+      </w:r>
+    </w:p>
+    <w:p>
+      <w:pPr>
+        <w:pStyle w:val="Titre3"/>
+        <w:rPr>
+          <w:lang w:val="fr-FR"/>
+        </w:rPr>
+      </w:pPr>
+      <w:r>
+        <w:rPr>
+          <w:lang w:val="fr-FR"/>
+        </w:rPr>
+        <w:t>Nouvelles fonctionnalités</w:t>
+      </w:r>
+    </w:p>
+    <w:p>
+      <w:pPr>
+        <w:pStyle w:val="Listepuces"/>
+        <w:rPr>
+          <w:lang w:val="fr-FR"/>
+        </w:rPr>
+      </w:pPr>
+      <w:r>
+        <w:rPr>
+          <w:lang w:val="fr-FR"/>
+        </w:rPr>
+        <w:t>Sauvegarde automatique du dernier calcul dans la session utilisateur.</w:t>
+      </w:r>
+    </w:p>
+    <w:p>
+      <w:pPr>
+        <w:pStyle w:val="Listepuces"/>
+      </w:pPr>
+      <w:r>
+        <w:t xml:space="preserve">Conservation du </w:t>
+      </w:r>
+      <w:proofErr w:type="spellStart"/>
+      <w:r>
+        <w:t>calcul</w:t>
+      </w:r>
+      <w:proofErr w:type="spellEnd"/>
+      <w:r>
+        <w:t xml:space="preserve"> </w:t>
+      </w:r>
+      <w:proofErr w:type="spellStart"/>
+      <w:r>
+        <w:t>précédent</w:t>
+      </w:r>
+      <w:proofErr w:type="spellEnd"/>
+      <w:r>
+        <w:t>.</w:t>
+      </w:r>
+    </w:p>
+    <w:p>
+      <w:pPr>
+        <w:pStyle w:val="Listepuces"/>
+        <w:rPr>
+          <w:lang w:val="fr-FR"/>
+        </w:rPr>
+      </w:pPr>
+      <w:r>
+        <w:rPr>
+          <w:lang w:val="fr-FR"/>
+        </w:rPr>
+        <w:t>Fonction Recharger permettant de basculer entre les deux derniers calculs EET.</w:t>
+      </w:r>
+    </w:p>
+    <w:p>
+      <w:pPr>
+        <w:pStyle w:val="Listepuces"/>
+        <w:rPr>
+          <w:lang w:val="fr-FR"/>
+        </w:rPr>
+      </w:pPr>
+      <w:r>
+        <w:rPr>
+          <w:lang w:val="fr-FR"/>
+        </w:rPr>
+        <w:t>Session utilisateur persistante pendant 8 heures.</w:t>
+      </w:r>
+    </w:p>
+    <w:p>
+      <w:pPr>
+        <w:pStyle w:val="Listepuces"/>
+      </w:pPr>
+      <w:proofErr w:type="spellStart"/>
+      <w:r>
+        <w:t>Génération</w:t>
+      </w:r>
+      <w:proofErr w:type="spellEnd"/>
+      <w:r>
+        <w:t xml:space="preserve"> de rapports PDF.</w:t>
+      </w:r>
+    </w:p>
+    <w:p>
+      <w:pPr>
+        <w:pStyle w:val="Listepuces"/>
+        <w:rPr>
+          <w:lang w:val="fr-FR"/>
+        </w:rPr>
+      </w:pPr>
+      <w:r>
+        <w:rPr>
+          <w:lang w:val="fr-FR"/>
+        </w:rPr>
+        <w:t>Support multilingue : Français, English, Deutsch.</w:t>
+      </w:r>
+    </w:p>
+    <w:p>
+      <w:pPr>
+        <w:pStyle w:val="Listepuces"/>
+      </w:pPr>
+      <w:proofErr w:type="spellStart"/>
+      <w:r>
+        <w:t>Compatibilité</w:t>
+      </w:r>
+      <w:proofErr w:type="spellEnd"/>
+      <w:r>
+        <w:t xml:space="preserve"> smartphone et </w:t>
+      </w:r>
+      <w:proofErr w:type="spellStart"/>
+      <w:r>
+        <w:t>tablette</w:t>
+      </w:r>
+      <w:proofErr w:type="spellEnd"/>
+      <w:r>
+        <w:t>.</w:t>
+      </w:r>
+    </w:p>
+    <w:p>
+      <w:pPr>
+        <w:pStyle w:val="Listepuces"/>
+        <w:rPr>
+          <w:lang w:val="fr-FR"/>
+        </w:rPr>
+      </w:pPr>
+      <w:r>
+        <w:rPr>
+          <w:lang w:val="fr-FR"/>
+        </w:rPr>
+        <w:t>Restauration automatique du dernier calcul lors du retour depuis les pages Aide et À propos.</w:t>
+      </w:r>
+    </w:p>
+    <w:p>
+      <w:pPr>
+        <w:pStyle w:val="Titre3"/>
+      </w:pPr>
+      <w:proofErr w:type="spellStart"/>
+      <w:r>
         <w:lastRenderedPageBreak/>
-        <w:t xml:space="preserve">EET </w:t>
+        <w:t>Améliorations</w:t>
+      </w:r>
+      <w:proofErr w:type="spellEnd"/>
+      <w:r>
+        <w:t xml:space="preserve"> techniques</w:t>
+      </w:r>
+    </w:p>
+    <w:p>
+      <w:pPr>
+        <w:pStyle w:val="Listepuces"/>
+        <w:rPr>
+          <w:lang w:val="fr-FR"/>
+        </w:rPr>
+      </w:pPr>
+      <w:r>
+        <w:rPr>
+          <w:lang w:val="fr-FR"/>
+        </w:rPr>
+        <w:t xml:space="preserve">Factorisation des </w:t>
       </w:r>
       <w:proofErr w:type="spellStart"/>
       <w:r>
         <w:rPr>
           <w:lang w:val="fr-FR"/>
         </w:rPr>
-        <w:t>Calculator</w:t>
+        <w:t>templates</w:t>
       </w:r>
       <w:proofErr w:type="spellEnd"/>
       <w:r>
         <w:rPr>
           <w:lang w:val="fr-FR"/>
         </w:rPr>
-        <w:t xml:space="preserve"> - Changelog</w:t>
+        <w:t xml:space="preserve"> HTML via base.html.</w:t>
+      </w:r>
+    </w:p>
+    <w:p>
+      <w:pPr>
+        <w:pStyle w:val="Listepuces"/>
+        <w:rPr>
+          <w:lang w:val="fr-FR"/>
+        </w:rPr>
+      </w:pPr>
+      <w:r>
+        <w:rPr>
+          <w:lang w:val="fr-FR"/>
+        </w:rPr>
+        <w:t>Séparation du code métier dans le répertoire services.</w:t>
+      </w:r>
+    </w:p>
+    <w:p>
+      <w:pPr>
+        <w:pStyle w:val="Listepuces"/>
+      </w:pPr>
+      <w:r>
+        <w:t xml:space="preserve">Gestion des versions </w:t>
+      </w:r>
+      <w:proofErr w:type="spellStart"/>
+      <w:r>
+        <w:t>centralisée</w:t>
+      </w:r>
+      <w:proofErr w:type="spellEnd"/>
+      <w:r>
+        <w:t>.</w:t>
+      </w:r>
+    </w:p>
+    <w:p>
+      <w:pPr>
+        <w:pStyle w:val="Listepuces"/>
+        <w:rPr>
+          <w:lang w:val="fr-FR"/>
+        </w:rPr>
+      </w:pPr>
+      <w:r>
+        <w:rPr>
+          <w:lang w:val="fr-FR"/>
+        </w:rPr>
+        <w:t>Mise en place d’un favicon.</w:t>
+      </w:r>
+    </w:p>
+    <w:p>
+      <w:pPr>
+        <w:pStyle w:val="Listepuces"/>
+        <w:rPr>
+          <w:lang w:val="fr-FR"/>
+        </w:rPr>
+      </w:pPr>
+      <w:r>
+        <w:rPr>
+          <w:lang w:val="fr-FR"/>
+        </w:rPr>
+        <w:t>Validation renforcée des heures du jour (0&lt;=</w:t>
+      </w:r>
+      <w:proofErr w:type="spellStart"/>
+      <w:r>
+        <w:rPr>
+          <w:lang w:val="fr-FR"/>
+        </w:rPr>
+        <w:t>hh</w:t>
+      </w:r>
+      <w:proofErr w:type="spellEnd"/>
+      <w:r>
+        <w:rPr>
+          <w:lang w:val="fr-FR"/>
+        </w:rPr>
+        <w:t>&lt;=23, 0&lt;=mm&lt;=59, 0&lt;=</w:t>
+      </w:r>
+      <w:proofErr w:type="spellStart"/>
+      <w:r>
+        <w:rPr>
+          <w:lang w:val="fr-FR"/>
+        </w:rPr>
+        <w:t>ss</w:t>
+      </w:r>
+      <w:proofErr w:type="spellEnd"/>
+      <w:r>
+        <w:rPr>
+          <w:lang w:val="fr-FR"/>
+        </w:rPr>
+        <w:t>&lt;=59).</w:t>
+      </w:r>
+    </w:p>
+    <w:p>
+      <w:pPr>
+        <w:pStyle w:val="Listepuces"/>
+        <w:rPr>
+          <w:lang w:val="fr-FR"/>
+        </w:rPr>
+      </w:pPr>
+      <w:r>
+        <w:rPr>
+          <w:lang w:val="fr-FR"/>
+        </w:rPr>
+        <w:t>Amélioration de la robustesse des calculs.</w:t>
+      </w:r>
+    </w:p>
+    <w:p>
+      <w:pPr>
+        <w:pStyle w:val="Listepuces"/>
+        <w:rPr>
+          <w:lang w:val="fr-FR"/>
+        </w:rPr>
+      </w:pPr>
+      <w:r>
+        <w:rPr>
+          <w:lang w:val="fr-FR"/>
+        </w:rPr>
+        <w:t>Optimisation de la gestion des sessions Flask.</w:t>
+      </w:r>
+    </w:p>
+    <w:p>
+      <w:pPr>
+        <w:pStyle w:val="Titre3"/>
+      </w:pPr>
+      <w:r>
+        <w:t>Documentation</w:t>
+      </w:r>
+    </w:p>
+    <w:p>
+      <w:pPr>
+        <w:pStyle w:val="Listepuces"/>
+        <w:rPr>
+          <w:lang w:val="fr-FR"/>
+        </w:rPr>
+      </w:pPr>
+      <w:r>
+        <w:rPr>
+          <w:lang w:val="fr-FR"/>
+        </w:rPr>
+        <w:t>Guide des prérequis de déploiement.</w:t>
+      </w:r>
+    </w:p>
+    <w:p>
+      <w:pPr>
+        <w:pStyle w:val="Listepuces"/>
+      </w:pPr>
+      <w:r>
+        <w:t>Checklist de sécurité.</w:t>
+      </w:r>
+    </w:p>
+    <w:p>
+      <w:pPr>
+        <w:pStyle w:val="Listepuces"/>
+      </w:pPr>
+      <w:r>
+        <w:t xml:space="preserve">Documentation </w:t>
+      </w:r>
+      <w:proofErr w:type="spellStart"/>
+      <w:r>
+        <w:t>d’administration</w:t>
+      </w:r>
+      <w:proofErr w:type="spellEnd"/>
+      <w:r>
+        <w:t>.</w:t>
+      </w:r>
+    </w:p>
+    <w:p>
+      <w:pPr>
+        <w:pStyle w:val="Listepuces"/>
+      </w:pPr>
+      <w:r>
+        <w:t xml:space="preserve">Documentation de </w:t>
+      </w:r>
+      <w:proofErr w:type="spellStart"/>
+      <w:r>
+        <w:t>déploiement</w:t>
+      </w:r>
+      <w:proofErr w:type="spellEnd"/>
+      <w:r>
+        <w:t>.</w:t>
+      </w:r>
+    </w:p>
+    <w:p>
+      <w:pPr>
+        <w:pStyle w:val="Listepuces"/>
+      </w:pPr>
+      <w:r>
+        <w:t xml:space="preserve">README du </w:t>
+      </w:r>
+      <w:proofErr w:type="spellStart"/>
+      <w:r>
+        <w:t>projet</w:t>
+      </w:r>
+      <w:proofErr w:type="spellEnd"/>
+      <w:r>
+        <w:t>.</w:t>
+      </w:r>
+    </w:p>
+    <w:p>
+      <w:pPr>
+        <w:pStyle w:val="Titre3"/>
+      </w:pPr>
+      <w:r>
+        <w:t xml:space="preserve">Tests </w:t>
+      </w:r>
+      <w:proofErr w:type="spellStart"/>
+      <w:r>
+        <w:t>validés</w:t>
+      </w:r>
+      <w:proofErr w:type="spellEnd"/>
+    </w:p>
+    <w:p>
+      <w:pPr>
+        <w:pStyle w:val="Listepuces"/>
+      </w:pPr>
+      <w:r>
+        <w:t>Windows</w:t>
+      </w:r>
+    </w:p>
+    <w:p>
+      <w:pPr>
+        <w:pStyle w:val="Listepuces"/>
+      </w:pPr>
+      <w:r>
+        <w:t>Ubuntu Linux</w:t>
+      </w:r>
+    </w:p>
+    <w:p>
+      <w:pPr>
+        <w:pStyle w:val="Listepuces"/>
+      </w:pPr>
+      <w:r>
+        <w:t>Android (smartphone Samsung)</w:t>
+      </w:r>
+    </w:p>
+    <w:p>
+      <w:pPr>
+        <w:pStyle w:val="Listepuces"/>
+      </w:pPr>
+      <w:r>
+        <w:t>Réseau local Wi‑Fi</w:t>
+      </w:r>
+    </w:p>
+    <w:p>
+      <w:pPr>
+        <w:pStyle w:val="Listepuces"/>
+        <w:rPr>
+          <w:lang w:val="fr-FR"/>
+        </w:rPr>
+      </w:pPr>
+      <w:r>
+        <w:rPr>
+          <w:lang w:val="fr-FR"/>
+        </w:rPr>
+        <w:t>Génération PDF dans les trois langues</w:t>
+      </w:r>
+    </w:p>
+    <w:p>
+      <w:pPr>
+        <w:pStyle w:val="Titre3"/>
+      </w:pPr>
+      <w:proofErr w:type="spellStart"/>
+      <w:r>
+        <w:t>Déploiement</w:t>
+      </w:r>
+      <w:proofErr w:type="spellEnd"/>
+    </w:p>
+    <w:p>
+      <w:pPr>
+        <w:pStyle w:val="Listepuces"/>
+      </w:pPr>
+      <w:proofErr w:type="spellStart"/>
+      <w:r>
+        <w:t>Déploiement</w:t>
+      </w:r>
+      <w:proofErr w:type="spellEnd"/>
+      <w:r>
+        <w:t xml:space="preserve"> </w:t>
+      </w:r>
+      <w:proofErr w:type="spellStart"/>
+      <w:r>
+        <w:t>validé</w:t>
+      </w:r>
+      <w:proofErr w:type="spellEnd"/>
+      <w:r>
+        <w:t xml:space="preserve"> sous Ubuntu.</w:t>
+      </w:r>
+    </w:p>
+    <w:p>
+      <w:pPr>
+        <w:pStyle w:val="Listepuces"/>
+      </w:pPr>
+      <w:proofErr w:type="spellStart"/>
+      <w:r>
+        <w:t>Fonctionnement</w:t>
+      </w:r>
+      <w:proofErr w:type="spellEnd"/>
+      <w:r>
+        <w:t xml:space="preserve"> </w:t>
+      </w:r>
+      <w:proofErr w:type="spellStart"/>
+      <w:r>
+        <w:t>validé</w:t>
+      </w:r>
+      <w:proofErr w:type="spellEnd"/>
+      <w:r>
+        <w:t xml:space="preserve"> avec </w:t>
+      </w:r>
+      <w:proofErr w:type="spellStart"/>
+      <w:r>
+        <w:t>Gunicorn</w:t>
+      </w:r>
+      <w:proofErr w:type="spellEnd"/>
+      <w:r>
+        <w:t>.</w:t>
+      </w:r>
+    </w:p>
+    <w:p>
+      <w:pPr>
+        <w:pStyle w:val="Listepuces"/>
+      </w:pPr>
+      <w:proofErr w:type="spellStart"/>
+      <w:r>
+        <w:t>Fonctionnement</w:t>
+      </w:r>
+      <w:proofErr w:type="spellEnd"/>
+      <w:r>
+        <w:t xml:space="preserve"> </w:t>
+      </w:r>
+      <w:proofErr w:type="spellStart"/>
+      <w:r>
+        <w:t>validé</w:t>
+      </w:r>
+      <w:proofErr w:type="spellEnd"/>
+      <w:r>
+        <w:t xml:space="preserve"> avec </w:t>
+      </w:r>
+      <w:proofErr w:type="spellStart"/>
+      <w:r>
+        <w:t>systemd</w:t>
+      </w:r>
+      <w:proofErr w:type="spellEnd"/>
+      <w:r>
+        <w:t>.</w:t>
+      </w:r>
+    </w:p>
+    <w:p>
+      <w:pPr>
+        <w:pStyle w:val="Listepuces"/>
+        <w:rPr>
+          <w:lang w:val="fr-FR"/>
+        </w:rPr>
+      </w:pPr>
+      <w:r>
+        <w:rPr>
+          <w:lang w:val="fr-FR"/>
+        </w:rPr>
+        <w:t>Préparation pour intégration sur infrastructure FFS.</w:t>
       </w:r>
     </w:p>
     <w:p>
       <w:pPr>
         <w:pStyle w:val="Titre2"/>
-        <w:rPr>
-          <w:lang w:val="fr-FR"/>
-        </w:rPr>
-      </w:pPr>
-      <w:r>
-        <w:rPr>
-          <w:lang w:val="fr-FR"/>
-        </w:rPr>
-        <w:t>Version 1.01 - Juin 2026</w:t>
+      </w:pPr>
+      <w:r>
+        <w:t>Version 1.00 - Mai 2026</w:t>
       </w:r>
     </w:p>
     <w:p>
       <w:pPr>
         <w:pStyle w:val="Titre3"/>
-        <w:rPr>
-          <w:lang w:val="fr-FR"/>
-        </w:rPr>
-      </w:pPr>
-      <w:r>
-        <w:rPr>
-          <w:lang w:val="fr-FR"/>
-        </w:rPr>
-        <w:t>Nouvelles fonctionnalités</w:t>
-      </w:r>
+      </w:pPr>
+      <w:r>
+        <w:t xml:space="preserve">Première version </w:t>
+      </w:r>
+      <w:proofErr w:type="spellStart"/>
+      <w:r>
+        <w:t>opérationnelle</w:t>
+      </w:r>
+      <w:proofErr w:type="spellEnd"/>
     </w:p>
     <w:p>
       <w:pPr>
@@ -2897,59 +4044,149 @@
         <w:rPr>
           <w:lang w:val="fr-FR"/>
         </w:rPr>
-        <w:t>Sauvegarde automatique du dernier calcul dans la session utilisateur.</w:t>
+        <w:t>Calcul du Temps Électronique Équivalent (EET).</w:t>
       </w:r>
     </w:p>
     <w:p>
       <w:pPr>
         <w:pStyle w:val="Listepuces"/>
-      </w:pPr>
-      <w:r>
-        <w:t xml:space="preserve">Conservation du </w:t>
-      </w:r>
+        <w:rPr>
+          <w:lang w:val="fr-FR"/>
+        </w:rPr>
+      </w:pPr>
+      <w:r>
+        <w:rPr>
+          <w:lang w:val="fr-FR"/>
+        </w:rPr>
+        <w:t>Gestion des références de chronométrage.</w:t>
+      </w:r>
+    </w:p>
+    <w:p>
+      <w:pPr>
+        <w:pStyle w:val="Listepuces"/>
+        <w:rPr>
+          <w:lang w:val="fr-FR"/>
+        </w:rPr>
+      </w:pPr>
+      <w:r>
+        <w:rPr>
+          <w:lang w:val="fr-FR"/>
+        </w:rPr>
+        <w:t>Calcul automatique de la correction.</w:t>
+      </w:r>
+    </w:p>
+    <w:p>
+      <w:pPr>
+        <w:pStyle w:val="Listepuces"/>
+        <w:rPr>
+          <w:lang w:val="fr-FR"/>
+        </w:rPr>
+      </w:pPr>
+      <w:r>
+        <w:rPr>
+          <w:lang w:val="fr-FR"/>
+        </w:rPr>
+        <w:t>Calcul de l’EET selon les règles FIS.</w:t>
+      </w:r>
+    </w:p>
+    <w:p>
+      <w:pPr>
+        <w:pStyle w:val="Listepuces"/>
+      </w:pPr>
       <w:proofErr w:type="spellStart"/>
       <w:r>
-        <w:t>calcul</w:t>
+        <w:t>Affichage</w:t>
       </w:r>
       <w:proofErr w:type="spellEnd"/>
       <w:r>
-        <w:t xml:space="preserve"> </w:t>
+        <w:t xml:space="preserve"> des deltas.</w:t>
+      </w:r>
+    </w:p>
+    <w:p>
+      <w:pPr>
+        <w:pStyle w:val="Listepuces"/>
+        <w:rPr>
+          <w:lang w:val="fr-FR"/>
+        </w:rPr>
+      </w:pPr>
+      <w:r>
+        <w:rPr>
+          <w:lang w:val="fr-FR"/>
+        </w:rPr>
+        <w:t>Sélection des précisions TM et TE.</w:t>
+      </w:r>
+    </w:p>
+    <w:p>
+      <w:pPr>
+        <w:pStyle w:val="Listepuces"/>
+      </w:pPr>
+      <w:r>
+        <w:t>Interface web Flask.</w:t>
+      </w:r>
+    </w:p>
+    <w:p>
+      <w:pPr>
+        <w:pStyle w:val="Listepuces"/>
+      </w:pPr>
+      <w:r>
+        <w:t>Export PDF.</w:t>
+      </w:r>
+    </w:p>
+    <w:p>
+      <w:pPr>
+        <w:pStyle w:val="Listepuces"/>
+        <w:rPr>
+          <w:lang w:val="fr-FR"/>
+        </w:rPr>
+      </w:pPr>
+      <w:r>
+        <w:rPr>
+          <w:lang w:val="fr-FR"/>
+        </w:rPr>
+        <w:t>Pages Aide et À propos.</w:t>
+      </w:r>
+    </w:p>
+    <w:p>
+      <w:pPr>
+        <w:pStyle w:val="Listepuces"/>
+        <w:rPr>
+          <w:lang w:val="fr-FR"/>
+        </w:rPr>
+      </w:pPr>
+      <w:r>
+        <w:rPr>
+          <w:lang w:val="fr-FR"/>
+        </w:rPr>
+        <w:t>Support multilingue (Français, English, Deutsch).</w:t>
+      </w:r>
+    </w:p>
+    <w:p>
+      <w:pPr>
+        <w:pStyle w:val="Titre3"/>
+      </w:pPr>
+      <w:r>
+        <w:t xml:space="preserve">Architecture </w:t>
       </w:r>
       <w:proofErr w:type="spellStart"/>
       <w:r>
-        <w:t>précédent</w:t>
+        <w:t>initiale</w:t>
       </w:r>
       <w:proofErr w:type="spellEnd"/>
-      <w:r>
-        <w:t>.</w:t>
-      </w:r>
     </w:p>
     <w:p>
       <w:pPr>
         <w:pStyle w:val="Listepuces"/>
-        <w:rPr>
-          <w:lang w:val="fr-FR"/>
-        </w:rPr>
-      </w:pPr>
-      <w:r>
-        <w:rPr>
-          <w:lang w:val="fr-FR"/>
-        </w:rPr>
-        <w:t>Fonction Recharger permettant de basculer entre les deux derniers calculs EET.</w:t>
+      </w:pPr>
+      <w:r>
+        <w:t>Application Flask.</w:t>
       </w:r>
     </w:p>
     <w:p>
       <w:pPr>
         <w:pStyle w:val="Listepuces"/>
-        <w:rPr>
-          <w:lang w:val="fr-FR"/>
-        </w:rPr>
-      </w:pPr>
-      <w:r>
-        <w:rPr>
-          <w:lang w:val="fr-FR"/>
-        </w:rPr>
-        <w:t>Session utilisateur persistante pendant 8 heures.</w:t>
+      </w:pPr>
+      <w:r>
+        <w:t>Templates HTML.</w:t>
       </w:r>
     </w:p>
     <w:p>
@@ -2958,641 +4195,7 @@
       </w:pPr>
       <w:proofErr w:type="spellStart"/>
       <w:r>
-        <w:t>Génération</w:t>
-      </w:r>
-      <w:proofErr w:type="spellEnd"/>
-      <w:r>
-        <w:t xml:space="preserve"> de rapports PDF.</w:t>
-      </w:r>
-    </w:p>
-    <w:p>
-      <w:pPr>
-        <w:pStyle w:val="Listepuces"/>
-        <w:rPr>
-          <w:lang w:val="fr-FR"/>
-        </w:rPr>
-      </w:pPr>
-      <w:r>
-        <w:rPr>
-          <w:lang w:val="fr-FR"/>
-        </w:rPr>
-        <w:t>Support multilingue : Français, English, Deutsch.</w:t>
-      </w:r>
-    </w:p>
-    <w:p>
-      <w:pPr>
-        <w:pStyle w:val="Listepuces"/>
-      </w:pPr>
-      <w:proofErr w:type="spellStart"/>
-      <w:r>
-        <w:t>Compatibilité</w:t>
-      </w:r>
-      <w:proofErr w:type="spellEnd"/>
-      <w:r>
-        <w:t xml:space="preserve"> smartphone et </w:t>
-      </w:r>
-      <w:proofErr w:type="spellStart"/>
-      <w:r>
-        <w:t>tablette</w:t>
-      </w:r>
-      <w:proofErr w:type="spellEnd"/>
-      <w:r>
-        <w:t>.</w:t>
-      </w:r>
-    </w:p>
-    <w:p>
-      <w:pPr>
-        <w:pStyle w:val="Listepuces"/>
-        <w:rPr>
-          <w:lang w:val="fr-FR"/>
-        </w:rPr>
-      </w:pPr>
-      <w:r>
-        <w:rPr>
-          <w:lang w:val="fr-FR"/>
-        </w:rPr>
-        <w:t>Restauration automatique du dernier calcul lors du retour depuis les pages Aide et À propos.</w:t>
-      </w:r>
-    </w:p>
-    <w:p>
-      <w:pPr>
-        <w:pStyle w:val="Titre3"/>
-      </w:pPr>
-      <w:proofErr w:type="spellStart"/>
-      <w:r>
-        <w:t>Améliorations</w:t>
-      </w:r>
-      <w:proofErr w:type="spellEnd"/>
-      <w:r>
-        <w:t xml:space="preserve"> techniques</w:t>
-      </w:r>
-    </w:p>
-    <w:p>
-      <w:pPr>
-        <w:pStyle w:val="Listepuces"/>
-        <w:rPr>
-          <w:lang w:val="fr-FR"/>
-        </w:rPr>
-      </w:pPr>
-      <w:r>
-        <w:rPr>
-          <w:lang w:val="fr-FR"/>
-        </w:rPr>
-        <w:t xml:space="preserve">Factorisation des </w:t>
-      </w:r>
-      <w:proofErr w:type="spellStart"/>
-      <w:r>
-        <w:rPr>
-          <w:lang w:val="fr-FR"/>
-        </w:rPr>
-        <w:t>templates</w:t>
-      </w:r>
-      <w:proofErr w:type="spellEnd"/>
-      <w:r>
-        <w:rPr>
-          <w:lang w:val="fr-FR"/>
-        </w:rPr>
-        <w:t xml:space="preserve"> HTML via base.html.</w:t>
-      </w:r>
-    </w:p>
-    <w:p>
-      <w:pPr>
-        <w:pStyle w:val="Listepuces"/>
-        <w:rPr>
-          <w:lang w:val="fr-FR"/>
-        </w:rPr>
-      </w:pPr>
-      <w:r>
-        <w:rPr>
-          <w:lang w:val="fr-FR"/>
-        </w:rPr>
-        <w:t>Séparation du code métier dans le répertoire services.</w:t>
-      </w:r>
-    </w:p>
-    <w:p>
-      <w:pPr>
-        <w:pStyle w:val="Listepuces"/>
-      </w:pPr>
-      <w:r>
-        <w:t xml:space="preserve">Gestion des versions </w:t>
-      </w:r>
-      <w:proofErr w:type="spellStart"/>
-      <w:r>
-        <w:t>centralisée</w:t>
-      </w:r>
-      <w:proofErr w:type="spellEnd"/>
-      <w:r>
-        <w:t>.</w:t>
-      </w:r>
-    </w:p>
-    <w:p>
-      <w:pPr>
-        <w:pStyle w:val="Listepuces"/>
-        <w:rPr>
-          <w:lang w:val="fr-FR"/>
-        </w:rPr>
-      </w:pPr>
-      <w:r>
-        <w:rPr>
-          <w:lang w:val="fr-FR"/>
-        </w:rPr>
-        <w:t>Mise en place d’un favicon.</w:t>
-      </w:r>
-    </w:p>
-    <w:p>
-      <w:pPr>
-        <w:pStyle w:val="Listepuces"/>
-        <w:rPr>
-          <w:lang w:val="fr-FR"/>
-        </w:rPr>
-      </w:pPr>
-      <w:r>
-        <w:rPr>
-          <w:lang w:val="fr-FR"/>
-        </w:rPr>
-        <w:t>Validation renforcée des heures du jour (0&lt;=</w:t>
-      </w:r>
-      <w:proofErr w:type="spellStart"/>
-      <w:r>
-        <w:rPr>
-          <w:lang w:val="fr-FR"/>
-        </w:rPr>
-        <w:t>hh</w:t>
-      </w:r>
-      <w:proofErr w:type="spellEnd"/>
-      <w:r>
-        <w:rPr>
-          <w:lang w:val="fr-FR"/>
-        </w:rPr>
-        <w:t>&lt;=23, 0&lt;=mm&lt;=59, 0&lt;=</w:t>
-      </w:r>
-      <w:proofErr w:type="spellStart"/>
-      <w:r>
-        <w:rPr>
-          <w:lang w:val="fr-FR"/>
-        </w:rPr>
-        <w:t>ss</w:t>
-      </w:r>
-      <w:proofErr w:type="spellEnd"/>
-      <w:r>
-        <w:rPr>
-          <w:lang w:val="fr-FR"/>
-        </w:rPr>
-        <w:t>&lt;=59).</w:t>
-      </w:r>
-    </w:p>
-    <w:p>
-      <w:pPr>
-        <w:pStyle w:val="Listepuces"/>
-        <w:rPr>
-          <w:lang w:val="fr-FR"/>
-        </w:rPr>
-      </w:pPr>
-      <w:r>
-        <w:rPr>
-          <w:lang w:val="fr-FR"/>
-        </w:rPr>
-        <w:t>Amélioration de la robustesse des calculs.</w:t>
-      </w:r>
-    </w:p>
-    <w:p>
-      <w:pPr>
-        <w:pStyle w:val="Listepuces"/>
-        <w:rPr>
-          <w:lang w:val="fr-FR"/>
-        </w:rPr>
-      </w:pPr>
-      <w:r>
-        <w:rPr>
-          <w:lang w:val="fr-FR"/>
-        </w:rPr>
-        <w:t>Optimisation de la gestion des sessions Flask.</w:t>
-      </w:r>
-    </w:p>
-    <w:p>
-      <w:pPr>
-        <w:pStyle w:val="Titre3"/>
-      </w:pPr>
-      <w:r>
-        <w:t>Documentation</w:t>
-      </w:r>
-    </w:p>
-    <w:p>
-      <w:pPr>
-        <w:pStyle w:val="Listepuces"/>
-        <w:rPr>
-          <w:lang w:val="fr-FR"/>
-        </w:rPr>
-      </w:pPr>
-      <w:r>
-        <w:rPr>
-          <w:lang w:val="fr-FR"/>
-        </w:rPr>
-        <w:t>Guide des prérequis de déploiement.</w:t>
-      </w:r>
-    </w:p>
-    <w:p>
-      <w:pPr>
-        <w:pStyle w:val="Listepuces"/>
-      </w:pPr>
-      <w:r>
-        <w:t>Checklist de sécurité.</w:t>
-      </w:r>
-    </w:p>
-    <w:p>
-      <w:pPr>
-        <w:pStyle w:val="Listepuces"/>
-      </w:pPr>
-      <w:r>
-        <w:t xml:space="preserve">Documentation </w:t>
-      </w:r>
-      <w:proofErr w:type="spellStart"/>
-      <w:r>
-        <w:t>d’administration</w:t>
-      </w:r>
-      <w:proofErr w:type="spellEnd"/>
-      <w:r>
-        <w:t>.</w:t>
-      </w:r>
-    </w:p>
-    <w:p>
-      <w:pPr>
-        <w:pStyle w:val="Listepuces"/>
-      </w:pPr>
-      <w:r>
-        <w:t xml:space="preserve">Documentation de </w:t>
-      </w:r>
-      <w:proofErr w:type="spellStart"/>
-      <w:r>
-        <w:t>déploiement</w:t>
-      </w:r>
-      <w:proofErr w:type="spellEnd"/>
-      <w:r>
-        <w:t>.</w:t>
-      </w:r>
-    </w:p>
-    <w:p>
-      <w:pPr>
-        <w:pStyle w:val="Listepuces"/>
-      </w:pPr>
-      <w:r>
-        <w:t xml:space="preserve">README du </w:t>
-      </w:r>
-      <w:proofErr w:type="spellStart"/>
-      <w:r>
-        <w:t>projet</w:t>
-      </w:r>
-      <w:proofErr w:type="spellEnd"/>
-      <w:r>
-        <w:t>.</w:t>
-      </w:r>
-    </w:p>
-    <w:p>
-      <w:pPr>
-        <w:pStyle w:val="Titre3"/>
-      </w:pPr>
-      <w:r>
-        <w:t xml:space="preserve">Tests </w:t>
-      </w:r>
-      <w:proofErr w:type="spellStart"/>
-      <w:r>
-        <w:t>validés</w:t>
-      </w:r>
-      <w:proofErr w:type="spellEnd"/>
-    </w:p>
-    <w:p>
-      <w:pPr>
-        <w:pStyle w:val="Listepuces"/>
-      </w:pPr>
-      <w:r>
-        <w:t>Windows</w:t>
-      </w:r>
-    </w:p>
-    <w:p>
-      <w:pPr>
-        <w:pStyle w:val="Listepuces"/>
-      </w:pPr>
-      <w:r>
-        <w:t>Ubuntu Linux</w:t>
-      </w:r>
-    </w:p>
-    <w:p>
-      <w:pPr>
-        <w:pStyle w:val="Listepuces"/>
-      </w:pPr>
-      <w:r>
-        <w:t>Android (smartphone Samsung)</w:t>
-      </w:r>
-    </w:p>
-    <w:p>
-      <w:pPr>
-        <w:pStyle w:val="Listepuces"/>
-      </w:pPr>
-      <w:r>
-        <w:t>Réseau local Wi‑Fi</w:t>
-      </w:r>
-    </w:p>
-    <w:p>
-      <w:pPr>
-        <w:pStyle w:val="Listepuces"/>
-        <w:rPr>
-          <w:lang w:val="fr-FR"/>
-        </w:rPr>
-      </w:pPr>
-      <w:r>
-        <w:rPr>
-          <w:lang w:val="fr-FR"/>
-        </w:rPr>
-        <w:t>Génération PDF dans les trois langues</w:t>
-      </w:r>
-    </w:p>
-    <w:p>
-      <w:pPr>
-        <w:pStyle w:val="Titre3"/>
-      </w:pPr>
-      <w:proofErr w:type="spellStart"/>
-      <w:r>
-        <w:t>Déploiement</w:t>
-      </w:r>
-      <w:proofErr w:type="spellEnd"/>
-    </w:p>
-    <w:p>
-      <w:pPr>
-        <w:pStyle w:val="Listepuces"/>
-      </w:pPr>
-      <w:proofErr w:type="spellStart"/>
-      <w:r>
-        <w:t>Déploiement</w:t>
-      </w:r>
-      <w:proofErr w:type="spellEnd"/>
-      <w:r>
-        <w:t xml:space="preserve"> </w:t>
-      </w:r>
-      <w:proofErr w:type="spellStart"/>
-      <w:r>
-        <w:t>validé</w:t>
-      </w:r>
-      <w:proofErr w:type="spellEnd"/>
-      <w:r>
-        <w:t xml:space="preserve"> sous Ubuntu.</w:t>
-      </w:r>
-    </w:p>
-    <w:p>
-      <w:pPr>
-        <w:pStyle w:val="Listepuces"/>
-      </w:pPr>
-      <w:proofErr w:type="spellStart"/>
-      <w:r>
-        <w:t>Fonctionnement</w:t>
-      </w:r>
-      <w:proofErr w:type="spellEnd"/>
-      <w:r>
-        <w:t xml:space="preserve"> </w:t>
-      </w:r>
-      <w:proofErr w:type="spellStart"/>
-      <w:r>
-        <w:t>validé</w:t>
-      </w:r>
-      <w:proofErr w:type="spellEnd"/>
-      <w:r>
-        <w:t xml:space="preserve"> avec </w:t>
-      </w:r>
-      <w:proofErr w:type="spellStart"/>
-      <w:r>
-        <w:t>Gunicorn</w:t>
-      </w:r>
-      <w:proofErr w:type="spellEnd"/>
-      <w:r>
-        <w:t>.</w:t>
-      </w:r>
-    </w:p>
-    <w:p>
-      <w:pPr>
-        <w:pStyle w:val="Listepuces"/>
-      </w:pPr>
-      <w:proofErr w:type="spellStart"/>
-      <w:r>
-        <w:t>Fonctionnement</w:t>
-      </w:r>
-      <w:proofErr w:type="spellEnd"/>
-      <w:r>
-        <w:t xml:space="preserve"> </w:t>
-      </w:r>
-      <w:proofErr w:type="spellStart"/>
-      <w:r>
-        <w:t>validé</w:t>
-      </w:r>
-      <w:proofErr w:type="spellEnd"/>
-      <w:r>
-        <w:t xml:space="preserve"> avec </w:t>
-      </w:r>
-      <w:proofErr w:type="spellStart"/>
-      <w:r>
-        <w:t>systemd</w:t>
-      </w:r>
-      <w:proofErr w:type="spellEnd"/>
-      <w:r>
-        <w:t>.</w:t>
-      </w:r>
-    </w:p>
-    <w:p>
-      <w:pPr>
-        <w:pStyle w:val="Listepuces"/>
-        <w:rPr>
-          <w:lang w:val="fr-FR"/>
-        </w:rPr>
-      </w:pPr>
-      <w:r>
-        <w:rPr>
-          <w:lang w:val="fr-FR"/>
-        </w:rPr>
-        <w:t>Préparation pour intégration sur infrastructure FFS.</w:t>
-      </w:r>
-    </w:p>
-    <w:p>
-      <w:pPr>
-        <w:pStyle w:val="Titre2"/>
-      </w:pPr>
-      <w:r>
         <w:lastRenderedPageBreak/>
-        <w:t>Version 1.00 - Mai 2026</w:t>
-      </w:r>
-    </w:p>
-    <w:p>
-      <w:pPr>
-        <w:pStyle w:val="Titre3"/>
-      </w:pPr>
-      <w:r>
-        <w:t xml:space="preserve">Première version </w:t>
-      </w:r>
-      <w:proofErr w:type="spellStart"/>
-      <w:r>
-        <w:t>opérationnelle</w:t>
-      </w:r>
-      <w:proofErr w:type="spellEnd"/>
-    </w:p>
-    <w:p>
-      <w:pPr>
-        <w:pStyle w:val="Listepuces"/>
-        <w:rPr>
-          <w:lang w:val="fr-FR"/>
-        </w:rPr>
-      </w:pPr>
-      <w:r>
-        <w:rPr>
-          <w:lang w:val="fr-FR"/>
-        </w:rPr>
-        <w:t>Calcul du Temps Électronique Équivalent (EET).</w:t>
-      </w:r>
-    </w:p>
-    <w:p>
-      <w:pPr>
-        <w:pStyle w:val="Listepuces"/>
-        <w:rPr>
-          <w:lang w:val="fr-FR"/>
-        </w:rPr>
-      </w:pPr>
-      <w:r>
-        <w:rPr>
-          <w:lang w:val="fr-FR"/>
-        </w:rPr>
-        <w:t>Gestion des références de chronométrage.</w:t>
-      </w:r>
-    </w:p>
-    <w:p>
-      <w:pPr>
-        <w:pStyle w:val="Listepuces"/>
-        <w:rPr>
-          <w:lang w:val="fr-FR"/>
-        </w:rPr>
-      </w:pPr>
-      <w:r>
-        <w:rPr>
-          <w:lang w:val="fr-FR"/>
-        </w:rPr>
-        <w:t>Calcul automatique de la correction.</w:t>
-      </w:r>
-    </w:p>
-    <w:p>
-      <w:pPr>
-        <w:pStyle w:val="Listepuces"/>
-        <w:rPr>
-          <w:lang w:val="fr-FR"/>
-        </w:rPr>
-      </w:pPr>
-      <w:r>
-        <w:rPr>
-          <w:lang w:val="fr-FR"/>
-        </w:rPr>
-        <w:t>Calcul de l’EET selon les règles FIS.</w:t>
-      </w:r>
-    </w:p>
-    <w:p>
-      <w:pPr>
-        <w:pStyle w:val="Listepuces"/>
-      </w:pPr>
-      <w:proofErr w:type="spellStart"/>
-      <w:r>
-        <w:t>Affichage</w:t>
-      </w:r>
-      <w:proofErr w:type="spellEnd"/>
-      <w:r>
-        <w:t xml:space="preserve"> des deltas.</w:t>
-      </w:r>
-    </w:p>
-    <w:p>
-      <w:pPr>
-        <w:pStyle w:val="Listepuces"/>
-        <w:rPr>
-          <w:lang w:val="fr-FR"/>
-        </w:rPr>
-      </w:pPr>
-      <w:r>
-        <w:rPr>
-          <w:lang w:val="fr-FR"/>
-        </w:rPr>
-        <w:t>Sélection des précisions TM et TE.</w:t>
-      </w:r>
-    </w:p>
-    <w:p>
-      <w:pPr>
-        <w:pStyle w:val="Listepuces"/>
-      </w:pPr>
-      <w:r>
-        <w:t>Interface web Flask.</w:t>
-      </w:r>
-    </w:p>
-    <w:p>
-      <w:pPr>
-        <w:pStyle w:val="Listepuces"/>
-      </w:pPr>
-      <w:r>
-        <w:t>Export PDF.</w:t>
-      </w:r>
-    </w:p>
-    <w:p>
-      <w:pPr>
-        <w:pStyle w:val="Listepuces"/>
-        <w:rPr>
-          <w:lang w:val="fr-FR"/>
-        </w:rPr>
-      </w:pPr>
-      <w:r>
-        <w:rPr>
-          <w:lang w:val="fr-FR"/>
-        </w:rPr>
-        <w:t>Pages Aide et À propos.</w:t>
-      </w:r>
-    </w:p>
-    <w:p>
-      <w:pPr>
-        <w:pStyle w:val="Listepuces"/>
-        <w:rPr>
-          <w:lang w:val="fr-FR"/>
-        </w:rPr>
-      </w:pPr>
-      <w:r>
-        <w:rPr>
-          <w:lang w:val="fr-FR"/>
-        </w:rPr>
-        <w:t>Support multilingue (Français, English, Deutsch).</w:t>
-      </w:r>
-    </w:p>
-    <w:p>
-      <w:pPr>
-        <w:pStyle w:val="Titre3"/>
-      </w:pPr>
-      <w:r>
-        <w:t xml:space="preserve">Architecture </w:t>
-      </w:r>
-      <w:proofErr w:type="spellStart"/>
-      <w:r>
-        <w:t>initiale</w:t>
-      </w:r>
-      <w:proofErr w:type="spellEnd"/>
-    </w:p>
-    <w:p>
-      <w:pPr>
-        <w:pStyle w:val="Listepuces"/>
-      </w:pPr>
-      <w:r>
-        <w:t>Application Flask.</w:t>
-      </w:r>
-    </w:p>
-    <w:p>
-      <w:pPr>
-        <w:pStyle w:val="Listepuces"/>
-      </w:pPr>
-      <w:r>
-        <w:t>Templates HTML.</w:t>
-      </w:r>
-    </w:p>
-    <w:p>
-      <w:pPr>
-        <w:pStyle w:val="Listepuces"/>
-      </w:pPr>
-      <w:proofErr w:type="spellStart"/>
-      <w:r>
         <w:t>Feuilles</w:t>
       </w:r>
       <w:proofErr w:type="spellEnd"/>
@@ -4504,6 +5107,117 @@
     </w:lvl>
   </w:abstractNum>
   <w:abstractNum w:abstractNumId="12" w15:restartNumberingAfterBreak="0">
+    <w:nsid w:val="135730D9"/>
+    <w:multiLevelType w:val="hybridMultilevel"/>
+    <w:tmpl w:val="1C42504E"/>
+    <w:lvl w:ilvl="0" w:tplc="38187A96">
+      <w:numFmt w:val="bullet"/>
+      <w:lvlText w:val="•"/>
+      <w:lvlJc w:val="left"/>
+      <w:pPr>
+        <w:ind w:left="720" w:hanging="360"/>
+      </w:pPr>
+      <w:rPr>
+        <w:rFonts w:ascii="Cambria" w:eastAsia="Times New Roman" w:hAnsi="Cambria" w:cstheme="majorHAnsi" w:hint="default"/>
+      </w:rPr>
+    </w:lvl>
+    <w:lvl w:ilvl="1" w:tplc="45867900">
+      <w:numFmt w:val="bullet"/>
+      <w:lvlText w:val="-"/>
+      <w:lvlJc w:val="left"/>
+      <w:pPr>
+        <w:ind w:left="1440" w:hanging="360"/>
+      </w:pPr>
+      <w:rPr>
+        <w:rFonts w:ascii="Cambria" w:eastAsia="Times New Roman" w:hAnsi="Cambria" w:cstheme="majorHAnsi" w:hint="default"/>
+      </w:rPr>
+    </w:lvl>
+    <w:lvl w:ilvl="2" w:tplc="040C0005" w:tentative="1">
+      <w:start w:val="1"/>
+      <w:numFmt w:val="bullet"/>
+      <w:lvlText w:val=""/>
+      <w:lvlJc w:val="left"/>
+      <w:pPr>
+        <w:ind w:left="2160" w:hanging="360"/>
+      </w:pPr>
+      <w:rPr>
+        <w:rFonts w:ascii="Wingdings" w:hAnsi="Wingdings" w:hint="default"/>
+      </w:rPr>
+    </w:lvl>
+    <w:lvl w:ilvl="3" w:tplc="040C0001" w:tentative="1">
+      <w:start w:val="1"/>
+      <w:numFmt w:val="bullet"/>
+      <w:lvlText w:val=""/>
+      <w:lvlJc w:val="left"/>
+      <w:pPr>
+        <w:ind w:left="2880" w:hanging="360"/>
+      </w:pPr>
+      <w:rPr>
+        <w:rFonts w:ascii="Symbol" w:hAnsi="Symbol" w:hint="default"/>
+      </w:rPr>
+    </w:lvl>
+    <w:lvl w:ilvl="4" w:tplc="040C0003" w:tentative="1">
+      <w:start w:val="1"/>
+      <w:numFmt w:val="bullet"/>
+      <w:lvlText w:val="o"/>
+      <w:lvlJc w:val="left"/>
+      <w:pPr>
+        <w:ind w:left="3600" w:hanging="360"/>
+      </w:pPr>
+      <w:rPr>
+        <w:rFonts w:ascii="Courier New" w:hAnsi="Courier New" w:cs="Courier New" w:hint="default"/>
+      </w:rPr>
+    </w:lvl>
+    <w:lvl w:ilvl="5" w:tplc="040C0005" w:tentative="1">
+      <w:start w:val="1"/>
+      <w:numFmt w:val="bullet"/>
+      <w:lvlText w:val=""/>
+      <w:lvlJc w:val="left"/>
+      <w:pPr>
+        <w:ind w:left="4320" w:hanging="360"/>
+      </w:pPr>
+      <w:rPr>
+        <w:rFonts w:ascii="Wingdings" w:hAnsi="Wingdings" w:hint="default"/>
+      </w:rPr>
+    </w:lvl>
+    <w:lvl w:ilvl="6" w:tplc="040C0001" w:tentative="1">
+      <w:start w:val="1"/>
+      <w:numFmt w:val="bullet"/>
+      <w:lvlText w:val=""/>
+      <w:lvlJc w:val="left"/>
+      <w:pPr>
+        <w:ind w:left="5040" w:hanging="360"/>
+      </w:pPr>
+      <w:rPr>
+        <w:rFonts w:ascii="Symbol" w:hAnsi="Symbol" w:hint="default"/>
+      </w:rPr>
+    </w:lvl>
+    <w:lvl w:ilvl="7" w:tplc="040C0003" w:tentative="1">
+      <w:start w:val="1"/>
+      <w:numFmt w:val="bullet"/>
+      <w:lvlText w:val="o"/>
+      <w:lvlJc w:val="left"/>
+      <w:pPr>
+        <w:ind w:left="5760" w:hanging="360"/>
+      </w:pPr>
+      <w:rPr>
+        <w:rFonts w:ascii="Courier New" w:hAnsi="Courier New" w:cs="Courier New" w:hint="default"/>
+      </w:rPr>
+    </w:lvl>
+    <w:lvl w:ilvl="8" w:tplc="040C0005" w:tentative="1">
+      <w:start w:val="1"/>
+      <w:numFmt w:val="bullet"/>
+      <w:lvlText w:val=""/>
+      <w:lvlJc w:val="left"/>
+      <w:pPr>
+        <w:ind w:left="6480" w:hanging="360"/>
+      </w:pPr>
+      <w:rPr>
+        <w:rFonts w:ascii="Wingdings" w:hAnsi="Wingdings" w:hint="default"/>
+      </w:rPr>
+    </w:lvl>
+  </w:abstractNum>
+  <w:abstractNum w:abstractNumId="13" w15:restartNumberingAfterBreak="0">
     <w:nsid w:val="205D3FAB"/>
     <w:multiLevelType w:val="hybridMultilevel"/>
     <w:tmpl w:val="94900364"/>
@@ -4615,7 +5329,7 @@
       </w:rPr>
     </w:lvl>
   </w:abstractNum>
-  <w:abstractNum w:abstractNumId="13" w15:restartNumberingAfterBreak="0">
+  <w:abstractNum w:abstractNumId="14" w15:restartNumberingAfterBreak="0">
     <w:nsid w:val="26221917"/>
     <w:multiLevelType w:val="hybridMultilevel"/>
     <w:tmpl w:val="561A9604"/>
@@ -4728,7 +5442,7 @@
       </w:rPr>
     </w:lvl>
   </w:abstractNum>
-  <w:abstractNum w:abstractNumId="14" w15:restartNumberingAfterBreak="0">
+  <w:abstractNum w:abstractNumId="15" w15:restartNumberingAfterBreak="0">
     <w:nsid w:val="292B094B"/>
     <w:multiLevelType w:val="multilevel"/>
     <w:tmpl w:val="464C381C"/>
@@ -4877,7 +5591,119 @@
       </w:rPr>
     </w:lvl>
   </w:abstractNum>
-  <w:abstractNum w:abstractNumId="15" w15:restartNumberingAfterBreak="0">
+  <w:abstractNum w:abstractNumId="16" w15:restartNumberingAfterBreak="0">
+    <w:nsid w:val="427F332C"/>
+    <w:multiLevelType w:val="hybridMultilevel"/>
+    <w:tmpl w:val="B89478DC"/>
+    <w:lvl w:ilvl="0" w:tplc="38187A96">
+      <w:numFmt w:val="bullet"/>
+      <w:lvlText w:val="•"/>
+      <w:lvlJc w:val="left"/>
+      <w:pPr>
+        <w:ind w:left="720" w:hanging="360"/>
+      </w:pPr>
+      <w:rPr>
+        <w:rFonts w:ascii="Cambria" w:eastAsia="Times New Roman" w:hAnsi="Cambria" w:cstheme="majorHAnsi" w:hint="default"/>
+      </w:rPr>
+    </w:lvl>
+    <w:lvl w:ilvl="1" w:tplc="040C0003" w:tentative="1">
+      <w:start w:val="1"/>
+      <w:numFmt w:val="bullet"/>
+      <w:lvlText w:val="o"/>
+      <w:lvlJc w:val="left"/>
+      <w:pPr>
+        <w:ind w:left="1440" w:hanging="360"/>
+      </w:pPr>
+      <w:rPr>
+        <w:rFonts w:ascii="Courier New" w:hAnsi="Courier New" w:cs="Courier New" w:hint="default"/>
+      </w:rPr>
+    </w:lvl>
+    <w:lvl w:ilvl="2" w:tplc="040C0005" w:tentative="1">
+      <w:start w:val="1"/>
+      <w:numFmt w:val="bullet"/>
+      <w:lvlText w:val=""/>
+      <w:lvlJc w:val="left"/>
+      <w:pPr>
+        <w:ind w:left="2160" w:hanging="360"/>
+      </w:pPr>
+      <w:rPr>
+        <w:rFonts w:ascii="Wingdings" w:hAnsi="Wingdings" w:hint="default"/>
+      </w:rPr>
+    </w:lvl>
+    <w:lvl w:ilvl="3" w:tplc="040C0001" w:tentative="1">
+      <w:start w:val="1"/>
+      <w:numFmt w:val="bullet"/>
+      <w:lvlText w:val=""/>
+      <w:lvlJc w:val="left"/>
+      <w:pPr>
+        <w:ind w:left="2880" w:hanging="360"/>
+      </w:pPr>
+      <w:rPr>
+        <w:rFonts w:ascii="Symbol" w:hAnsi="Symbol" w:hint="default"/>
+      </w:rPr>
+    </w:lvl>
+    <w:lvl w:ilvl="4" w:tplc="040C0003" w:tentative="1">
+      <w:start w:val="1"/>
+      <w:numFmt w:val="bullet"/>
+      <w:lvlText w:val="o"/>
+      <w:lvlJc w:val="left"/>
+      <w:pPr>
+        <w:ind w:left="3600" w:hanging="360"/>
+      </w:pPr>
+      <w:rPr>
+        <w:rFonts w:ascii="Courier New" w:hAnsi="Courier New" w:cs="Courier New" w:hint="default"/>
+      </w:rPr>
+    </w:lvl>
+    <w:lvl w:ilvl="5" w:tplc="040C0005" w:tentative="1">
+      <w:start w:val="1"/>
+      <w:numFmt w:val="bullet"/>
+      <w:lvlText w:val=""/>
+      <w:lvlJc w:val="left"/>
+      <w:pPr>
+        <w:ind w:left="4320" w:hanging="360"/>
+      </w:pPr>
+      <w:rPr>
+        <w:rFonts w:ascii="Wingdings" w:hAnsi="Wingdings" w:hint="default"/>
+      </w:rPr>
+    </w:lvl>
+    <w:lvl w:ilvl="6" w:tplc="040C0001" w:tentative="1">
+      <w:start w:val="1"/>
+      <w:numFmt w:val="bullet"/>
+      <w:lvlText w:val=""/>
+      <w:lvlJc w:val="left"/>
+      <w:pPr>
+        <w:ind w:left="5040" w:hanging="360"/>
+      </w:pPr>
+      <w:rPr>
+        <w:rFonts w:ascii="Symbol" w:hAnsi="Symbol" w:hint="default"/>
+      </w:rPr>
+    </w:lvl>
+    <w:lvl w:ilvl="7" w:tplc="040C0003" w:tentative="1">
+      <w:start w:val="1"/>
+      <w:numFmt w:val="bullet"/>
+      <w:lvlText w:val="o"/>
+      <w:lvlJc w:val="left"/>
+      <w:pPr>
+        <w:ind w:left="5760" w:hanging="360"/>
+      </w:pPr>
+      <w:rPr>
+        <w:rFonts w:ascii="Courier New" w:hAnsi="Courier New" w:cs="Courier New" w:hint="default"/>
+      </w:rPr>
+    </w:lvl>
+    <w:lvl w:ilvl="8" w:tplc="040C0005" w:tentative="1">
+      <w:start w:val="1"/>
+      <w:numFmt w:val="bullet"/>
+      <w:lvlText w:val=""/>
+      <w:lvlJc w:val="left"/>
+      <w:pPr>
+        <w:ind w:left="6480" w:hanging="360"/>
+      </w:pPr>
+      <w:rPr>
+        <w:rFonts w:ascii="Wingdings" w:hAnsi="Wingdings" w:hint="default"/>
+      </w:rPr>
+    </w:lvl>
+  </w:abstractNum>
+  <w:abstractNum w:abstractNumId="17" w15:restartNumberingAfterBreak="0">
     <w:nsid w:val="4AE273F0"/>
     <w:multiLevelType w:val="hybridMultilevel"/>
     <w:tmpl w:val="0C94FAFC"/>
@@ -4990,7 +5816,120 @@
       </w:rPr>
     </w:lvl>
   </w:abstractNum>
-  <w:abstractNum w:abstractNumId="16" w15:restartNumberingAfterBreak="0">
+  <w:abstractNum w:abstractNumId="18" w15:restartNumberingAfterBreak="0">
+    <w:nsid w:val="4B0D024A"/>
+    <w:multiLevelType w:val="hybridMultilevel"/>
+    <w:tmpl w:val="0396E3DC"/>
+    <w:lvl w:ilvl="0" w:tplc="040C0001">
+      <w:start w:val="1"/>
+      <w:numFmt w:val="bullet"/>
+      <w:lvlText w:val=""/>
+      <w:lvlJc w:val="left"/>
+      <w:pPr>
+        <w:ind w:left="720" w:hanging="360"/>
+      </w:pPr>
+      <w:rPr>
+        <w:rFonts w:ascii="Symbol" w:hAnsi="Symbol" w:hint="default"/>
+      </w:rPr>
+    </w:lvl>
+    <w:lvl w:ilvl="1" w:tplc="040C0003" w:tentative="1">
+      <w:start w:val="1"/>
+      <w:numFmt w:val="bullet"/>
+      <w:lvlText w:val="o"/>
+      <w:lvlJc w:val="left"/>
+      <w:pPr>
+        <w:ind w:left="1440" w:hanging="360"/>
+      </w:pPr>
+      <w:rPr>
+        <w:rFonts w:ascii="Courier New" w:hAnsi="Courier New" w:cs="Courier New" w:hint="default"/>
+      </w:rPr>
+    </w:lvl>
+    <w:lvl w:ilvl="2" w:tplc="040C0005" w:tentative="1">
+      <w:start w:val="1"/>
+      <w:numFmt w:val="bullet"/>
+      <w:lvlText w:val=""/>
+      <w:lvlJc w:val="left"/>
+      <w:pPr>
+        <w:ind w:left="2160" w:hanging="360"/>
+      </w:pPr>
+      <w:rPr>
+        <w:rFonts w:ascii="Wingdings" w:hAnsi="Wingdings" w:hint="default"/>
+      </w:rPr>
+    </w:lvl>
+    <w:lvl w:ilvl="3" w:tplc="040C0001" w:tentative="1">
+      <w:start w:val="1"/>
+      <w:numFmt w:val="bullet"/>
+      <w:lvlText w:val=""/>
+      <w:lvlJc w:val="left"/>
+      <w:pPr>
+        <w:ind w:left="2880" w:hanging="360"/>
+      </w:pPr>
+      <w:rPr>
+        <w:rFonts w:ascii="Symbol" w:hAnsi="Symbol" w:hint="default"/>
+      </w:rPr>
+    </w:lvl>
+    <w:lvl w:ilvl="4" w:tplc="040C0003" w:tentative="1">
+      <w:start w:val="1"/>
+      <w:numFmt w:val="bullet"/>
+      <w:lvlText w:val="o"/>
+      <w:lvlJc w:val="left"/>
+      <w:pPr>
+        <w:ind w:left="3600" w:hanging="360"/>
+      </w:pPr>
+      <w:rPr>
+        <w:rFonts w:ascii="Courier New" w:hAnsi="Courier New" w:cs="Courier New" w:hint="default"/>
+      </w:rPr>
+    </w:lvl>
+    <w:lvl w:ilvl="5" w:tplc="040C0005" w:tentative="1">
+      <w:start w:val="1"/>
+      <w:numFmt w:val="bullet"/>
+      <w:lvlText w:val=""/>
+      <w:lvlJc w:val="left"/>
+      <w:pPr>
+        <w:ind w:left="4320" w:hanging="360"/>
+      </w:pPr>
+      <w:rPr>
+        <w:rFonts w:ascii="Wingdings" w:hAnsi="Wingdings" w:hint="default"/>
+      </w:rPr>
+    </w:lvl>
+    <w:lvl w:ilvl="6" w:tplc="040C0001" w:tentative="1">
+      <w:start w:val="1"/>
+      <w:numFmt w:val="bullet"/>
+      <w:lvlText w:val=""/>
+      <w:lvlJc w:val="left"/>
+      <w:pPr>
+        <w:ind w:left="5040" w:hanging="360"/>
+      </w:pPr>
+      <w:rPr>
+        <w:rFonts w:ascii="Symbol" w:hAnsi="Symbol" w:hint="default"/>
+      </w:rPr>
+    </w:lvl>
+    <w:lvl w:ilvl="7" w:tplc="040C0003" w:tentative="1">
+      <w:start w:val="1"/>
+      <w:numFmt w:val="bullet"/>
+      <w:lvlText w:val="o"/>
+      <w:lvlJc w:val="left"/>
+      <w:pPr>
+        <w:ind w:left="5760" w:hanging="360"/>
+      </w:pPr>
+      <w:rPr>
+        <w:rFonts w:ascii="Courier New" w:hAnsi="Courier New" w:cs="Courier New" w:hint="default"/>
+      </w:rPr>
+    </w:lvl>
+    <w:lvl w:ilvl="8" w:tplc="040C0005" w:tentative="1">
+      <w:start w:val="1"/>
+      <w:numFmt w:val="bullet"/>
+      <w:lvlText w:val=""/>
+      <w:lvlJc w:val="left"/>
+      <w:pPr>
+        <w:ind w:left="6480" w:hanging="360"/>
+      </w:pPr>
+      <w:rPr>
+        <w:rFonts w:ascii="Wingdings" w:hAnsi="Wingdings" w:hint="default"/>
+      </w:rPr>
+    </w:lvl>
+  </w:abstractNum>
+  <w:abstractNum w:abstractNumId="19" w15:restartNumberingAfterBreak="0">
     <w:nsid w:val="4BE545FA"/>
     <w:multiLevelType w:val="hybridMultilevel"/>
     <w:tmpl w:val="77740F48"/>
@@ -5103,7 +6042,7 @@
       </w:rPr>
     </w:lvl>
   </w:abstractNum>
-  <w:abstractNum w:abstractNumId="17" w15:restartNumberingAfterBreak="0">
+  <w:abstractNum w:abstractNumId="20" w15:restartNumberingAfterBreak="0">
     <w:nsid w:val="5E361331"/>
     <w:multiLevelType w:val="multilevel"/>
     <w:tmpl w:val="017AE51E"/>
@@ -5252,7 +6191,343 @@
       </w:rPr>
     </w:lvl>
   </w:abstractNum>
-  <w:abstractNum w:abstractNumId="18" w15:restartNumberingAfterBreak="0">
+  <w:abstractNum w:abstractNumId="21" w15:restartNumberingAfterBreak="0">
+    <w:nsid w:val="670F70ED"/>
+    <w:multiLevelType w:val="hybridMultilevel"/>
+    <w:tmpl w:val="2CF4EA26"/>
+    <w:lvl w:ilvl="0" w:tplc="38187A96">
+      <w:numFmt w:val="bullet"/>
+      <w:lvlText w:val="•"/>
+      <w:lvlJc w:val="left"/>
+      <w:pPr>
+        <w:ind w:left="720" w:hanging="360"/>
+      </w:pPr>
+      <w:rPr>
+        <w:rFonts w:ascii="Cambria" w:eastAsia="Times New Roman" w:hAnsi="Cambria" w:cstheme="majorHAnsi" w:hint="default"/>
+      </w:rPr>
+    </w:lvl>
+    <w:lvl w:ilvl="1" w:tplc="040C0003" w:tentative="1">
+      <w:start w:val="1"/>
+      <w:numFmt w:val="bullet"/>
+      <w:lvlText w:val="o"/>
+      <w:lvlJc w:val="left"/>
+      <w:pPr>
+        <w:ind w:left="1440" w:hanging="360"/>
+      </w:pPr>
+      <w:rPr>
+        <w:rFonts w:ascii="Courier New" w:hAnsi="Courier New" w:cs="Courier New" w:hint="default"/>
+      </w:rPr>
+    </w:lvl>
+    <w:lvl w:ilvl="2" w:tplc="040C0005" w:tentative="1">
+      <w:start w:val="1"/>
+      <w:numFmt w:val="bullet"/>
+      <w:lvlText w:val=""/>
+      <w:lvlJc w:val="left"/>
+      <w:pPr>
+        <w:ind w:left="2160" w:hanging="360"/>
+      </w:pPr>
+      <w:rPr>
+        <w:rFonts w:ascii="Wingdings" w:hAnsi="Wingdings" w:hint="default"/>
+      </w:rPr>
+    </w:lvl>
+    <w:lvl w:ilvl="3" w:tplc="040C0001" w:tentative="1">
+      <w:start w:val="1"/>
+      <w:numFmt w:val="bullet"/>
+      <w:lvlText w:val=""/>
+      <w:lvlJc w:val="left"/>
+      <w:pPr>
+        <w:ind w:left="2880" w:hanging="360"/>
+      </w:pPr>
+      <w:rPr>
+        <w:rFonts w:ascii="Symbol" w:hAnsi="Symbol" w:hint="default"/>
+      </w:rPr>
+    </w:lvl>
+    <w:lvl w:ilvl="4" w:tplc="040C0003" w:tentative="1">
+      <w:start w:val="1"/>
+      <w:numFmt w:val="bullet"/>
+      <w:lvlText w:val="o"/>
+      <w:lvlJc w:val="left"/>
+      <w:pPr>
+        <w:ind w:left="3600" w:hanging="360"/>
+      </w:pPr>
+      <w:rPr>
+        <w:rFonts w:ascii="Courier New" w:hAnsi="Courier New" w:cs="Courier New" w:hint="default"/>
+      </w:rPr>
+    </w:lvl>
+    <w:lvl w:ilvl="5" w:tplc="040C0005" w:tentative="1">
+      <w:start w:val="1"/>
+      <w:numFmt w:val="bullet"/>
+      <w:lvlText w:val=""/>
+      <w:lvlJc w:val="left"/>
+      <w:pPr>
+        <w:ind w:left="4320" w:hanging="360"/>
+      </w:pPr>
+      <w:rPr>
+        <w:rFonts w:ascii="Wingdings" w:hAnsi="Wingdings" w:hint="default"/>
+      </w:rPr>
+    </w:lvl>
+    <w:lvl w:ilvl="6" w:tplc="040C0001" w:tentative="1">
+      <w:start w:val="1"/>
+      <w:numFmt w:val="bullet"/>
+      <w:lvlText w:val=""/>
+      <w:lvlJc w:val="left"/>
+      <w:pPr>
+        <w:ind w:left="5040" w:hanging="360"/>
+      </w:pPr>
+      <w:rPr>
+        <w:rFonts w:ascii="Symbol" w:hAnsi="Symbol" w:hint="default"/>
+      </w:rPr>
+    </w:lvl>
+    <w:lvl w:ilvl="7" w:tplc="040C0003" w:tentative="1">
+      <w:start w:val="1"/>
+      <w:numFmt w:val="bullet"/>
+      <w:lvlText w:val="o"/>
+      <w:lvlJc w:val="left"/>
+      <w:pPr>
+        <w:ind w:left="5760" w:hanging="360"/>
+      </w:pPr>
+      <w:rPr>
+        <w:rFonts w:ascii="Courier New" w:hAnsi="Courier New" w:cs="Courier New" w:hint="default"/>
+      </w:rPr>
+    </w:lvl>
+    <w:lvl w:ilvl="8" w:tplc="040C0005" w:tentative="1">
+      <w:start w:val="1"/>
+      <w:numFmt w:val="bullet"/>
+      <w:lvlText w:val=""/>
+      <w:lvlJc w:val="left"/>
+      <w:pPr>
+        <w:ind w:left="6480" w:hanging="360"/>
+      </w:pPr>
+      <w:rPr>
+        <w:rFonts w:ascii="Wingdings" w:hAnsi="Wingdings" w:hint="default"/>
+      </w:rPr>
+    </w:lvl>
+  </w:abstractNum>
+  <w:abstractNum w:abstractNumId="22" w15:restartNumberingAfterBreak="0">
+    <w:nsid w:val="6C28160A"/>
+    <w:multiLevelType w:val="hybridMultilevel"/>
+    <w:tmpl w:val="7B12E8AE"/>
+    <w:lvl w:ilvl="0" w:tplc="38187A96">
+      <w:numFmt w:val="bullet"/>
+      <w:lvlText w:val="•"/>
+      <w:lvlJc w:val="left"/>
+      <w:pPr>
+        <w:ind w:left="720" w:hanging="360"/>
+      </w:pPr>
+      <w:rPr>
+        <w:rFonts w:ascii="Cambria" w:eastAsia="Times New Roman" w:hAnsi="Cambria" w:cstheme="majorHAnsi" w:hint="default"/>
+      </w:rPr>
+    </w:lvl>
+    <w:lvl w:ilvl="1" w:tplc="040C0003" w:tentative="1">
+      <w:start w:val="1"/>
+      <w:numFmt w:val="bullet"/>
+      <w:lvlText w:val="o"/>
+      <w:lvlJc w:val="left"/>
+      <w:pPr>
+        <w:ind w:left="1440" w:hanging="360"/>
+      </w:pPr>
+      <w:rPr>
+        <w:rFonts w:ascii="Courier New" w:hAnsi="Courier New" w:cs="Courier New" w:hint="default"/>
+      </w:rPr>
+    </w:lvl>
+    <w:lvl w:ilvl="2" w:tplc="040C0005" w:tentative="1">
+      <w:start w:val="1"/>
+      <w:numFmt w:val="bullet"/>
+      <w:lvlText w:val=""/>
+      <w:lvlJc w:val="left"/>
+      <w:pPr>
+        <w:ind w:left="2160" w:hanging="360"/>
+      </w:pPr>
+      <w:rPr>
+        <w:rFonts w:ascii="Wingdings" w:hAnsi="Wingdings" w:hint="default"/>
+      </w:rPr>
+    </w:lvl>
+    <w:lvl w:ilvl="3" w:tplc="040C0001" w:tentative="1">
+      <w:start w:val="1"/>
+      <w:numFmt w:val="bullet"/>
+      <w:lvlText w:val=""/>
+      <w:lvlJc w:val="left"/>
+      <w:pPr>
+        <w:ind w:left="2880" w:hanging="360"/>
+      </w:pPr>
+      <w:rPr>
+        <w:rFonts w:ascii="Symbol" w:hAnsi="Symbol" w:hint="default"/>
+      </w:rPr>
+    </w:lvl>
+    <w:lvl w:ilvl="4" w:tplc="040C0003" w:tentative="1">
+      <w:start w:val="1"/>
+      <w:numFmt w:val="bullet"/>
+      <w:lvlText w:val="o"/>
+      <w:lvlJc w:val="left"/>
+      <w:pPr>
+        <w:ind w:left="3600" w:hanging="360"/>
+      </w:pPr>
+      <w:rPr>
+        <w:rFonts w:ascii="Courier New" w:hAnsi="Courier New" w:cs="Courier New" w:hint="default"/>
+      </w:rPr>
+    </w:lvl>
+    <w:lvl w:ilvl="5" w:tplc="040C0005" w:tentative="1">
+      <w:start w:val="1"/>
+      <w:numFmt w:val="bullet"/>
+      <w:lvlText w:val=""/>
+      <w:lvlJc w:val="left"/>
+      <w:pPr>
+        <w:ind w:left="4320" w:hanging="360"/>
+      </w:pPr>
+      <w:rPr>
+        <w:rFonts w:ascii="Wingdings" w:hAnsi="Wingdings" w:hint="default"/>
+      </w:rPr>
+    </w:lvl>
+    <w:lvl w:ilvl="6" w:tplc="040C0001" w:tentative="1">
+      <w:start w:val="1"/>
+      <w:numFmt w:val="bullet"/>
+      <w:lvlText w:val=""/>
+      <w:lvlJc w:val="left"/>
+      <w:pPr>
+        <w:ind w:left="5040" w:hanging="360"/>
+      </w:pPr>
+      <w:rPr>
+        <w:rFonts w:ascii="Symbol" w:hAnsi="Symbol" w:hint="default"/>
+      </w:rPr>
+    </w:lvl>
+    <w:lvl w:ilvl="7" w:tplc="040C0003" w:tentative="1">
+      <w:start w:val="1"/>
+      <w:numFmt w:val="bullet"/>
+      <w:lvlText w:val="o"/>
+      <w:lvlJc w:val="left"/>
+      <w:pPr>
+        <w:ind w:left="5760" w:hanging="360"/>
+      </w:pPr>
+      <w:rPr>
+        <w:rFonts w:ascii="Courier New" w:hAnsi="Courier New" w:cs="Courier New" w:hint="default"/>
+      </w:rPr>
+    </w:lvl>
+    <w:lvl w:ilvl="8" w:tplc="040C0005" w:tentative="1">
+      <w:start w:val="1"/>
+      <w:numFmt w:val="bullet"/>
+      <w:lvlText w:val=""/>
+      <w:lvlJc w:val="left"/>
+      <w:pPr>
+        <w:ind w:left="6480" w:hanging="360"/>
+      </w:pPr>
+      <w:rPr>
+        <w:rFonts w:ascii="Wingdings" w:hAnsi="Wingdings" w:hint="default"/>
+      </w:rPr>
+    </w:lvl>
+  </w:abstractNum>
+  <w:abstractNum w:abstractNumId="23" w15:restartNumberingAfterBreak="0">
+    <w:nsid w:val="6FAE38E3"/>
+    <w:multiLevelType w:val="hybridMultilevel"/>
+    <w:tmpl w:val="46FC94A4"/>
+    <w:lvl w:ilvl="0" w:tplc="38187A96">
+      <w:numFmt w:val="bullet"/>
+      <w:lvlText w:val="•"/>
+      <w:lvlJc w:val="left"/>
+      <w:pPr>
+        <w:ind w:left="720" w:hanging="360"/>
+      </w:pPr>
+      <w:rPr>
+        <w:rFonts w:ascii="Cambria" w:eastAsia="Times New Roman" w:hAnsi="Cambria" w:cstheme="majorHAnsi" w:hint="default"/>
+      </w:rPr>
+    </w:lvl>
+    <w:lvl w:ilvl="1" w:tplc="040C0003" w:tentative="1">
+      <w:start w:val="1"/>
+      <w:numFmt w:val="bullet"/>
+      <w:lvlText w:val="o"/>
+      <w:lvlJc w:val="left"/>
+      <w:pPr>
+        <w:ind w:left="1440" w:hanging="360"/>
+      </w:pPr>
+      <w:rPr>
+        <w:rFonts w:ascii="Courier New" w:hAnsi="Courier New" w:cs="Courier New" w:hint="default"/>
+      </w:rPr>
+    </w:lvl>
+    <w:lvl w:ilvl="2" w:tplc="040C0005" w:tentative="1">
+      <w:start w:val="1"/>
+      <w:numFmt w:val="bullet"/>
+      <w:lvlText w:val=""/>
+      <w:lvlJc w:val="left"/>
+      <w:pPr>
+        <w:ind w:left="2160" w:hanging="360"/>
+      </w:pPr>
+      <w:rPr>
+        <w:rFonts w:ascii="Wingdings" w:hAnsi="Wingdings" w:hint="default"/>
+      </w:rPr>
+    </w:lvl>
+    <w:lvl w:ilvl="3" w:tplc="040C0001" w:tentative="1">
+      <w:start w:val="1"/>
+      <w:numFmt w:val="bullet"/>
+      <w:lvlText w:val=""/>
+      <w:lvlJc w:val="left"/>
+      <w:pPr>
+        <w:ind w:left="2880" w:hanging="360"/>
+      </w:pPr>
+      <w:rPr>
+        <w:rFonts w:ascii="Symbol" w:hAnsi="Symbol" w:hint="default"/>
+      </w:rPr>
+    </w:lvl>
+    <w:lvl w:ilvl="4" w:tplc="040C0003" w:tentative="1">
+      <w:start w:val="1"/>
+      <w:numFmt w:val="bullet"/>
+      <w:lvlText w:val="o"/>
+      <w:lvlJc w:val="left"/>
+      <w:pPr>
+        <w:ind w:left="3600" w:hanging="360"/>
+      </w:pPr>
+      <w:rPr>
+        <w:rFonts w:ascii="Courier New" w:hAnsi="Courier New" w:cs="Courier New" w:hint="default"/>
+      </w:rPr>
+    </w:lvl>
+    <w:lvl w:ilvl="5" w:tplc="040C0005" w:tentative="1">
+      <w:start w:val="1"/>
+      <w:numFmt w:val="bullet"/>
+      <w:lvlText w:val=""/>
+      <w:lvlJc w:val="left"/>
+      <w:pPr>
+        <w:ind w:left="4320" w:hanging="360"/>
+      </w:pPr>
+      <w:rPr>
+        <w:rFonts w:ascii="Wingdings" w:hAnsi="Wingdings" w:hint="default"/>
+      </w:rPr>
+    </w:lvl>
+    <w:lvl w:ilvl="6" w:tplc="040C0001" w:tentative="1">
+      <w:start w:val="1"/>
+      <w:numFmt w:val="bullet"/>
+      <w:lvlText w:val=""/>
+      <w:lvlJc w:val="left"/>
+      <w:pPr>
+        <w:ind w:left="5040" w:hanging="360"/>
+      </w:pPr>
+      <w:rPr>
+        <w:rFonts w:ascii="Symbol" w:hAnsi="Symbol" w:hint="default"/>
+      </w:rPr>
+    </w:lvl>
+    <w:lvl w:ilvl="7" w:tplc="040C0003" w:tentative="1">
+      <w:start w:val="1"/>
+      <w:numFmt w:val="bullet"/>
+      <w:lvlText w:val="o"/>
+      <w:lvlJc w:val="left"/>
+      <w:pPr>
+        <w:ind w:left="5760" w:hanging="360"/>
+      </w:pPr>
+      <w:rPr>
+        <w:rFonts w:ascii="Courier New" w:hAnsi="Courier New" w:cs="Courier New" w:hint="default"/>
+      </w:rPr>
+    </w:lvl>
+    <w:lvl w:ilvl="8" w:tplc="040C0005" w:tentative="1">
+      <w:start w:val="1"/>
+      <w:numFmt w:val="bullet"/>
+      <w:lvlText w:val=""/>
+      <w:lvlJc w:val="left"/>
+      <w:pPr>
+        <w:ind w:left="6480" w:hanging="360"/>
+      </w:pPr>
+      <w:rPr>
+        <w:rFonts w:ascii="Wingdings" w:hAnsi="Wingdings" w:hint="default"/>
+      </w:rPr>
+    </w:lvl>
+  </w:abstractNum>
+  <w:abstractNum w:abstractNumId="24" w15:restartNumberingAfterBreak="0">
     <w:nsid w:val="742D20C4"/>
     <w:multiLevelType w:val="multilevel"/>
     <w:tmpl w:val="689A6A9A"/>
@@ -5429,25 +6704,25 @@
     <w:abstractNumId w:val="0"/>
   </w:num>
   <w:num w:numId="10" w16cid:durableId="657928507">
-    <w:abstractNumId w:val="17"/>
+    <w:abstractNumId w:val="20"/>
   </w:num>
   <w:num w:numId="11" w16cid:durableId="4333970">
-    <w:abstractNumId w:val="18"/>
+    <w:abstractNumId w:val="24"/>
   </w:num>
   <w:num w:numId="12" w16cid:durableId="1619754819">
     <w:abstractNumId w:val="10"/>
   </w:num>
   <w:num w:numId="13" w16cid:durableId="811287701">
-    <w:abstractNumId w:val="12"/>
+    <w:abstractNumId w:val="13"/>
   </w:num>
   <w:num w:numId="14" w16cid:durableId="1894925761">
-    <w:abstractNumId w:val="15"/>
+    <w:abstractNumId w:val="17"/>
   </w:num>
   <w:num w:numId="15" w16cid:durableId="1334408597">
-    <w:abstractNumId w:val="13"/>
+    <w:abstractNumId w:val="14"/>
   </w:num>
   <w:num w:numId="16" w16cid:durableId="1923756825">
-    <w:abstractNumId w:val="14"/>
+    <w:abstractNumId w:val="15"/>
   </w:num>
   <w:num w:numId="17" w16cid:durableId="1776251164">
     <w:abstractNumId w:val="11"/>
@@ -5456,6 +6731,24 @@
     <w:abstractNumId w:val="9"/>
   </w:num>
   <w:num w:numId="19" w16cid:durableId="1086613626">
+    <w:abstractNumId w:val="19"/>
+  </w:num>
+  <w:num w:numId="20" w16cid:durableId="1121534631">
+    <w:abstractNumId w:val="18"/>
+  </w:num>
+  <w:num w:numId="21" w16cid:durableId="1681852733">
+    <w:abstractNumId w:val="12"/>
+  </w:num>
+  <w:num w:numId="22" w16cid:durableId="398136196">
+    <w:abstractNumId w:val="22"/>
+  </w:num>
+  <w:num w:numId="23" w16cid:durableId="812215742">
+    <w:abstractNumId w:val="21"/>
+  </w:num>
+  <w:num w:numId="24" w16cid:durableId="631327678">
+    <w:abstractNumId w:val="23"/>
+  </w:num>
+  <w:num w:numId="25" w16cid:durableId="216741209">
     <w:abstractNumId w:val="16"/>
   </w:num>
 </w:numbering>
@@ -6064,6 +7357,7 @@
   <w:style w:type="character" w:default="1" w:styleId="Policepardfaut">
     <w:name w:val="Default Paragraph Font"/>
     <w:uiPriority w:val="1"/>
+    <w:semiHidden/>
     <w:unhideWhenUsed/>
   </w:style>
   <w:style w:type="table" w:default="1" w:styleId="TableauNormal">

</xml_diff>

<commit_message>
Rewrite README and update CHANGELOG
</commit_message>
<xml_diff>
--- a/documentation/CHANGELOG_EET_Calculator.docx
+++ b/documentation/CHANGELOG_EET_Calculator.docx
@@ -52,636 +52,7 @@
           <w:szCs w:val="28"/>
           <w:lang w:val="fr-FR" w:eastAsia="fr-FR"/>
         </w:rPr>
-        <w:t>Version 2.01 / APP_VERSION 1.21 – juillet 2026</w:t>
-      </w:r>
-    </w:p>
-    <w:p>
-      <w:pPr>
-        <w:spacing w:before="100" w:beforeAutospacing="1" w:after="100" w:afterAutospacing="1" w:line="240" w:lineRule="auto"/>
-        <w:outlineLvl w:val="0"/>
-        <w:rPr>
-          <w:rFonts w:eastAsia="Times New Roman" w:cstheme="majorHAnsi"/>
-          <w:b/>
-          <w:bCs/>
-          <w:color w:val="365F91" w:themeColor="accent1" w:themeShade="BF"/>
-          <w:kern w:val="36"/>
-          <w:lang w:val="fr-FR" w:eastAsia="fr-FR"/>
-        </w:rPr>
-      </w:pPr>
-      <w:r>
-        <w:rPr>
-          <w:rFonts w:eastAsia="Times New Roman" w:cstheme="majorHAnsi"/>
-          <w:b/>
-          <w:bCs/>
-          <w:color w:val="000000" w:themeColor="text1"/>
-          <w:kern w:val="36"/>
-          <w:lang w:val="fr-FR" w:eastAsia="fr-FR"/>
-        </w:rPr>
-        <w:t>Architecture</w:t>
-      </w:r>
-    </w:p>
-    <w:p>
-      <w:pPr>
-        <w:pStyle w:val="Paragraphedeliste"/>
-        <w:numPr>
-          <w:ilvl w:val="0"/>
-          <w:numId w:val="21"/>
-        </w:numPr>
-        <w:spacing w:before="100" w:beforeAutospacing="1" w:after="100" w:afterAutospacing="1" w:line="240" w:lineRule="auto"/>
-        <w:outlineLvl w:val="0"/>
-        <w:rPr>
-          <w:rFonts w:eastAsia="Times New Roman" w:cstheme="majorHAnsi"/>
-          <w:color w:val="000000" w:themeColor="text1"/>
-          <w:kern w:val="36"/>
-          <w:lang w:val="fr-FR" w:eastAsia="fr-FR"/>
-        </w:rPr>
-      </w:pPr>
-      <w:r>
-        <w:rPr>
-          <w:rFonts w:eastAsia="Times New Roman" w:cstheme="majorHAnsi"/>
-          <w:color w:val="000000" w:themeColor="text1"/>
-          <w:kern w:val="36"/>
-          <w:lang w:val="fr-FR" w:eastAsia="fr-FR"/>
-        </w:rPr>
-        <w:t>Finalisation de l'architecture basée sur RACE_SCHEMA (protocole d'échange) et RACE_MODEL (modèle métier).</w:t>
-      </w:r>
-    </w:p>
-    <w:p>
-      <w:pPr>
-        <w:pStyle w:val="Paragraphedeliste"/>
-        <w:numPr>
-          <w:ilvl w:val="0"/>
-          <w:numId w:val="21"/>
-        </w:numPr>
-        <w:spacing w:before="100" w:beforeAutospacing="1" w:after="100" w:afterAutospacing="1" w:line="240" w:lineRule="auto"/>
-        <w:outlineLvl w:val="0"/>
-        <w:rPr>
-          <w:rFonts w:eastAsia="Times New Roman" w:cstheme="majorHAnsi"/>
-          <w:color w:val="000000" w:themeColor="text1"/>
-          <w:kern w:val="36"/>
-          <w:lang w:val="fr-FR" w:eastAsia="fr-FR"/>
-        </w:rPr>
-      </w:pPr>
-      <w:r>
-        <w:rPr>
-          <w:rFonts w:eastAsia="Times New Roman" w:cstheme="majorHAnsi"/>
-          <w:color w:val="000000" w:themeColor="text1"/>
-          <w:kern w:val="36"/>
-          <w:lang w:val="fr-FR" w:eastAsia="fr-FR"/>
-        </w:rPr>
-        <w:t>Première version conforme au protocole d'échange EEP 1.0.</w:t>
-      </w:r>
-    </w:p>
-    <w:p>
-      <w:pPr>
-        <w:pStyle w:val="Paragraphedeliste"/>
-        <w:numPr>
-          <w:ilvl w:val="0"/>
-          <w:numId w:val="21"/>
-        </w:numPr>
-        <w:spacing w:before="100" w:beforeAutospacing="1" w:after="100" w:afterAutospacing="1" w:line="240" w:lineRule="auto"/>
-        <w:outlineLvl w:val="0"/>
-        <w:rPr>
-          <w:rFonts w:eastAsia="Times New Roman" w:cstheme="majorHAnsi"/>
-          <w:color w:val="000000" w:themeColor="text1"/>
-          <w:kern w:val="36"/>
-          <w:lang w:val="fr-FR" w:eastAsia="fr-FR"/>
-        </w:rPr>
-      </w:pPr>
-      <w:r>
-        <w:rPr>
-          <w:rFonts w:eastAsia="Times New Roman" w:cstheme="majorHAnsi"/>
-          <w:color w:val="000000" w:themeColor="text1"/>
-          <w:kern w:val="36"/>
-          <w:lang w:val="fr-FR" w:eastAsia="fr-FR"/>
-        </w:rPr>
-        <w:t>Clarification des responsabilités entre les services, le modèle métier et la génération des rapports PDF.</w:t>
-      </w:r>
-    </w:p>
-    <w:p>
-      <w:pPr>
-        <w:spacing w:before="100" w:beforeAutospacing="1" w:after="100" w:afterAutospacing="1" w:line="240" w:lineRule="auto"/>
-        <w:outlineLvl w:val="0"/>
-        <w:rPr>
-          <w:rFonts w:eastAsia="Times New Roman" w:cstheme="majorHAnsi"/>
-          <w:b/>
-          <w:bCs/>
-          <w:color w:val="000000" w:themeColor="text1"/>
-          <w:kern w:val="36"/>
-          <w:lang w:val="fr-FR" w:eastAsia="fr-FR"/>
-        </w:rPr>
-      </w:pPr>
-      <w:r>
-        <w:rPr>
-          <w:rFonts w:eastAsia="Times New Roman" w:cstheme="majorHAnsi"/>
-          <w:b/>
-          <w:bCs/>
-          <w:color w:val="000000" w:themeColor="text1"/>
-          <w:kern w:val="36"/>
-          <w:lang w:val="fr-FR" w:eastAsia="fr-FR"/>
-        </w:rPr>
-        <w:t>Nouvelles fonctionnalités</w:t>
-      </w:r>
-    </w:p>
-    <w:p>
-      <w:pPr>
-        <w:pStyle w:val="Paragraphedeliste"/>
-        <w:numPr>
-          <w:ilvl w:val="0"/>
-          <w:numId w:val="21"/>
-        </w:numPr>
-        <w:spacing w:before="100" w:beforeAutospacing="1" w:after="100" w:afterAutospacing="1" w:line="240" w:lineRule="auto"/>
-        <w:outlineLvl w:val="0"/>
-        <w:rPr>
-          <w:rFonts w:eastAsia="Times New Roman" w:cstheme="majorHAnsi"/>
-          <w:color w:val="000000" w:themeColor="text1"/>
-          <w:kern w:val="36"/>
-          <w:lang w:val="fr-FR" w:eastAsia="fr-FR"/>
-        </w:rPr>
-      </w:pPr>
-      <w:r>
-        <w:rPr>
-          <w:rFonts w:eastAsia="Times New Roman" w:cstheme="majorHAnsi"/>
-          <w:color w:val="000000" w:themeColor="text1"/>
-          <w:kern w:val="36"/>
-          <w:lang w:val="fr-FR" w:eastAsia="fr-FR"/>
-        </w:rPr>
-        <w:t>Recherche publique d'un calcul par Calculation ID.</w:t>
-      </w:r>
-    </w:p>
-    <w:p>
-      <w:pPr>
-        <w:pStyle w:val="Paragraphedeliste"/>
-        <w:numPr>
-          <w:ilvl w:val="0"/>
-          <w:numId w:val="21"/>
-        </w:numPr>
-        <w:spacing w:before="100" w:beforeAutospacing="1" w:after="100" w:afterAutospacing="1" w:line="240" w:lineRule="auto"/>
-        <w:outlineLvl w:val="0"/>
-        <w:rPr>
-          <w:rFonts w:eastAsia="Times New Roman" w:cstheme="majorHAnsi"/>
-          <w:color w:val="000000" w:themeColor="text1"/>
-          <w:kern w:val="36"/>
-          <w:lang w:val="fr-FR" w:eastAsia="fr-FR"/>
-        </w:rPr>
-      </w:pPr>
-      <w:r>
-        <w:rPr>
-          <w:rFonts w:eastAsia="Times New Roman" w:cstheme="majorHAnsi"/>
-          <w:color w:val="000000" w:themeColor="text1"/>
-          <w:kern w:val="36"/>
-          <w:lang w:val="fr-FR" w:eastAsia="fr-FR"/>
-        </w:rPr>
-        <w:t>Rappel d'un calcul pour modification à partir de son Calculation ID.</w:t>
-      </w:r>
-    </w:p>
-    <w:p>
-      <w:pPr>
-        <w:pStyle w:val="Paragraphedeliste"/>
-        <w:numPr>
-          <w:ilvl w:val="0"/>
-          <w:numId w:val="21"/>
-        </w:numPr>
-        <w:spacing w:before="100" w:beforeAutospacing="1" w:after="100" w:afterAutospacing="1" w:line="240" w:lineRule="auto"/>
-        <w:outlineLvl w:val="0"/>
-        <w:rPr>
-          <w:rFonts w:eastAsia="Times New Roman" w:cstheme="majorHAnsi"/>
-          <w:color w:val="000000" w:themeColor="text1"/>
-          <w:kern w:val="36"/>
-          <w:lang w:val="fr-FR" w:eastAsia="fr-FR"/>
-        </w:rPr>
-      </w:pPr>
-      <w:r>
-        <w:rPr>
-          <w:rFonts w:eastAsia="Times New Roman" w:cstheme="majorHAnsi"/>
-          <w:color w:val="000000" w:themeColor="text1"/>
-          <w:kern w:val="36"/>
-          <w:lang w:val="fr-FR" w:eastAsia="fr-FR"/>
-        </w:rPr>
-        <w:t>Gestion du contexte de travail permettant la production automatique :</w:t>
-      </w:r>
-    </w:p>
-    <w:p>
-      <w:pPr>
-        <w:pStyle w:val="Paragraphedeliste"/>
-        <w:numPr>
-          <w:ilvl w:val="1"/>
-          <w:numId w:val="21"/>
-        </w:numPr>
-        <w:spacing w:before="100" w:beforeAutospacing="1" w:after="100" w:afterAutospacing="1" w:line="240" w:lineRule="auto"/>
-        <w:outlineLvl w:val="0"/>
-        <w:rPr>
-          <w:rFonts w:eastAsia="Times New Roman" w:cstheme="majorHAnsi"/>
-          <w:color w:val="000000" w:themeColor="text1"/>
-          <w:kern w:val="36"/>
-          <w:lang w:val="fr-FR" w:eastAsia="fr-FR"/>
-        </w:rPr>
-      </w:pPr>
-      <w:proofErr w:type="gramStart"/>
-      <w:r>
-        <w:rPr>
-          <w:rFonts w:eastAsia="Times New Roman" w:cstheme="majorHAnsi"/>
-          <w:color w:val="000000" w:themeColor="text1"/>
-          <w:kern w:val="36"/>
-          <w:lang w:val="fr-FR" w:eastAsia="fr-FR"/>
-        </w:rPr>
-        <w:t>d'un</w:t>
-      </w:r>
-      <w:proofErr w:type="gramEnd"/>
-      <w:r>
-        <w:rPr>
-          <w:rFonts w:eastAsia="Times New Roman" w:cstheme="majorHAnsi"/>
-          <w:color w:val="000000" w:themeColor="text1"/>
-          <w:kern w:val="36"/>
-          <w:lang w:val="fr-FR" w:eastAsia="fr-FR"/>
-        </w:rPr>
-        <w:t xml:space="preserve"> PDF anonymisé en consultation publique ;</w:t>
-      </w:r>
-    </w:p>
-    <w:p>
-      <w:pPr>
-        <w:pStyle w:val="Paragraphedeliste"/>
-        <w:numPr>
-          <w:ilvl w:val="1"/>
-          <w:numId w:val="21"/>
-        </w:numPr>
-        <w:spacing w:before="100" w:beforeAutospacing="1" w:after="100" w:afterAutospacing="1" w:line="240" w:lineRule="auto"/>
-        <w:outlineLvl w:val="0"/>
-        <w:rPr>
-          <w:rFonts w:eastAsia="Times New Roman" w:cstheme="majorHAnsi"/>
-          <w:color w:val="000000" w:themeColor="text1"/>
-          <w:kern w:val="36"/>
-          <w:lang w:val="fr-FR" w:eastAsia="fr-FR"/>
-        </w:rPr>
-      </w:pPr>
-      <w:proofErr w:type="gramStart"/>
-      <w:r>
-        <w:rPr>
-          <w:rFonts w:eastAsia="Times New Roman" w:cstheme="majorHAnsi"/>
-          <w:color w:val="000000" w:themeColor="text1"/>
-          <w:kern w:val="36"/>
-          <w:lang w:val="fr-FR" w:eastAsia="fr-FR"/>
-        </w:rPr>
-        <w:t>d'un</w:t>
-      </w:r>
-      <w:proofErr w:type="gramEnd"/>
-      <w:r>
-        <w:rPr>
-          <w:rFonts w:eastAsia="Times New Roman" w:cstheme="majorHAnsi"/>
-          <w:color w:val="000000" w:themeColor="text1"/>
-          <w:kern w:val="36"/>
-          <w:lang w:val="fr-FR" w:eastAsia="fr-FR"/>
-        </w:rPr>
-        <w:t xml:space="preserve"> PDF nominatif lors du rappel d'un calcul.</w:t>
-      </w:r>
-    </w:p>
-    <w:p>
-      <w:pPr>
-        <w:spacing w:before="100" w:beforeAutospacing="1" w:after="100" w:afterAutospacing="1" w:line="240" w:lineRule="auto"/>
-        <w:outlineLvl w:val="0"/>
-        <w:rPr>
-          <w:rFonts w:eastAsia="Times New Roman" w:cstheme="majorHAnsi"/>
-          <w:b/>
-          <w:bCs/>
-          <w:color w:val="000000" w:themeColor="text1"/>
-          <w:kern w:val="36"/>
-          <w:lang w:val="fr-FR" w:eastAsia="fr-FR"/>
-        </w:rPr>
-      </w:pPr>
-      <w:r>
-        <w:rPr>
-          <w:rFonts w:eastAsia="Times New Roman" w:cstheme="majorHAnsi"/>
-          <w:b/>
-          <w:bCs/>
-          <w:color w:val="000000" w:themeColor="text1"/>
-          <w:kern w:val="36"/>
-          <w:lang w:val="fr-FR" w:eastAsia="fr-FR"/>
-        </w:rPr>
-        <w:t>Sessions Flask</w:t>
-      </w:r>
-    </w:p>
-    <w:p>
-      <w:pPr>
-        <w:pStyle w:val="Paragraphedeliste"/>
-        <w:numPr>
-          <w:ilvl w:val="0"/>
-          <w:numId w:val="21"/>
-        </w:numPr>
-        <w:spacing w:before="100" w:beforeAutospacing="1" w:after="100" w:afterAutospacing="1" w:line="240" w:lineRule="auto"/>
-        <w:outlineLvl w:val="0"/>
-        <w:rPr>
-          <w:rFonts w:eastAsia="Times New Roman" w:cstheme="majorHAnsi"/>
-          <w:color w:val="000000" w:themeColor="text1"/>
-          <w:kern w:val="36"/>
-          <w:lang w:val="fr-FR" w:eastAsia="fr-FR"/>
-        </w:rPr>
-      </w:pPr>
-      <w:r>
-        <w:rPr>
-          <w:rFonts w:eastAsia="Times New Roman" w:cstheme="majorHAnsi"/>
-          <w:color w:val="000000" w:themeColor="text1"/>
-          <w:kern w:val="36"/>
-          <w:lang w:val="fr-FR" w:eastAsia="fr-FR"/>
-        </w:rPr>
-        <w:t>Stabilisation de la permutation entre le document courant et le document précédent.</w:t>
-      </w:r>
-    </w:p>
-    <w:p>
-      <w:pPr>
-        <w:pStyle w:val="Paragraphedeliste"/>
-        <w:numPr>
-          <w:ilvl w:val="0"/>
-          <w:numId w:val="21"/>
-        </w:numPr>
-        <w:spacing w:before="100" w:beforeAutospacing="1" w:after="100" w:afterAutospacing="1" w:line="240" w:lineRule="auto"/>
-        <w:outlineLvl w:val="0"/>
-        <w:rPr>
-          <w:rFonts w:eastAsia="Times New Roman" w:cstheme="majorHAnsi"/>
-          <w:color w:val="000000" w:themeColor="text1"/>
-          <w:kern w:val="36"/>
-          <w:lang w:val="fr-FR" w:eastAsia="fr-FR"/>
-        </w:rPr>
-      </w:pPr>
-      <w:r>
-        <w:rPr>
-          <w:rFonts w:eastAsia="Times New Roman" w:cstheme="majorHAnsi"/>
-          <w:color w:val="000000" w:themeColor="text1"/>
-          <w:kern w:val="36"/>
-          <w:lang w:val="fr-FR" w:eastAsia="fr-FR"/>
-        </w:rPr>
-        <w:t>Validation complète de la conservation et du rappel des documents de travail dans la session utilisateur.</w:t>
-      </w:r>
-    </w:p>
-    <w:p>
-      <w:pPr>
-        <w:spacing w:before="100" w:beforeAutospacing="1" w:after="100" w:afterAutospacing="1" w:line="240" w:lineRule="auto"/>
-        <w:outlineLvl w:val="0"/>
-        <w:rPr>
-          <w:rFonts w:eastAsia="Times New Roman" w:cstheme="majorHAnsi"/>
-          <w:b/>
-          <w:bCs/>
-          <w:color w:val="000000" w:themeColor="text1"/>
-          <w:kern w:val="36"/>
-          <w:lang w:val="fr-FR" w:eastAsia="fr-FR"/>
-        </w:rPr>
-      </w:pPr>
-      <w:r>
-        <w:rPr>
-          <w:rFonts w:eastAsia="Times New Roman" w:cstheme="majorHAnsi"/>
-          <w:b/>
-          <w:bCs/>
-          <w:color w:val="000000" w:themeColor="text1"/>
-          <w:kern w:val="36"/>
-          <w:lang w:val="fr-FR" w:eastAsia="fr-FR"/>
-        </w:rPr>
-        <w:t>Corrections</w:t>
-      </w:r>
-    </w:p>
-    <w:p>
-      <w:pPr>
-        <w:pStyle w:val="Paragraphedeliste"/>
-        <w:numPr>
-          <w:ilvl w:val="0"/>
-          <w:numId w:val="21"/>
-        </w:numPr>
-        <w:spacing w:before="100" w:beforeAutospacing="1" w:after="100" w:afterAutospacing="1" w:line="240" w:lineRule="auto"/>
-        <w:outlineLvl w:val="0"/>
-        <w:rPr>
-          <w:rFonts w:eastAsia="Times New Roman" w:cstheme="majorHAnsi"/>
-          <w:color w:val="000000" w:themeColor="text1"/>
-          <w:kern w:val="36"/>
-          <w:lang w:val="fr-FR" w:eastAsia="fr-FR"/>
-        </w:rPr>
-      </w:pPr>
-      <w:r>
-        <w:rPr>
-          <w:rFonts w:eastAsia="Times New Roman" w:cstheme="majorHAnsi"/>
-          <w:color w:val="000000" w:themeColor="text1"/>
-          <w:kern w:val="36"/>
-          <w:lang w:val="fr-FR" w:eastAsia="fr-FR"/>
-        </w:rPr>
-        <w:t>Correction de plusieurs cas limites liés au rappel des calculs.</w:t>
-      </w:r>
-    </w:p>
-    <w:p>
-      <w:pPr>
-        <w:pStyle w:val="Paragraphedeliste"/>
-        <w:numPr>
-          <w:ilvl w:val="0"/>
-          <w:numId w:val="21"/>
-        </w:numPr>
-        <w:spacing w:before="100" w:beforeAutospacing="1" w:after="100" w:afterAutospacing="1" w:line="240" w:lineRule="auto"/>
-        <w:outlineLvl w:val="0"/>
-        <w:rPr>
-          <w:rFonts w:eastAsia="Times New Roman" w:cstheme="majorHAnsi"/>
-          <w:color w:val="000000" w:themeColor="text1"/>
-          <w:kern w:val="36"/>
-          <w:lang w:val="fr-FR" w:eastAsia="fr-FR"/>
-        </w:rPr>
-      </w:pPr>
-      <w:r>
-        <w:rPr>
-          <w:rFonts w:eastAsia="Times New Roman" w:cstheme="majorHAnsi"/>
-          <w:color w:val="000000" w:themeColor="text1"/>
-          <w:kern w:val="36"/>
-          <w:lang w:val="fr-FR" w:eastAsia="fr-FR"/>
-        </w:rPr>
-        <w:t>Gestion des Calculation ID inexistants avec message utilisateur explicite.</w:t>
-      </w:r>
-    </w:p>
-    <w:p>
-      <w:pPr>
-        <w:pStyle w:val="Paragraphedeliste"/>
-        <w:numPr>
-          <w:ilvl w:val="0"/>
-          <w:numId w:val="21"/>
-        </w:numPr>
-        <w:spacing w:before="100" w:beforeAutospacing="1" w:after="100" w:afterAutospacing="1" w:line="240" w:lineRule="auto"/>
-        <w:outlineLvl w:val="0"/>
-        <w:rPr>
-          <w:rFonts w:eastAsia="Times New Roman" w:cstheme="majorHAnsi"/>
-          <w:color w:val="000000" w:themeColor="text1"/>
-          <w:kern w:val="36"/>
-          <w:lang w:val="fr-FR" w:eastAsia="fr-FR"/>
-        </w:rPr>
-      </w:pPr>
-      <w:r>
-        <w:rPr>
-          <w:rFonts w:eastAsia="Times New Roman" w:cstheme="majorHAnsi"/>
-          <w:color w:val="000000" w:themeColor="text1"/>
-          <w:kern w:val="36"/>
-          <w:lang w:val="fr-FR" w:eastAsia="fr-FR"/>
-        </w:rPr>
-        <w:t>Renforcement de la robustesse des traitements en mode lecture seule.</w:t>
-      </w:r>
-    </w:p>
-    <w:p>
-      <w:pPr>
-        <w:pStyle w:val="Paragraphedeliste"/>
-        <w:numPr>
-          <w:ilvl w:val="0"/>
-          <w:numId w:val="21"/>
-        </w:numPr>
-        <w:spacing w:before="100" w:beforeAutospacing="1" w:after="100" w:afterAutospacing="1" w:line="240" w:lineRule="auto"/>
-        <w:outlineLvl w:val="0"/>
-        <w:rPr>
-          <w:rFonts w:eastAsia="Times New Roman" w:cstheme="majorHAnsi"/>
-          <w:color w:val="000000" w:themeColor="text1"/>
-          <w:kern w:val="36"/>
-          <w:lang w:val="fr-FR" w:eastAsia="fr-FR"/>
-        </w:rPr>
-      </w:pPr>
-      <w:r>
-        <w:rPr>
-          <w:rFonts w:eastAsia="Times New Roman" w:cstheme="majorHAnsi"/>
-          <w:color w:val="000000" w:themeColor="text1"/>
-          <w:kern w:val="36"/>
-          <w:lang w:val="fr-FR" w:eastAsia="fr-FR"/>
-        </w:rPr>
-        <w:t>Diverses corrections mineures d'interface et de workflow.</w:t>
-      </w:r>
-    </w:p>
-    <w:p>
-      <w:pPr>
-        <w:spacing w:before="100" w:beforeAutospacing="1" w:after="100" w:afterAutospacing="1" w:line="240" w:lineRule="auto"/>
-        <w:outlineLvl w:val="0"/>
-        <w:rPr>
-          <w:rFonts w:eastAsia="Times New Roman" w:cstheme="majorHAnsi"/>
-          <w:b/>
-          <w:bCs/>
-          <w:color w:val="000000" w:themeColor="text1"/>
-          <w:kern w:val="36"/>
-          <w:lang w:val="fr-FR" w:eastAsia="fr-FR"/>
-        </w:rPr>
-      </w:pPr>
-      <w:r>
-        <w:rPr>
-          <w:rFonts w:eastAsia="Times New Roman" w:cstheme="majorHAnsi"/>
-          <w:b/>
-          <w:bCs/>
-          <w:color w:val="000000" w:themeColor="text1"/>
-          <w:kern w:val="36"/>
-          <w:lang w:val="fr-FR" w:eastAsia="fr-FR"/>
-        </w:rPr>
-        <w:t>Validation</w:t>
-      </w:r>
-    </w:p>
-    <w:p>
-      <w:pPr>
-        <w:pStyle w:val="Paragraphedeliste"/>
-        <w:numPr>
-          <w:ilvl w:val="0"/>
-          <w:numId w:val="21"/>
-        </w:numPr>
-        <w:spacing w:before="100" w:beforeAutospacing="1" w:after="100" w:afterAutospacing="1" w:line="240" w:lineRule="auto"/>
-        <w:outlineLvl w:val="0"/>
-        <w:rPr>
-          <w:rFonts w:eastAsia="Times New Roman" w:cstheme="majorHAnsi"/>
-          <w:color w:val="000000" w:themeColor="text1"/>
-          <w:kern w:val="36"/>
-          <w:lang w:val="fr-FR" w:eastAsia="fr-FR"/>
-        </w:rPr>
-      </w:pPr>
-      <w:r>
-        <w:rPr>
-          <w:rFonts w:eastAsia="Times New Roman" w:cstheme="majorHAnsi"/>
-          <w:color w:val="000000" w:themeColor="text1"/>
-          <w:kern w:val="36"/>
-          <w:lang w:val="fr-FR" w:eastAsia="fr-FR"/>
-        </w:rPr>
-        <w:t>Validation complète sous Windows.</w:t>
-      </w:r>
-    </w:p>
-    <w:p>
-      <w:pPr>
-        <w:pStyle w:val="Paragraphedeliste"/>
-        <w:numPr>
-          <w:ilvl w:val="0"/>
-          <w:numId w:val="21"/>
-        </w:numPr>
-        <w:spacing w:before="100" w:beforeAutospacing="1" w:after="100" w:afterAutospacing="1" w:line="240" w:lineRule="auto"/>
-        <w:outlineLvl w:val="0"/>
-        <w:rPr>
-          <w:rFonts w:eastAsia="Times New Roman" w:cstheme="majorHAnsi"/>
-          <w:color w:val="000000" w:themeColor="text1"/>
-          <w:kern w:val="36"/>
-          <w:lang w:val="fr-FR" w:eastAsia="fr-FR"/>
-        </w:rPr>
-      </w:pPr>
-      <w:r>
-        <w:rPr>
-          <w:rFonts w:eastAsia="Times New Roman" w:cstheme="majorHAnsi"/>
-          <w:color w:val="000000" w:themeColor="text1"/>
-          <w:kern w:val="36"/>
-          <w:lang w:val="fr-FR" w:eastAsia="fr-FR"/>
-        </w:rPr>
-        <w:t>Validation complète sous Ubuntu Linux (</w:t>
-      </w:r>
-      <w:proofErr w:type="spellStart"/>
-      <w:r>
-        <w:rPr>
-          <w:rFonts w:eastAsia="Times New Roman" w:cstheme="majorHAnsi"/>
-          <w:color w:val="000000" w:themeColor="text1"/>
-          <w:kern w:val="36"/>
-          <w:lang w:val="fr-FR" w:eastAsia="fr-FR"/>
-        </w:rPr>
-        <w:t>Gunicorn</w:t>
-      </w:r>
-      <w:proofErr w:type="spellEnd"/>
-      <w:r>
-        <w:rPr>
-          <w:rFonts w:eastAsia="Times New Roman" w:cstheme="majorHAnsi"/>
-          <w:color w:val="000000" w:themeColor="text1"/>
-          <w:kern w:val="36"/>
-          <w:lang w:val="fr-FR" w:eastAsia="fr-FR"/>
-        </w:rPr>
-        <w:t xml:space="preserve"> + </w:t>
-      </w:r>
-      <w:proofErr w:type="spellStart"/>
-      <w:r>
-        <w:rPr>
-          <w:rFonts w:eastAsia="Times New Roman" w:cstheme="majorHAnsi"/>
-          <w:color w:val="000000" w:themeColor="text1"/>
-          <w:kern w:val="36"/>
-          <w:lang w:val="fr-FR" w:eastAsia="fr-FR"/>
-        </w:rPr>
-        <w:t>nginx</w:t>
-      </w:r>
-      <w:proofErr w:type="spellEnd"/>
-      <w:r>
-        <w:rPr>
-          <w:rFonts w:eastAsia="Times New Roman" w:cstheme="majorHAnsi"/>
-          <w:color w:val="000000" w:themeColor="text1"/>
-          <w:kern w:val="36"/>
-          <w:lang w:val="fr-FR" w:eastAsia="fr-FR"/>
-        </w:rPr>
-        <w:t>).</w:t>
-      </w:r>
-    </w:p>
-    <w:p>
-      <w:pPr>
-        <w:pStyle w:val="Paragraphedeliste"/>
-        <w:numPr>
-          <w:ilvl w:val="0"/>
-          <w:numId w:val="21"/>
-        </w:numPr>
-        <w:spacing w:before="100" w:beforeAutospacing="1" w:after="100" w:afterAutospacing="1" w:line="240" w:lineRule="auto"/>
-        <w:outlineLvl w:val="0"/>
-        <w:rPr>
-          <w:rFonts w:eastAsia="Times New Roman" w:cstheme="majorHAnsi"/>
-          <w:color w:val="000000" w:themeColor="text1"/>
-          <w:kern w:val="36"/>
-          <w:lang w:val="fr-FR" w:eastAsia="fr-FR"/>
-        </w:rPr>
-      </w:pPr>
-      <w:r>
-        <w:rPr>
-          <w:rFonts w:eastAsia="Times New Roman" w:cstheme="majorHAnsi"/>
-          <w:color w:val="000000" w:themeColor="text1"/>
-          <w:kern w:val="36"/>
-          <w:lang w:val="fr-FR" w:eastAsia="fr-FR"/>
-        </w:rPr>
-        <w:t>Validation des workflows de calcul, recherche publique, rappel, génération PDF et gestion des sessions.</w:t>
+        <w:t>Version 1.22 – 26/07/2026</w:t>
       </w:r>
     </w:p>
     <w:p>
@@ -692,11 +63,10 @@
           <w:rFonts w:asciiTheme="majorHAnsi" w:eastAsia="Times New Roman" w:hAnsiTheme="majorHAnsi" w:cstheme="majorHAnsi"/>
           <w:b/>
           <w:bCs/>
-          <w:color w:val="365F91" w:themeColor="accent1" w:themeShade="BF"/>
           <w:kern w:val="36"/>
           <w:sz w:val="28"/>
           <w:szCs w:val="28"/>
-          <w:lang w:eastAsia="fr-FR"/>
+          <w:lang w:val="fr-FR" w:eastAsia="fr-FR"/>
         </w:rPr>
       </w:pPr>
       <w:r>
@@ -704,97 +74,20 @@
           <w:rFonts w:asciiTheme="majorHAnsi" w:eastAsia="Times New Roman" w:hAnsiTheme="majorHAnsi" w:cstheme="majorHAnsi"/>
           <w:b/>
           <w:bCs/>
-          <w:color w:val="365F91" w:themeColor="accent1" w:themeShade="BF"/>
           <w:kern w:val="36"/>
           <w:sz w:val="28"/>
           <w:szCs w:val="28"/>
-          <w:lang w:eastAsia="fr-FR"/>
-        </w:rPr>
-        <w:t xml:space="preserve">Version </w:t>
-      </w:r>
-      <w:r>
-        <w:rPr>
-          <w:rFonts w:asciiTheme="majorHAnsi" w:eastAsia="Times New Roman" w:hAnsiTheme="majorHAnsi" w:cstheme="majorHAnsi"/>
-          <w:b/>
-          <w:bCs/>
-          <w:color w:val="365F91" w:themeColor="accent1" w:themeShade="BF"/>
-          <w:kern w:val="36"/>
-          <w:sz w:val="28"/>
-          <w:szCs w:val="28"/>
-          <w:lang w:eastAsia="fr-FR"/>
-        </w:rPr>
-        <w:t>1.2</w:t>
-      </w:r>
-      <w:r>
-        <w:rPr>
-          <w:rFonts w:asciiTheme="majorHAnsi" w:eastAsia="Times New Roman" w:hAnsiTheme="majorHAnsi" w:cstheme="majorHAnsi"/>
-          <w:b/>
-          <w:bCs/>
-          <w:color w:val="365F91" w:themeColor="accent1" w:themeShade="BF"/>
-          <w:kern w:val="36"/>
-          <w:sz w:val="28"/>
-          <w:szCs w:val="28"/>
-          <w:lang w:eastAsia="fr-FR"/>
-        </w:rPr>
-        <w:t xml:space="preserve"> – </w:t>
-      </w:r>
-      <w:proofErr w:type="spellStart"/>
-      <w:r>
-        <w:rPr>
-          <w:rFonts w:asciiTheme="majorHAnsi" w:eastAsia="Times New Roman" w:hAnsiTheme="majorHAnsi" w:cstheme="majorHAnsi"/>
-          <w:b/>
-          <w:bCs/>
-          <w:color w:val="365F91" w:themeColor="accent1" w:themeShade="BF"/>
-          <w:kern w:val="36"/>
-          <w:sz w:val="28"/>
-          <w:szCs w:val="28"/>
-          <w:lang w:eastAsia="fr-FR"/>
-        </w:rPr>
-        <w:t>jui</w:t>
-      </w:r>
-      <w:r>
-        <w:rPr>
-          <w:rFonts w:asciiTheme="majorHAnsi" w:eastAsia="Times New Roman" w:hAnsiTheme="majorHAnsi" w:cstheme="majorHAnsi"/>
-          <w:b/>
-          <w:bCs/>
-          <w:color w:val="365F91" w:themeColor="accent1" w:themeShade="BF"/>
-          <w:kern w:val="36"/>
-          <w:sz w:val="28"/>
-          <w:szCs w:val="28"/>
-          <w:lang w:eastAsia="fr-FR"/>
-        </w:rPr>
-        <w:t>let</w:t>
-      </w:r>
-      <w:proofErr w:type="spellEnd"/>
-      <w:r>
-        <w:rPr>
-          <w:rFonts w:asciiTheme="majorHAnsi" w:eastAsia="Times New Roman" w:hAnsiTheme="majorHAnsi" w:cstheme="majorHAnsi"/>
-          <w:b/>
-          <w:bCs/>
-          <w:color w:val="365F91" w:themeColor="accent1" w:themeShade="BF"/>
-          <w:kern w:val="36"/>
-          <w:sz w:val="28"/>
-          <w:szCs w:val="28"/>
-          <w:lang w:eastAsia="fr-FR"/>
-        </w:rPr>
-        <w:t xml:space="preserve"> 2026</w:t>
-      </w:r>
-      <w:r>
-        <w:rPr>
-          <w:rFonts w:asciiTheme="majorHAnsi" w:eastAsia="Times New Roman" w:hAnsiTheme="majorHAnsi" w:cstheme="majorHAnsi"/>
-          <w:b/>
-          <w:bCs/>
-          <w:color w:val="365F91" w:themeColor="accent1" w:themeShade="BF"/>
-          <w:kern w:val="36"/>
-          <w:sz w:val="28"/>
-          <w:szCs w:val="28"/>
-          <w:lang w:eastAsia="fr-FR"/>
-        </w:rPr>
-        <w:t xml:space="preserve"> </w:t>
-      </w:r>
-    </w:p>
-    <w:p>
-      <w:pPr>
+          <w:lang w:val="fr-FR" w:eastAsia="fr-FR"/>
+        </w:rPr>
+        <w:t>Gestion des workflows Web et JSON</w:t>
+      </w:r>
+    </w:p>
+    <w:p>
+      <w:pPr>
+        <w:numPr>
+          <w:ilvl w:val="0"/>
+          <w:numId w:val="26"/>
+        </w:numPr>
         <w:spacing w:before="100" w:beforeAutospacing="1" w:after="100" w:afterAutospacing="1" w:line="240" w:lineRule="auto"/>
         <w:outlineLvl w:val="0"/>
         <w:rPr>
@@ -813,11 +106,15 @@
           <w:kern w:val="36"/>
           <w:lang w:val="fr-FR" w:eastAsia="fr-FR"/>
         </w:rPr>
-        <w:t>Création du modèle métier (services/document.py).</w:t>
-      </w:r>
-    </w:p>
-    <w:p>
-      <w:pPr>
+        <w:t xml:space="preserve">Refonte de la gestion des documents de travail et de la session. </w:t>
+      </w:r>
+    </w:p>
+    <w:p>
+      <w:pPr>
+        <w:numPr>
+          <w:ilvl w:val="0"/>
+          <w:numId w:val="26"/>
+        </w:numPr>
         <w:spacing w:before="100" w:beforeAutospacing="1" w:after="100" w:afterAutospacing="1" w:line="240" w:lineRule="auto"/>
         <w:outlineLvl w:val="0"/>
         <w:rPr>
@@ -825,11 +122,642 @@
           <w:b/>
           <w:bCs/>
           <w:kern w:val="36"/>
-          <w:sz w:val="24"/>
-          <w:szCs w:val="24"/>
           <w:lang w:val="fr-FR" w:eastAsia="fr-FR"/>
         </w:rPr>
       </w:pPr>
+      <w:r>
+        <w:rPr>
+          <w:rFonts w:eastAsia="Times New Roman" w:cstheme="majorHAnsi"/>
+          <w:b/>
+          <w:bCs/>
+          <w:kern w:val="36"/>
+          <w:lang w:val="fr-FR" w:eastAsia="fr-FR"/>
+        </w:rPr>
+        <w:t xml:space="preserve">Séparation complète entre les workflows Web et JSON. </w:t>
+      </w:r>
+    </w:p>
+    <w:p>
+      <w:pPr>
+        <w:numPr>
+          <w:ilvl w:val="0"/>
+          <w:numId w:val="26"/>
+        </w:numPr>
+        <w:spacing w:before="100" w:beforeAutospacing="1" w:after="100" w:afterAutospacing="1" w:line="240" w:lineRule="auto"/>
+        <w:outlineLvl w:val="0"/>
+        <w:rPr>
+          <w:rFonts w:eastAsia="Times New Roman" w:cstheme="majorHAnsi"/>
+          <w:b/>
+          <w:bCs/>
+          <w:kern w:val="36"/>
+          <w:lang w:val="fr-FR" w:eastAsia="fr-FR"/>
+        </w:rPr>
+      </w:pPr>
+      <w:r>
+        <w:rPr>
+          <w:rFonts w:eastAsia="Times New Roman" w:cstheme="majorHAnsi"/>
+          <w:b/>
+          <w:bCs/>
+          <w:kern w:val="36"/>
+          <w:lang w:val="fr-FR" w:eastAsia="fr-FR"/>
+        </w:rPr>
+        <w:t xml:space="preserve">Le document affiché est désormais indépendant de l'historique des calculs Web. </w:t>
+      </w:r>
+    </w:p>
+    <w:p>
+      <w:pPr>
+        <w:numPr>
+          <w:ilvl w:val="0"/>
+          <w:numId w:val="26"/>
+        </w:numPr>
+        <w:spacing w:before="100" w:beforeAutospacing="1" w:after="100" w:afterAutospacing="1" w:line="240" w:lineRule="auto"/>
+        <w:outlineLvl w:val="0"/>
+        <w:rPr>
+          <w:rFonts w:eastAsia="Times New Roman" w:cstheme="majorHAnsi"/>
+          <w:b/>
+          <w:bCs/>
+          <w:kern w:val="36"/>
+          <w:lang w:val="fr-FR" w:eastAsia="fr-FR"/>
+        </w:rPr>
+      </w:pPr>
+      <w:r>
+        <w:rPr>
+          <w:rFonts w:eastAsia="Times New Roman" w:cstheme="majorHAnsi"/>
+          <w:b/>
+          <w:bCs/>
+          <w:kern w:val="36"/>
+          <w:lang w:val="fr-FR" w:eastAsia="fr-FR"/>
+        </w:rPr>
+        <w:t xml:space="preserve">Les calculs Web alimentent un historique de deux calculs permettant la fonction Échanger. </w:t>
+      </w:r>
+    </w:p>
+    <w:p>
+      <w:pPr>
+        <w:numPr>
+          <w:ilvl w:val="0"/>
+          <w:numId w:val="26"/>
+        </w:numPr>
+        <w:spacing w:before="100" w:beforeAutospacing="1" w:after="100" w:afterAutospacing="1" w:line="240" w:lineRule="auto"/>
+        <w:outlineLvl w:val="0"/>
+        <w:rPr>
+          <w:rFonts w:eastAsia="Times New Roman" w:cstheme="majorHAnsi"/>
+          <w:b/>
+          <w:bCs/>
+          <w:kern w:val="36"/>
+          <w:lang w:val="fr-FR" w:eastAsia="fr-FR"/>
+        </w:rPr>
+      </w:pPr>
+      <w:r>
+        <w:rPr>
+          <w:rFonts w:eastAsia="Times New Roman" w:cstheme="majorHAnsi"/>
+          <w:b/>
+          <w:bCs/>
+          <w:kern w:val="36"/>
+          <w:lang w:val="fr-FR" w:eastAsia="fr-FR"/>
+        </w:rPr>
+        <w:t xml:space="preserve">Les calculs JSON (import, rappel par </w:t>
+      </w:r>
+      <w:r>
+        <w:rPr>
+          <w:rFonts w:eastAsia="Times New Roman" w:cstheme="majorHAnsi"/>
+          <w:b/>
+          <w:bCs/>
+          <w:i/>
+          <w:iCs/>
+          <w:kern w:val="36"/>
+          <w:lang w:val="fr-FR" w:eastAsia="fr-FR"/>
+        </w:rPr>
+        <w:t>Calculation Key</w:t>
+      </w:r>
+      <w:r>
+        <w:rPr>
+          <w:rFonts w:eastAsia="Times New Roman" w:cstheme="majorHAnsi"/>
+          <w:b/>
+          <w:bCs/>
+          <w:kern w:val="36"/>
+          <w:lang w:val="fr-FR" w:eastAsia="fr-FR"/>
+        </w:rPr>
+        <w:t xml:space="preserve"> ou recherche) n'altèrent plus cet historique. </w:t>
+      </w:r>
+    </w:p>
+    <w:p>
+      <w:pPr>
+        <w:numPr>
+          <w:ilvl w:val="0"/>
+          <w:numId w:val="26"/>
+        </w:numPr>
+        <w:spacing w:before="100" w:beforeAutospacing="1" w:after="100" w:afterAutospacing="1" w:line="240" w:lineRule="auto"/>
+        <w:outlineLvl w:val="0"/>
+        <w:rPr>
+          <w:rFonts w:eastAsia="Times New Roman" w:cstheme="majorHAnsi"/>
+          <w:b/>
+          <w:bCs/>
+          <w:kern w:val="36"/>
+          <w:lang w:val="fr-FR" w:eastAsia="fr-FR"/>
+        </w:rPr>
+      </w:pPr>
+      <w:r>
+        <w:rPr>
+          <w:rFonts w:eastAsia="Times New Roman" w:cstheme="majorHAnsi"/>
+          <w:b/>
+          <w:bCs/>
+          <w:kern w:val="36"/>
+          <w:lang w:val="fr-FR" w:eastAsia="fr-FR"/>
+        </w:rPr>
+        <w:t xml:space="preserve">La fonction Effacer réinitialise uniquement le document de travail, sans supprimer l'historique des calculs Web. </w:t>
+      </w:r>
+    </w:p>
+    <w:p>
+      <w:pPr>
+        <w:spacing w:before="100" w:beforeAutospacing="1" w:after="100" w:afterAutospacing="1" w:line="240" w:lineRule="auto"/>
+        <w:outlineLvl w:val="0"/>
+        <w:rPr>
+          <w:rFonts w:asciiTheme="majorHAnsi" w:eastAsia="Times New Roman" w:hAnsiTheme="majorHAnsi" w:cstheme="majorHAnsi"/>
+          <w:b/>
+          <w:bCs/>
+          <w:kern w:val="36"/>
+          <w:sz w:val="28"/>
+          <w:szCs w:val="28"/>
+          <w:lang w:val="fr-FR" w:eastAsia="fr-FR"/>
+        </w:rPr>
+      </w:pPr>
+      <w:r>
+        <w:rPr>
+          <w:rFonts w:asciiTheme="majorHAnsi" w:eastAsia="Times New Roman" w:hAnsiTheme="majorHAnsi" w:cstheme="majorHAnsi"/>
+          <w:b/>
+          <w:bCs/>
+          <w:kern w:val="36"/>
+          <w:sz w:val="28"/>
+          <w:szCs w:val="28"/>
+          <w:lang w:val="fr-FR" w:eastAsia="fr-FR"/>
+        </w:rPr>
+        <w:t>Architecture</w:t>
+      </w:r>
+    </w:p>
+    <w:p>
+      <w:pPr>
+        <w:numPr>
+          <w:ilvl w:val="0"/>
+          <w:numId w:val="27"/>
+        </w:numPr>
+        <w:spacing w:before="100" w:beforeAutospacing="1" w:after="100" w:afterAutospacing="1" w:line="240" w:lineRule="auto"/>
+        <w:outlineLvl w:val="0"/>
+        <w:rPr>
+          <w:rFonts w:eastAsia="Times New Roman" w:cstheme="majorHAnsi"/>
+          <w:b/>
+          <w:bCs/>
+          <w:kern w:val="36"/>
+          <w:lang w:val="fr-FR" w:eastAsia="fr-FR"/>
+        </w:rPr>
+      </w:pPr>
+      <w:r>
+        <w:rPr>
+          <w:rFonts w:eastAsia="Times New Roman" w:cstheme="majorHAnsi"/>
+          <w:b/>
+          <w:bCs/>
+          <w:kern w:val="36"/>
+          <w:lang w:val="fr-FR" w:eastAsia="fr-FR"/>
+        </w:rPr>
+        <w:t xml:space="preserve">Clarification des responsabilités entre : </w:t>
+      </w:r>
+    </w:p>
+    <w:p>
+      <w:pPr>
+        <w:numPr>
+          <w:ilvl w:val="1"/>
+          <w:numId w:val="27"/>
+        </w:numPr>
+        <w:spacing w:before="100" w:beforeAutospacing="1" w:after="100" w:afterAutospacing="1" w:line="240" w:lineRule="auto"/>
+        <w:outlineLvl w:val="0"/>
+        <w:rPr>
+          <w:rFonts w:eastAsia="Times New Roman" w:cstheme="majorHAnsi"/>
+          <w:b/>
+          <w:bCs/>
+          <w:kern w:val="36"/>
+          <w:lang w:val="fr-FR" w:eastAsia="fr-FR"/>
+        </w:rPr>
+      </w:pPr>
+      <w:r>
+        <w:rPr>
+          <w:rFonts w:eastAsia="Times New Roman" w:cstheme="majorHAnsi"/>
+          <w:b/>
+          <w:bCs/>
+          <w:kern w:val="36"/>
+          <w:lang w:val="fr-FR" w:eastAsia="fr-FR"/>
+        </w:rPr>
+        <w:t xml:space="preserve">WORK_DOCUMENT : document actuellement affiché ; </w:t>
+      </w:r>
+    </w:p>
+    <w:p>
+      <w:pPr>
+        <w:numPr>
+          <w:ilvl w:val="1"/>
+          <w:numId w:val="27"/>
+        </w:numPr>
+        <w:spacing w:before="100" w:beforeAutospacing="1" w:after="100" w:afterAutospacing="1" w:line="240" w:lineRule="auto"/>
+        <w:outlineLvl w:val="0"/>
+        <w:rPr>
+          <w:rFonts w:eastAsia="Times New Roman" w:cstheme="majorHAnsi"/>
+          <w:b/>
+          <w:bCs/>
+          <w:kern w:val="36"/>
+          <w:lang w:val="fr-FR" w:eastAsia="fr-FR"/>
+        </w:rPr>
+      </w:pPr>
+      <w:r>
+        <w:rPr>
+          <w:rFonts w:eastAsia="Times New Roman" w:cstheme="majorHAnsi"/>
+          <w:b/>
+          <w:bCs/>
+          <w:kern w:val="36"/>
+          <w:lang w:val="fr-FR" w:eastAsia="fr-FR"/>
+        </w:rPr>
+        <w:t xml:space="preserve">CURRENT_CALCULATION : dernier calcul Web ; </w:t>
+      </w:r>
+    </w:p>
+    <w:p>
+      <w:pPr>
+        <w:numPr>
+          <w:ilvl w:val="1"/>
+          <w:numId w:val="27"/>
+        </w:numPr>
+        <w:spacing w:before="100" w:beforeAutospacing="1" w:after="100" w:afterAutospacing="1" w:line="240" w:lineRule="auto"/>
+        <w:outlineLvl w:val="0"/>
+        <w:rPr>
+          <w:rFonts w:eastAsia="Times New Roman" w:cstheme="majorHAnsi"/>
+          <w:b/>
+          <w:bCs/>
+          <w:kern w:val="36"/>
+          <w:lang w:val="fr-FR" w:eastAsia="fr-FR"/>
+        </w:rPr>
+      </w:pPr>
+      <w:r>
+        <w:rPr>
+          <w:rFonts w:eastAsia="Times New Roman" w:cstheme="majorHAnsi"/>
+          <w:b/>
+          <w:bCs/>
+          <w:kern w:val="36"/>
+          <w:lang w:val="fr-FR" w:eastAsia="fr-FR"/>
+        </w:rPr>
+        <w:t xml:space="preserve">PREVIOUS_CALCULATION : calcul Web précédent ; </w:t>
+      </w:r>
+    </w:p>
+    <w:p>
+      <w:pPr>
+        <w:numPr>
+          <w:ilvl w:val="1"/>
+          <w:numId w:val="27"/>
+        </w:numPr>
+        <w:spacing w:before="100" w:beforeAutospacing="1" w:after="100" w:afterAutospacing="1" w:line="240" w:lineRule="auto"/>
+        <w:outlineLvl w:val="0"/>
+        <w:rPr>
+          <w:rFonts w:eastAsia="Times New Roman" w:cstheme="majorHAnsi"/>
+          <w:b/>
+          <w:bCs/>
+          <w:kern w:val="36"/>
+          <w:lang w:val="fr-FR" w:eastAsia="fr-FR"/>
+        </w:rPr>
+      </w:pPr>
+      <w:r>
+        <w:rPr>
+          <w:rFonts w:eastAsia="Times New Roman" w:cstheme="majorHAnsi"/>
+          <w:b/>
+          <w:bCs/>
+          <w:kern w:val="36"/>
+          <w:lang w:val="fr-FR" w:eastAsia="fr-FR"/>
+        </w:rPr>
+        <w:t>Persistance</w:t>
+      </w:r>
+      <w:r>
+        <w:rPr>
+          <w:rFonts w:eastAsia="Times New Roman" w:cstheme="majorHAnsi"/>
+          <w:b/>
+          <w:bCs/>
+          <w:kern w:val="36"/>
+          <w:lang w:val="fr-FR" w:eastAsia="fr-FR"/>
+        </w:rPr>
+        <w:t xml:space="preserve"> JSON : stockage permanent des calculs enregistrés. </w:t>
+      </w:r>
+    </w:p>
+    <w:p>
+      <w:pPr>
+        <w:numPr>
+          <w:ilvl w:val="0"/>
+          <w:numId w:val="27"/>
+        </w:numPr>
+        <w:spacing w:before="100" w:beforeAutospacing="1" w:after="100" w:afterAutospacing="1" w:line="240" w:lineRule="auto"/>
+        <w:outlineLvl w:val="0"/>
+        <w:rPr>
+          <w:rFonts w:eastAsia="Times New Roman" w:cstheme="majorHAnsi"/>
+          <w:b/>
+          <w:bCs/>
+          <w:kern w:val="36"/>
+          <w:lang w:val="fr-FR" w:eastAsia="fr-FR"/>
+        </w:rPr>
+      </w:pPr>
+      <w:r>
+        <w:rPr>
+          <w:rFonts w:eastAsia="Times New Roman" w:cstheme="majorHAnsi"/>
+          <w:b/>
+          <w:bCs/>
+          <w:kern w:val="36"/>
+          <w:lang w:val="fr-FR" w:eastAsia="fr-FR"/>
+        </w:rPr>
+        <w:t xml:space="preserve">Simplification de la gestion de la session. </w:t>
+      </w:r>
+    </w:p>
+    <w:p>
+      <w:pPr>
+        <w:numPr>
+          <w:ilvl w:val="0"/>
+          <w:numId w:val="27"/>
+        </w:numPr>
+        <w:spacing w:before="100" w:beforeAutospacing="1" w:after="100" w:afterAutospacing="1" w:line="240" w:lineRule="auto"/>
+        <w:outlineLvl w:val="0"/>
+        <w:rPr>
+          <w:rFonts w:eastAsia="Times New Roman" w:cstheme="majorHAnsi"/>
+          <w:b/>
+          <w:bCs/>
+          <w:kern w:val="36"/>
+          <w:lang w:val="fr-FR" w:eastAsia="fr-FR"/>
+        </w:rPr>
+      </w:pPr>
+      <w:r>
+        <w:rPr>
+          <w:rFonts w:eastAsia="Times New Roman" w:cstheme="majorHAnsi"/>
+          <w:b/>
+          <w:bCs/>
+          <w:kern w:val="36"/>
+          <w:lang w:val="fr-FR" w:eastAsia="fr-FR"/>
+        </w:rPr>
+        <w:t xml:space="preserve">Suppression du code et des traces de débogage. </w:t>
+      </w:r>
+    </w:p>
+    <w:p>
+      <w:pPr>
+        <w:spacing w:before="100" w:beforeAutospacing="1" w:after="100" w:afterAutospacing="1" w:line="240" w:lineRule="auto"/>
+        <w:outlineLvl w:val="0"/>
+        <w:rPr>
+          <w:rFonts w:asciiTheme="majorHAnsi" w:eastAsia="Times New Roman" w:hAnsiTheme="majorHAnsi" w:cstheme="majorHAnsi"/>
+          <w:b/>
+          <w:bCs/>
+          <w:kern w:val="36"/>
+          <w:sz w:val="28"/>
+          <w:szCs w:val="28"/>
+          <w:lang w:val="fr-FR" w:eastAsia="fr-FR"/>
+        </w:rPr>
+      </w:pPr>
+      <w:r>
+        <w:rPr>
+          <w:rFonts w:asciiTheme="majorHAnsi" w:eastAsia="Times New Roman" w:hAnsiTheme="majorHAnsi" w:cstheme="majorHAnsi"/>
+          <w:b/>
+          <w:bCs/>
+          <w:kern w:val="36"/>
+          <w:sz w:val="28"/>
+          <w:szCs w:val="28"/>
+          <w:lang w:val="fr-FR" w:eastAsia="fr-FR"/>
+        </w:rPr>
+        <w:t>Validation</w:t>
+      </w:r>
+    </w:p>
+    <w:p>
+      <w:pPr>
+        <w:spacing w:before="100" w:beforeAutospacing="1" w:after="100" w:afterAutospacing="1" w:line="240" w:lineRule="auto"/>
+        <w:outlineLvl w:val="0"/>
+        <w:rPr>
+          <w:rFonts w:eastAsia="Times New Roman" w:cstheme="majorHAnsi"/>
+          <w:b/>
+          <w:bCs/>
+          <w:kern w:val="36"/>
+          <w:lang w:val="fr-FR" w:eastAsia="fr-FR"/>
+        </w:rPr>
+      </w:pPr>
+      <w:r>
+        <w:rPr>
+          <w:rFonts w:eastAsia="Times New Roman" w:cstheme="majorHAnsi"/>
+          <w:b/>
+          <w:bCs/>
+          <w:kern w:val="36"/>
+          <w:lang w:val="fr-FR" w:eastAsia="fr-FR"/>
+        </w:rPr>
+        <w:t>Validation des principaux scénarios de fonctionnement :</w:t>
+      </w:r>
+    </w:p>
+    <w:p>
+      <w:pPr>
+        <w:numPr>
+          <w:ilvl w:val="0"/>
+          <w:numId w:val="28"/>
+        </w:numPr>
+        <w:spacing w:before="100" w:beforeAutospacing="1" w:after="100" w:afterAutospacing="1" w:line="240" w:lineRule="auto"/>
+        <w:outlineLvl w:val="0"/>
+        <w:rPr>
+          <w:rFonts w:eastAsia="Times New Roman" w:cstheme="majorHAnsi"/>
+          <w:b/>
+          <w:bCs/>
+          <w:kern w:val="36"/>
+          <w:lang w:val="fr-FR" w:eastAsia="fr-FR"/>
+        </w:rPr>
+      </w:pPr>
+      <w:proofErr w:type="gramStart"/>
+      <w:r>
+        <w:rPr>
+          <w:rFonts w:eastAsia="Times New Roman" w:cstheme="majorHAnsi"/>
+          <w:b/>
+          <w:bCs/>
+          <w:kern w:val="36"/>
+          <w:lang w:val="fr-FR" w:eastAsia="fr-FR"/>
+        </w:rPr>
+        <w:t>succession</w:t>
+      </w:r>
+      <w:proofErr w:type="gramEnd"/>
+      <w:r>
+        <w:rPr>
+          <w:rFonts w:eastAsia="Times New Roman" w:cstheme="majorHAnsi"/>
+          <w:b/>
+          <w:bCs/>
+          <w:kern w:val="36"/>
+          <w:lang w:val="fr-FR" w:eastAsia="fr-FR"/>
+        </w:rPr>
+        <w:t xml:space="preserve"> de calculs Web avec échange entre les deux derniers calculs ; </w:t>
+      </w:r>
+    </w:p>
+    <w:p>
+      <w:pPr>
+        <w:numPr>
+          <w:ilvl w:val="0"/>
+          <w:numId w:val="28"/>
+        </w:numPr>
+        <w:spacing w:before="100" w:beforeAutospacing="1" w:after="100" w:afterAutospacing="1" w:line="240" w:lineRule="auto"/>
+        <w:outlineLvl w:val="0"/>
+        <w:rPr>
+          <w:rFonts w:eastAsia="Times New Roman" w:cstheme="majorHAnsi"/>
+          <w:b/>
+          <w:bCs/>
+          <w:kern w:val="36"/>
+          <w:lang w:val="fr-FR" w:eastAsia="fr-FR"/>
+        </w:rPr>
+      </w:pPr>
+      <w:proofErr w:type="gramStart"/>
+      <w:r>
+        <w:rPr>
+          <w:rFonts w:eastAsia="Times New Roman" w:cstheme="majorHAnsi"/>
+          <w:b/>
+          <w:bCs/>
+          <w:kern w:val="36"/>
+          <w:lang w:val="fr-FR" w:eastAsia="fr-FR"/>
+        </w:rPr>
+        <w:t>import</w:t>
+      </w:r>
+      <w:proofErr w:type="gramEnd"/>
+      <w:r>
+        <w:rPr>
+          <w:rFonts w:eastAsia="Times New Roman" w:cstheme="majorHAnsi"/>
+          <w:b/>
+          <w:bCs/>
+          <w:kern w:val="36"/>
+          <w:lang w:val="fr-FR" w:eastAsia="fr-FR"/>
+        </w:rPr>
+        <w:t xml:space="preserve"> de calculs JSON et création d'un nouveau calcul ; </w:t>
+      </w:r>
+    </w:p>
+    <w:p>
+      <w:pPr>
+        <w:numPr>
+          <w:ilvl w:val="0"/>
+          <w:numId w:val="28"/>
+        </w:numPr>
+        <w:spacing w:before="100" w:beforeAutospacing="1" w:after="100" w:afterAutospacing="1" w:line="240" w:lineRule="auto"/>
+        <w:outlineLvl w:val="0"/>
+        <w:rPr>
+          <w:rFonts w:eastAsia="Times New Roman" w:cstheme="majorHAnsi"/>
+          <w:b/>
+          <w:bCs/>
+          <w:kern w:val="36"/>
+          <w:lang w:val="fr-FR" w:eastAsia="fr-FR"/>
+        </w:rPr>
+      </w:pPr>
+      <w:proofErr w:type="gramStart"/>
+      <w:r>
+        <w:rPr>
+          <w:rFonts w:eastAsia="Times New Roman" w:cstheme="majorHAnsi"/>
+          <w:b/>
+          <w:bCs/>
+          <w:kern w:val="36"/>
+          <w:lang w:val="fr-FR" w:eastAsia="fr-FR"/>
+        </w:rPr>
+        <w:t>rappel</w:t>
+      </w:r>
+      <w:proofErr w:type="gramEnd"/>
+      <w:r>
+        <w:rPr>
+          <w:rFonts w:eastAsia="Times New Roman" w:cstheme="majorHAnsi"/>
+          <w:b/>
+          <w:bCs/>
+          <w:kern w:val="36"/>
+          <w:lang w:val="fr-FR" w:eastAsia="fr-FR"/>
+        </w:rPr>
+        <w:t xml:space="preserve"> d'un calcul par </w:t>
+      </w:r>
+      <w:r>
+        <w:rPr>
+          <w:rFonts w:eastAsia="Times New Roman" w:cstheme="majorHAnsi"/>
+          <w:b/>
+          <w:bCs/>
+          <w:i/>
+          <w:iCs/>
+          <w:kern w:val="36"/>
+          <w:lang w:val="fr-FR" w:eastAsia="fr-FR"/>
+        </w:rPr>
+        <w:t>Calculation Key</w:t>
+      </w:r>
+      <w:r>
+        <w:rPr>
+          <w:rFonts w:eastAsia="Times New Roman" w:cstheme="majorHAnsi"/>
+          <w:b/>
+          <w:bCs/>
+          <w:kern w:val="36"/>
+          <w:lang w:val="fr-FR" w:eastAsia="fr-FR"/>
+        </w:rPr>
+        <w:t xml:space="preserve"> ; </w:t>
+      </w:r>
+    </w:p>
+    <w:p>
+      <w:pPr>
+        <w:numPr>
+          <w:ilvl w:val="0"/>
+          <w:numId w:val="28"/>
+        </w:numPr>
+        <w:spacing w:before="100" w:beforeAutospacing="1" w:after="100" w:afterAutospacing="1" w:line="240" w:lineRule="auto"/>
+        <w:outlineLvl w:val="0"/>
+        <w:rPr>
+          <w:rFonts w:eastAsia="Times New Roman" w:cstheme="majorHAnsi"/>
+          <w:b/>
+          <w:bCs/>
+          <w:kern w:val="36"/>
+          <w:lang w:val="fr-FR" w:eastAsia="fr-FR"/>
+        </w:rPr>
+      </w:pPr>
+      <w:proofErr w:type="gramStart"/>
+      <w:r>
+        <w:rPr>
+          <w:rFonts w:eastAsia="Times New Roman" w:cstheme="majorHAnsi"/>
+          <w:b/>
+          <w:bCs/>
+          <w:kern w:val="36"/>
+          <w:lang w:val="fr-FR" w:eastAsia="fr-FR"/>
+        </w:rPr>
+        <w:t>recherche</w:t>
+      </w:r>
+      <w:proofErr w:type="gramEnd"/>
+      <w:r>
+        <w:rPr>
+          <w:rFonts w:eastAsia="Times New Roman" w:cstheme="majorHAnsi"/>
+          <w:b/>
+          <w:bCs/>
+          <w:kern w:val="36"/>
+          <w:lang w:val="fr-FR" w:eastAsia="fr-FR"/>
+        </w:rPr>
+        <w:t xml:space="preserve"> d'un calcul enregistré ; </w:t>
+      </w:r>
+    </w:p>
+    <w:p>
+      <w:pPr>
+        <w:numPr>
+          <w:ilvl w:val="0"/>
+          <w:numId w:val="28"/>
+        </w:numPr>
+        <w:spacing w:before="100" w:beforeAutospacing="1" w:after="100" w:afterAutospacing="1" w:line="240" w:lineRule="auto"/>
+        <w:outlineLvl w:val="0"/>
+        <w:rPr>
+          <w:rFonts w:eastAsia="Times New Roman" w:cstheme="majorHAnsi"/>
+          <w:b/>
+          <w:bCs/>
+          <w:kern w:val="36"/>
+          <w:lang w:val="fr-FR" w:eastAsia="fr-FR"/>
+        </w:rPr>
+      </w:pPr>
+      <w:proofErr w:type="gramStart"/>
+      <w:r>
+        <w:rPr>
+          <w:rFonts w:eastAsia="Times New Roman" w:cstheme="majorHAnsi"/>
+          <w:b/>
+          <w:bCs/>
+          <w:kern w:val="36"/>
+          <w:lang w:val="fr-FR" w:eastAsia="fr-FR"/>
+        </w:rPr>
+        <w:t>coexistence</w:t>
+      </w:r>
+      <w:proofErr w:type="gramEnd"/>
+      <w:r>
+        <w:rPr>
+          <w:rFonts w:eastAsia="Times New Roman" w:cstheme="majorHAnsi"/>
+          <w:b/>
+          <w:bCs/>
+          <w:kern w:val="36"/>
+          <w:lang w:val="fr-FR" w:eastAsia="fr-FR"/>
+        </w:rPr>
+        <w:t xml:space="preserve"> des workflows Web et JSON sans interférence.</w:t>
+      </w:r>
     </w:p>
     <w:p>
       <w:pPr>
@@ -846,7 +774,11 @@
           <w:lang w:val="fr-FR" w:eastAsia="fr-FR"/>
         </w:rPr>
       </w:pPr>
-      <w:r>
+    </w:p>
+    <w:p>
+      <w:pPr>
+        <w:spacing w:before="100" w:beforeAutospacing="1" w:after="100" w:afterAutospacing="1" w:line="240" w:lineRule="auto"/>
+        <w:outlineLvl w:val="0"/>
         <w:rPr>
           <w:rFonts w:asciiTheme="majorHAnsi" w:eastAsia="Times New Roman" w:hAnsiTheme="majorHAnsi" w:cstheme="majorHAnsi"/>
           <w:b/>
@@ -857,9 +789,7 @@
           <w:szCs w:val="28"/>
           <w:lang w:val="fr-FR" w:eastAsia="fr-FR"/>
         </w:rPr>
-        <w:lastRenderedPageBreak/>
-        <w:t>Version</w:t>
-      </w:r>
+      </w:pPr>
       <w:r>
         <w:rPr>
           <w:rFonts w:asciiTheme="majorHAnsi" w:eastAsia="Times New Roman" w:hAnsiTheme="majorHAnsi" w:cstheme="majorHAnsi"/>
@@ -871,9 +801,643 @@
           <w:szCs w:val="28"/>
           <w:lang w:val="fr-FR" w:eastAsia="fr-FR"/>
         </w:rPr>
-        <w:t xml:space="preserve"> 1.</w:t>
-      </w:r>
-      <w:r>
+        <w:t>Version 2.01 / APP_VERSION 1.21 – juillet 2026</w:t>
+      </w:r>
+    </w:p>
+    <w:p>
+      <w:pPr>
+        <w:spacing w:before="100" w:beforeAutospacing="1" w:after="100" w:afterAutospacing="1" w:line="240" w:lineRule="auto"/>
+        <w:outlineLvl w:val="0"/>
+        <w:rPr>
+          <w:rFonts w:eastAsia="Times New Roman" w:cstheme="majorHAnsi"/>
+          <w:b/>
+          <w:bCs/>
+          <w:color w:val="365F91" w:themeColor="accent1" w:themeShade="BF"/>
+          <w:kern w:val="36"/>
+          <w:lang w:val="fr-FR" w:eastAsia="fr-FR"/>
+        </w:rPr>
+      </w:pPr>
+      <w:r>
+        <w:rPr>
+          <w:rFonts w:eastAsia="Times New Roman" w:cstheme="majorHAnsi"/>
+          <w:b/>
+          <w:bCs/>
+          <w:color w:val="000000" w:themeColor="text1"/>
+          <w:kern w:val="36"/>
+          <w:lang w:val="fr-FR" w:eastAsia="fr-FR"/>
+        </w:rPr>
+        <w:t>Architecture</w:t>
+      </w:r>
+    </w:p>
+    <w:p>
+      <w:pPr>
+        <w:pStyle w:val="Paragraphedeliste"/>
+        <w:numPr>
+          <w:ilvl w:val="0"/>
+          <w:numId w:val="21"/>
+        </w:numPr>
+        <w:spacing w:before="100" w:beforeAutospacing="1" w:after="100" w:afterAutospacing="1" w:line="240" w:lineRule="auto"/>
+        <w:outlineLvl w:val="0"/>
+        <w:rPr>
+          <w:rFonts w:eastAsia="Times New Roman" w:cstheme="majorHAnsi"/>
+          <w:color w:val="000000" w:themeColor="text1"/>
+          <w:kern w:val="36"/>
+          <w:lang w:val="fr-FR" w:eastAsia="fr-FR"/>
+        </w:rPr>
+      </w:pPr>
+      <w:r>
+        <w:rPr>
+          <w:rFonts w:eastAsia="Times New Roman" w:cstheme="majorHAnsi"/>
+          <w:color w:val="000000" w:themeColor="text1"/>
+          <w:kern w:val="36"/>
+          <w:lang w:val="fr-FR" w:eastAsia="fr-FR"/>
+        </w:rPr>
+        <w:t>Finalisation de l'architecture basée sur RACE_SCHEMA (protocole d'échange) et RACE_MODEL (modèle métier).</w:t>
+      </w:r>
+    </w:p>
+    <w:p>
+      <w:pPr>
+        <w:pStyle w:val="Paragraphedeliste"/>
+        <w:numPr>
+          <w:ilvl w:val="0"/>
+          <w:numId w:val="21"/>
+        </w:numPr>
+        <w:spacing w:before="100" w:beforeAutospacing="1" w:after="100" w:afterAutospacing="1" w:line="240" w:lineRule="auto"/>
+        <w:outlineLvl w:val="0"/>
+        <w:rPr>
+          <w:rFonts w:eastAsia="Times New Roman" w:cstheme="majorHAnsi"/>
+          <w:color w:val="000000" w:themeColor="text1"/>
+          <w:kern w:val="36"/>
+          <w:lang w:val="fr-FR" w:eastAsia="fr-FR"/>
+        </w:rPr>
+      </w:pPr>
+      <w:r>
+        <w:rPr>
+          <w:rFonts w:eastAsia="Times New Roman" w:cstheme="majorHAnsi"/>
+          <w:color w:val="000000" w:themeColor="text1"/>
+          <w:kern w:val="36"/>
+          <w:lang w:val="fr-FR" w:eastAsia="fr-FR"/>
+        </w:rPr>
+        <w:lastRenderedPageBreak/>
+        <w:t>Première version conforme au protocole d'échange EEP 1.0.</w:t>
+      </w:r>
+    </w:p>
+    <w:p>
+      <w:pPr>
+        <w:pStyle w:val="Paragraphedeliste"/>
+        <w:numPr>
+          <w:ilvl w:val="0"/>
+          <w:numId w:val="21"/>
+        </w:numPr>
+        <w:spacing w:before="100" w:beforeAutospacing="1" w:after="100" w:afterAutospacing="1" w:line="240" w:lineRule="auto"/>
+        <w:outlineLvl w:val="0"/>
+        <w:rPr>
+          <w:rFonts w:eastAsia="Times New Roman" w:cstheme="majorHAnsi"/>
+          <w:color w:val="000000" w:themeColor="text1"/>
+          <w:kern w:val="36"/>
+          <w:lang w:val="fr-FR" w:eastAsia="fr-FR"/>
+        </w:rPr>
+      </w:pPr>
+      <w:r>
+        <w:rPr>
+          <w:rFonts w:eastAsia="Times New Roman" w:cstheme="majorHAnsi"/>
+          <w:color w:val="000000" w:themeColor="text1"/>
+          <w:kern w:val="36"/>
+          <w:lang w:val="fr-FR" w:eastAsia="fr-FR"/>
+        </w:rPr>
+        <w:t>Clarification des responsabilités entre les services, le modèle métier et la génération des rapports PDF.</w:t>
+      </w:r>
+    </w:p>
+    <w:p>
+      <w:pPr>
+        <w:spacing w:before="100" w:beforeAutospacing="1" w:after="100" w:afterAutospacing="1" w:line="240" w:lineRule="auto"/>
+        <w:outlineLvl w:val="0"/>
+        <w:rPr>
+          <w:rFonts w:eastAsia="Times New Roman" w:cstheme="majorHAnsi"/>
+          <w:b/>
+          <w:bCs/>
+          <w:color w:val="000000" w:themeColor="text1"/>
+          <w:kern w:val="36"/>
+          <w:lang w:val="fr-FR" w:eastAsia="fr-FR"/>
+        </w:rPr>
+      </w:pPr>
+      <w:r>
+        <w:rPr>
+          <w:rFonts w:eastAsia="Times New Roman" w:cstheme="majorHAnsi"/>
+          <w:b/>
+          <w:bCs/>
+          <w:color w:val="000000" w:themeColor="text1"/>
+          <w:kern w:val="36"/>
+          <w:lang w:val="fr-FR" w:eastAsia="fr-FR"/>
+        </w:rPr>
+        <w:t>Nouvelles fonctionnalités</w:t>
+      </w:r>
+    </w:p>
+    <w:p>
+      <w:pPr>
+        <w:pStyle w:val="Paragraphedeliste"/>
+        <w:numPr>
+          <w:ilvl w:val="0"/>
+          <w:numId w:val="21"/>
+        </w:numPr>
+        <w:spacing w:before="100" w:beforeAutospacing="1" w:after="100" w:afterAutospacing="1" w:line="240" w:lineRule="auto"/>
+        <w:outlineLvl w:val="0"/>
+        <w:rPr>
+          <w:rFonts w:eastAsia="Times New Roman" w:cstheme="majorHAnsi"/>
+          <w:color w:val="000000" w:themeColor="text1"/>
+          <w:kern w:val="36"/>
+          <w:lang w:val="fr-FR" w:eastAsia="fr-FR"/>
+        </w:rPr>
+      </w:pPr>
+      <w:r>
+        <w:rPr>
+          <w:rFonts w:eastAsia="Times New Roman" w:cstheme="majorHAnsi"/>
+          <w:color w:val="000000" w:themeColor="text1"/>
+          <w:kern w:val="36"/>
+          <w:lang w:val="fr-FR" w:eastAsia="fr-FR"/>
+        </w:rPr>
+        <w:t>Recherche publique d'un calcul par Calculation ID.</w:t>
+      </w:r>
+    </w:p>
+    <w:p>
+      <w:pPr>
+        <w:pStyle w:val="Paragraphedeliste"/>
+        <w:numPr>
+          <w:ilvl w:val="0"/>
+          <w:numId w:val="21"/>
+        </w:numPr>
+        <w:spacing w:before="100" w:beforeAutospacing="1" w:after="100" w:afterAutospacing="1" w:line="240" w:lineRule="auto"/>
+        <w:outlineLvl w:val="0"/>
+        <w:rPr>
+          <w:rFonts w:eastAsia="Times New Roman" w:cstheme="majorHAnsi"/>
+          <w:color w:val="000000" w:themeColor="text1"/>
+          <w:kern w:val="36"/>
+          <w:lang w:val="fr-FR" w:eastAsia="fr-FR"/>
+        </w:rPr>
+      </w:pPr>
+      <w:r>
+        <w:rPr>
+          <w:rFonts w:eastAsia="Times New Roman" w:cstheme="majorHAnsi"/>
+          <w:color w:val="000000" w:themeColor="text1"/>
+          <w:kern w:val="36"/>
+          <w:lang w:val="fr-FR" w:eastAsia="fr-FR"/>
+        </w:rPr>
+        <w:t>Rappel d'un calcul pour modification à partir de son Calculation ID.</w:t>
+      </w:r>
+    </w:p>
+    <w:p>
+      <w:pPr>
+        <w:pStyle w:val="Paragraphedeliste"/>
+        <w:numPr>
+          <w:ilvl w:val="0"/>
+          <w:numId w:val="21"/>
+        </w:numPr>
+        <w:spacing w:before="100" w:beforeAutospacing="1" w:after="100" w:afterAutospacing="1" w:line="240" w:lineRule="auto"/>
+        <w:outlineLvl w:val="0"/>
+        <w:rPr>
+          <w:rFonts w:eastAsia="Times New Roman" w:cstheme="majorHAnsi"/>
+          <w:color w:val="000000" w:themeColor="text1"/>
+          <w:kern w:val="36"/>
+          <w:lang w:val="fr-FR" w:eastAsia="fr-FR"/>
+        </w:rPr>
+      </w:pPr>
+      <w:r>
+        <w:rPr>
+          <w:rFonts w:eastAsia="Times New Roman" w:cstheme="majorHAnsi"/>
+          <w:color w:val="000000" w:themeColor="text1"/>
+          <w:kern w:val="36"/>
+          <w:lang w:val="fr-FR" w:eastAsia="fr-FR"/>
+        </w:rPr>
+        <w:t>Gestion du contexte de travail permettant la production automatique :</w:t>
+      </w:r>
+    </w:p>
+    <w:p>
+      <w:pPr>
+        <w:pStyle w:val="Paragraphedeliste"/>
+        <w:numPr>
+          <w:ilvl w:val="1"/>
+          <w:numId w:val="21"/>
+        </w:numPr>
+        <w:spacing w:before="100" w:beforeAutospacing="1" w:after="100" w:afterAutospacing="1" w:line="240" w:lineRule="auto"/>
+        <w:outlineLvl w:val="0"/>
+        <w:rPr>
+          <w:rFonts w:eastAsia="Times New Roman" w:cstheme="majorHAnsi"/>
+          <w:color w:val="000000" w:themeColor="text1"/>
+          <w:kern w:val="36"/>
+          <w:lang w:val="fr-FR" w:eastAsia="fr-FR"/>
+        </w:rPr>
+      </w:pPr>
+      <w:proofErr w:type="gramStart"/>
+      <w:r>
+        <w:rPr>
+          <w:rFonts w:eastAsia="Times New Roman" w:cstheme="majorHAnsi"/>
+          <w:color w:val="000000" w:themeColor="text1"/>
+          <w:kern w:val="36"/>
+          <w:lang w:val="fr-FR" w:eastAsia="fr-FR"/>
+        </w:rPr>
+        <w:t>d'un</w:t>
+      </w:r>
+      <w:proofErr w:type="gramEnd"/>
+      <w:r>
+        <w:rPr>
+          <w:rFonts w:eastAsia="Times New Roman" w:cstheme="majorHAnsi"/>
+          <w:color w:val="000000" w:themeColor="text1"/>
+          <w:kern w:val="36"/>
+          <w:lang w:val="fr-FR" w:eastAsia="fr-FR"/>
+        </w:rPr>
+        <w:t xml:space="preserve"> PDF anonymisé en consultation publique ;</w:t>
+      </w:r>
+    </w:p>
+    <w:p>
+      <w:pPr>
+        <w:pStyle w:val="Paragraphedeliste"/>
+        <w:numPr>
+          <w:ilvl w:val="1"/>
+          <w:numId w:val="21"/>
+        </w:numPr>
+        <w:spacing w:before="100" w:beforeAutospacing="1" w:after="100" w:afterAutospacing="1" w:line="240" w:lineRule="auto"/>
+        <w:outlineLvl w:val="0"/>
+        <w:rPr>
+          <w:rFonts w:eastAsia="Times New Roman" w:cstheme="majorHAnsi"/>
+          <w:color w:val="000000" w:themeColor="text1"/>
+          <w:kern w:val="36"/>
+          <w:lang w:val="fr-FR" w:eastAsia="fr-FR"/>
+        </w:rPr>
+      </w:pPr>
+      <w:proofErr w:type="gramStart"/>
+      <w:r>
+        <w:rPr>
+          <w:rFonts w:eastAsia="Times New Roman" w:cstheme="majorHAnsi"/>
+          <w:color w:val="000000" w:themeColor="text1"/>
+          <w:kern w:val="36"/>
+          <w:lang w:val="fr-FR" w:eastAsia="fr-FR"/>
+        </w:rPr>
+        <w:t>d'un</w:t>
+      </w:r>
+      <w:proofErr w:type="gramEnd"/>
+      <w:r>
+        <w:rPr>
+          <w:rFonts w:eastAsia="Times New Roman" w:cstheme="majorHAnsi"/>
+          <w:color w:val="000000" w:themeColor="text1"/>
+          <w:kern w:val="36"/>
+          <w:lang w:val="fr-FR" w:eastAsia="fr-FR"/>
+        </w:rPr>
+        <w:t xml:space="preserve"> PDF nominatif lors du rappel d'un calcul.</w:t>
+      </w:r>
+    </w:p>
+    <w:p>
+      <w:pPr>
+        <w:spacing w:before="100" w:beforeAutospacing="1" w:after="100" w:afterAutospacing="1" w:line="240" w:lineRule="auto"/>
+        <w:outlineLvl w:val="0"/>
+        <w:rPr>
+          <w:rFonts w:eastAsia="Times New Roman" w:cstheme="majorHAnsi"/>
+          <w:b/>
+          <w:bCs/>
+          <w:color w:val="000000" w:themeColor="text1"/>
+          <w:kern w:val="36"/>
+          <w:lang w:val="fr-FR" w:eastAsia="fr-FR"/>
+        </w:rPr>
+      </w:pPr>
+      <w:r>
+        <w:rPr>
+          <w:rFonts w:eastAsia="Times New Roman" w:cstheme="majorHAnsi"/>
+          <w:b/>
+          <w:bCs/>
+          <w:color w:val="000000" w:themeColor="text1"/>
+          <w:kern w:val="36"/>
+          <w:lang w:val="fr-FR" w:eastAsia="fr-FR"/>
+        </w:rPr>
+        <w:t>Sessions Flask</w:t>
+      </w:r>
+    </w:p>
+    <w:p>
+      <w:pPr>
+        <w:pStyle w:val="Paragraphedeliste"/>
+        <w:numPr>
+          <w:ilvl w:val="0"/>
+          <w:numId w:val="21"/>
+        </w:numPr>
+        <w:spacing w:before="100" w:beforeAutospacing="1" w:after="100" w:afterAutospacing="1" w:line="240" w:lineRule="auto"/>
+        <w:outlineLvl w:val="0"/>
+        <w:rPr>
+          <w:rFonts w:eastAsia="Times New Roman" w:cstheme="majorHAnsi"/>
+          <w:color w:val="000000" w:themeColor="text1"/>
+          <w:kern w:val="36"/>
+          <w:lang w:val="fr-FR" w:eastAsia="fr-FR"/>
+        </w:rPr>
+      </w:pPr>
+      <w:r>
+        <w:rPr>
+          <w:rFonts w:eastAsia="Times New Roman" w:cstheme="majorHAnsi"/>
+          <w:color w:val="000000" w:themeColor="text1"/>
+          <w:kern w:val="36"/>
+          <w:lang w:val="fr-FR" w:eastAsia="fr-FR"/>
+        </w:rPr>
+        <w:t>Stabilisation de la permutation entre le document courant et le document précédent.</w:t>
+      </w:r>
+    </w:p>
+    <w:p>
+      <w:pPr>
+        <w:pStyle w:val="Paragraphedeliste"/>
+        <w:numPr>
+          <w:ilvl w:val="0"/>
+          <w:numId w:val="21"/>
+        </w:numPr>
+        <w:spacing w:before="100" w:beforeAutospacing="1" w:after="100" w:afterAutospacing="1" w:line="240" w:lineRule="auto"/>
+        <w:outlineLvl w:val="0"/>
+        <w:rPr>
+          <w:rFonts w:eastAsia="Times New Roman" w:cstheme="majorHAnsi"/>
+          <w:color w:val="000000" w:themeColor="text1"/>
+          <w:kern w:val="36"/>
+          <w:lang w:val="fr-FR" w:eastAsia="fr-FR"/>
+        </w:rPr>
+      </w:pPr>
+      <w:r>
+        <w:rPr>
+          <w:rFonts w:eastAsia="Times New Roman" w:cstheme="majorHAnsi"/>
+          <w:color w:val="000000" w:themeColor="text1"/>
+          <w:kern w:val="36"/>
+          <w:lang w:val="fr-FR" w:eastAsia="fr-FR"/>
+        </w:rPr>
+        <w:t>Validation complète de la conservation et du rappel des documents de travail dans la session utilisateur.</w:t>
+      </w:r>
+    </w:p>
+    <w:p>
+      <w:pPr>
+        <w:spacing w:before="100" w:beforeAutospacing="1" w:after="100" w:afterAutospacing="1" w:line="240" w:lineRule="auto"/>
+        <w:outlineLvl w:val="0"/>
+        <w:rPr>
+          <w:rFonts w:eastAsia="Times New Roman" w:cstheme="majorHAnsi"/>
+          <w:b/>
+          <w:bCs/>
+          <w:color w:val="000000" w:themeColor="text1"/>
+          <w:kern w:val="36"/>
+          <w:lang w:val="fr-FR" w:eastAsia="fr-FR"/>
+        </w:rPr>
+      </w:pPr>
+      <w:r>
+        <w:rPr>
+          <w:rFonts w:eastAsia="Times New Roman" w:cstheme="majorHAnsi"/>
+          <w:b/>
+          <w:bCs/>
+          <w:color w:val="000000" w:themeColor="text1"/>
+          <w:kern w:val="36"/>
+          <w:lang w:val="fr-FR" w:eastAsia="fr-FR"/>
+        </w:rPr>
+        <w:t>Corrections</w:t>
+      </w:r>
+    </w:p>
+    <w:p>
+      <w:pPr>
+        <w:pStyle w:val="Paragraphedeliste"/>
+        <w:numPr>
+          <w:ilvl w:val="0"/>
+          <w:numId w:val="21"/>
+        </w:numPr>
+        <w:spacing w:before="100" w:beforeAutospacing="1" w:after="100" w:afterAutospacing="1" w:line="240" w:lineRule="auto"/>
+        <w:outlineLvl w:val="0"/>
+        <w:rPr>
+          <w:rFonts w:eastAsia="Times New Roman" w:cstheme="majorHAnsi"/>
+          <w:color w:val="000000" w:themeColor="text1"/>
+          <w:kern w:val="36"/>
+          <w:lang w:val="fr-FR" w:eastAsia="fr-FR"/>
+        </w:rPr>
+      </w:pPr>
+      <w:r>
+        <w:rPr>
+          <w:rFonts w:eastAsia="Times New Roman" w:cstheme="majorHAnsi"/>
+          <w:color w:val="000000" w:themeColor="text1"/>
+          <w:kern w:val="36"/>
+          <w:lang w:val="fr-FR" w:eastAsia="fr-FR"/>
+        </w:rPr>
+        <w:t>Correction de plusieurs cas limites liés au rappel des calculs.</w:t>
+      </w:r>
+    </w:p>
+    <w:p>
+      <w:pPr>
+        <w:pStyle w:val="Paragraphedeliste"/>
+        <w:numPr>
+          <w:ilvl w:val="0"/>
+          <w:numId w:val="21"/>
+        </w:numPr>
+        <w:spacing w:before="100" w:beforeAutospacing="1" w:after="100" w:afterAutospacing="1" w:line="240" w:lineRule="auto"/>
+        <w:outlineLvl w:val="0"/>
+        <w:rPr>
+          <w:rFonts w:eastAsia="Times New Roman" w:cstheme="majorHAnsi"/>
+          <w:color w:val="000000" w:themeColor="text1"/>
+          <w:kern w:val="36"/>
+          <w:lang w:val="fr-FR" w:eastAsia="fr-FR"/>
+        </w:rPr>
+      </w:pPr>
+      <w:r>
+        <w:rPr>
+          <w:rFonts w:eastAsia="Times New Roman" w:cstheme="majorHAnsi"/>
+          <w:color w:val="000000" w:themeColor="text1"/>
+          <w:kern w:val="36"/>
+          <w:lang w:val="fr-FR" w:eastAsia="fr-FR"/>
+        </w:rPr>
+        <w:t>Gestion des Calculation ID inexistants avec message utilisateur explicite.</w:t>
+      </w:r>
+    </w:p>
+    <w:p>
+      <w:pPr>
+        <w:pStyle w:val="Paragraphedeliste"/>
+        <w:numPr>
+          <w:ilvl w:val="0"/>
+          <w:numId w:val="21"/>
+        </w:numPr>
+        <w:spacing w:before="100" w:beforeAutospacing="1" w:after="100" w:afterAutospacing="1" w:line="240" w:lineRule="auto"/>
+        <w:outlineLvl w:val="0"/>
+        <w:rPr>
+          <w:rFonts w:eastAsia="Times New Roman" w:cstheme="majorHAnsi"/>
+          <w:color w:val="000000" w:themeColor="text1"/>
+          <w:kern w:val="36"/>
+          <w:lang w:val="fr-FR" w:eastAsia="fr-FR"/>
+        </w:rPr>
+      </w:pPr>
+      <w:r>
+        <w:rPr>
+          <w:rFonts w:eastAsia="Times New Roman" w:cstheme="majorHAnsi"/>
+          <w:color w:val="000000" w:themeColor="text1"/>
+          <w:kern w:val="36"/>
+          <w:lang w:val="fr-FR" w:eastAsia="fr-FR"/>
+        </w:rPr>
+        <w:t>Renforcement de la robustesse des traitements en mode lecture seule.</w:t>
+      </w:r>
+    </w:p>
+    <w:p>
+      <w:pPr>
+        <w:pStyle w:val="Paragraphedeliste"/>
+        <w:numPr>
+          <w:ilvl w:val="0"/>
+          <w:numId w:val="21"/>
+        </w:numPr>
+        <w:spacing w:before="100" w:beforeAutospacing="1" w:after="100" w:afterAutospacing="1" w:line="240" w:lineRule="auto"/>
+        <w:outlineLvl w:val="0"/>
+        <w:rPr>
+          <w:rFonts w:eastAsia="Times New Roman" w:cstheme="majorHAnsi"/>
+          <w:color w:val="000000" w:themeColor="text1"/>
+          <w:kern w:val="36"/>
+          <w:lang w:val="fr-FR" w:eastAsia="fr-FR"/>
+        </w:rPr>
+      </w:pPr>
+      <w:r>
+        <w:rPr>
+          <w:rFonts w:eastAsia="Times New Roman" w:cstheme="majorHAnsi"/>
+          <w:color w:val="000000" w:themeColor="text1"/>
+          <w:kern w:val="36"/>
+          <w:lang w:val="fr-FR" w:eastAsia="fr-FR"/>
+        </w:rPr>
+        <w:t>Diverses corrections mineures d'interface et de workflow.</w:t>
+      </w:r>
+    </w:p>
+    <w:p>
+      <w:pPr>
+        <w:spacing w:before="100" w:beforeAutospacing="1" w:after="100" w:afterAutospacing="1" w:line="240" w:lineRule="auto"/>
+        <w:outlineLvl w:val="0"/>
+        <w:rPr>
+          <w:rFonts w:eastAsia="Times New Roman" w:cstheme="majorHAnsi"/>
+          <w:b/>
+          <w:bCs/>
+          <w:color w:val="000000" w:themeColor="text1"/>
+          <w:kern w:val="36"/>
+          <w:lang w:val="fr-FR" w:eastAsia="fr-FR"/>
+        </w:rPr>
+      </w:pPr>
+      <w:r>
+        <w:rPr>
+          <w:rFonts w:eastAsia="Times New Roman" w:cstheme="majorHAnsi"/>
+          <w:b/>
+          <w:bCs/>
+          <w:color w:val="000000" w:themeColor="text1"/>
+          <w:kern w:val="36"/>
+          <w:lang w:val="fr-FR" w:eastAsia="fr-FR"/>
+        </w:rPr>
+        <w:t>Validation</w:t>
+      </w:r>
+    </w:p>
+    <w:p>
+      <w:pPr>
+        <w:pStyle w:val="Paragraphedeliste"/>
+        <w:numPr>
+          <w:ilvl w:val="0"/>
+          <w:numId w:val="21"/>
+        </w:numPr>
+        <w:spacing w:before="100" w:beforeAutospacing="1" w:after="100" w:afterAutospacing="1" w:line="240" w:lineRule="auto"/>
+        <w:outlineLvl w:val="0"/>
+        <w:rPr>
+          <w:rFonts w:eastAsia="Times New Roman" w:cstheme="majorHAnsi"/>
+          <w:color w:val="000000" w:themeColor="text1"/>
+          <w:kern w:val="36"/>
+          <w:lang w:val="fr-FR" w:eastAsia="fr-FR"/>
+        </w:rPr>
+      </w:pPr>
+      <w:r>
+        <w:rPr>
+          <w:rFonts w:eastAsia="Times New Roman" w:cstheme="majorHAnsi"/>
+          <w:color w:val="000000" w:themeColor="text1"/>
+          <w:kern w:val="36"/>
+          <w:lang w:val="fr-FR" w:eastAsia="fr-FR"/>
+        </w:rPr>
+        <w:t>Validation complète sous Windows.</w:t>
+      </w:r>
+    </w:p>
+    <w:p>
+      <w:pPr>
+        <w:pStyle w:val="Paragraphedeliste"/>
+        <w:numPr>
+          <w:ilvl w:val="0"/>
+          <w:numId w:val="21"/>
+        </w:numPr>
+        <w:spacing w:before="100" w:beforeAutospacing="1" w:after="100" w:afterAutospacing="1" w:line="240" w:lineRule="auto"/>
+        <w:outlineLvl w:val="0"/>
+        <w:rPr>
+          <w:rFonts w:eastAsia="Times New Roman" w:cstheme="majorHAnsi"/>
+          <w:color w:val="000000" w:themeColor="text1"/>
+          <w:kern w:val="36"/>
+          <w:lang w:val="fr-FR" w:eastAsia="fr-FR"/>
+        </w:rPr>
+      </w:pPr>
+      <w:r>
+        <w:rPr>
+          <w:rFonts w:eastAsia="Times New Roman" w:cstheme="majorHAnsi"/>
+          <w:color w:val="000000" w:themeColor="text1"/>
+          <w:kern w:val="36"/>
+          <w:lang w:val="fr-FR" w:eastAsia="fr-FR"/>
+        </w:rPr>
+        <w:t>Validation complète sous Ubuntu Linux (</w:t>
+      </w:r>
+      <w:proofErr w:type="spellStart"/>
+      <w:r>
+        <w:rPr>
+          <w:rFonts w:eastAsia="Times New Roman" w:cstheme="majorHAnsi"/>
+          <w:color w:val="000000" w:themeColor="text1"/>
+          <w:kern w:val="36"/>
+          <w:lang w:val="fr-FR" w:eastAsia="fr-FR"/>
+        </w:rPr>
+        <w:t>Gunicorn</w:t>
+      </w:r>
+      <w:proofErr w:type="spellEnd"/>
+      <w:r>
+        <w:rPr>
+          <w:rFonts w:eastAsia="Times New Roman" w:cstheme="majorHAnsi"/>
+          <w:color w:val="000000" w:themeColor="text1"/>
+          <w:kern w:val="36"/>
+          <w:lang w:val="fr-FR" w:eastAsia="fr-FR"/>
+        </w:rPr>
+        <w:t xml:space="preserve"> + </w:t>
+      </w:r>
+      <w:proofErr w:type="spellStart"/>
+      <w:r>
+        <w:rPr>
+          <w:rFonts w:eastAsia="Times New Roman" w:cstheme="majorHAnsi"/>
+          <w:color w:val="000000" w:themeColor="text1"/>
+          <w:kern w:val="36"/>
+          <w:lang w:val="fr-FR" w:eastAsia="fr-FR"/>
+        </w:rPr>
+        <w:t>nginx</w:t>
+      </w:r>
+      <w:proofErr w:type="spellEnd"/>
+      <w:r>
+        <w:rPr>
+          <w:rFonts w:eastAsia="Times New Roman" w:cstheme="majorHAnsi"/>
+          <w:color w:val="000000" w:themeColor="text1"/>
+          <w:kern w:val="36"/>
+          <w:lang w:val="fr-FR" w:eastAsia="fr-FR"/>
+        </w:rPr>
+        <w:t>).</w:t>
+      </w:r>
+    </w:p>
+    <w:p>
+      <w:pPr>
+        <w:pStyle w:val="Paragraphedeliste"/>
+        <w:numPr>
+          <w:ilvl w:val="0"/>
+          <w:numId w:val="21"/>
+        </w:numPr>
+        <w:spacing w:before="100" w:beforeAutospacing="1" w:after="100" w:afterAutospacing="1" w:line="240" w:lineRule="auto"/>
+        <w:outlineLvl w:val="0"/>
+        <w:rPr>
+          <w:rFonts w:eastAsia="Times New Roman" w:cstheme="majorHAnsi"/>
+          <w:color w:val="000000" w:themeColor="text1"/>
+          <w:kern w:val="36"/>
+          <w:lang w:val="fr-FR" w:eastAsia="fr-FR"/>
+        </w:rPr>
+      </w:pPr>
+      <w:r>
+        <w:rPr>
+          <w:rFonts w:eastAsia="Times New Roman" w:cstheme="majorHAnsi"/>
+          <w:color w:val="000000" w:themeColor="text1"/>
+          <w:kern w:val="36"/>
+          <w:lang w:val="fr-FR" w:eastAsia="fr-FR"/>
+        </w:rPr>
+        <w:t>Validation des workflows de calcul, recherche publique, rappel, génération PDF et gestion des sessions.</w:t>
+      </w:r>
+    </w:p>
+    <w:p>
+      <w:pPr>
+        <w:spacing w:before="100" w:beforeAutospacing="1" w:after="100" w:afterAutospacing="1" w:line="240" w:lineRule="auto"/>
+        <w:outlineLvl w:val="0"/>
         <w:rPr>
           <w:rFonts w:asciiTheme="majorHAnsi" w:eastAsia="Times New Roman" w:hAnsiTheme="majorHAnsi" w:cstheme="majorHAnsi"/>
           <w:b/>
@@ -884,8 +1448,7 @@
           <w:szCs w:val="28"/>
           <w:lang w:val="fr-FR" w:eastAsia="fr-FR"/>
         </w:rPr>
-        <w:t>10</w:t>
-      </w:r>
+      </w:pPr>
       <w:r>
         <w:rPr>
           <w:rFonts w:asciiTheme="majorHAnsi" w:eastAsia="Times New Roman" w:hAnsiTheme="majorHAnsi" w:cstheme="majorHAnsi"/>
@@ -897,6 +1460,192 @@
           <w:szCs w:val="28"/>
           <w:lang w:val="fr-FR" w:eastAsia="fr-FR"/>
         </w:rPr>
+        <w:t xml:space="preserve">Version </w:t>
+      </w:r>
+      <w:r>
+        <w:rPr>
+          <w:rFonts w:asciiTheme="majorHAnsi" w:eastAsia="Times New Roman" w:hAnsiTheme="majorHAnsi" w:cstheme="majorHAnsi"/>
+          <w:b/>
+          <w:bCs/>
+          <w:color w:val="365F91" w:themeColor="accent1" w:themeShade="BF"/>
+          <w:kern w:val="36"/>
+          <w:sz w:val="28"/>
+          <w:szCs w:val="28"/>
+          <w:lang w:val="fr-FR" w:eastAsia="fr-FR"/>
+        </w:rPr>
+        <w:t>1.2</w:t>
+      </w:r>
+      <w:r>
+        <w:rPr>
+          <w:rFonts w:asciiTheme="majorHAnsi" w:eastAsia="Times New Roman" w:hAnsiTheme="majorHAnsi" w:cstheme="majorHAnsi"/>
+          <w:b/>
+          <w:bCs/>
+          <w:color w:val="365F91" w:themeColor="accent1" w:themeShade="BF"/>
+          <w:kern w:val="36"/>
+          <w:sz w:val="28"/>
+          <w:szCs w:val="28"/>
+          <w:lang w:val="fr-FR" w:eastAsia="fr-FR"/>
+        </w:rPr>
+        <w:t xml:space="preserve"> – </w:t>
+      </w:r>
+      <w:proofErr w:type="spellStart"/>
+      <w:r>
+        <w:rPr>
+          <w:rFonts w:asciiTheme="majorHAnsi" w:eastAsia="Times New Roman" w:hAnsiTheme="majorHAnsi" w:cstheme="majorHAnsi"/>
+          <w:b/>
+          <w:bCs/>
+          <w:color w:val="365F91" w:themeColor="accent1" w:themeShade="BF"/>
+          <w:kern w:val="36"/>
+          <w:sz w:val="28"/>
+          <w:szCs w:val="28"/>
+          <w:lang w:val="fr-FR" w:eastAsia="fr-FR"/>
+        </w:rPr>
+        <w:t>jui</w:t>
+      </w:r>
+      <w:r>
+        <w:rPr>
+          <w:rFonts w:asciiTheme="majorHAnsi" w:eastAsia="Times New Roman" w:hAnsiTheme="majorHAnsi" w:cstheme="majorHAnsi"/>
+          <w:b/>
+          <w:bCs/>
+          <w:color w:val="365F91" w:themeColor="accent1" w:themeShade="BF"/>
+          <w:kern w:val="36"/>
+          <w:sz w:val="28"/>
+          <w:szCs w:val="28"/>
+          <w:lang w:val="fr-FR" w:eastAsia="fr-FR"/>
+        </w:rPr>
+        <w:t>let</w:t>
+      </w:r>
+      <w:proofErr w:type="spellEnd"/>
+      <w:r>
+        <w:rPr>
+          <w:rFonts w:asciiTheme="majorHAnsi" w:eastAsia="Times New Roman" w:hAnsiTheme="majorHAnsi" w:cstheme="majorHAnsi"/>
+          <w:b/>
+          <w:bCs/>
+          <w:color w:val="365F91" w:themeColor="accent1" w:themeShade="BF"/>
+          <w:kern w:val="36"/>
+          <w:sz w:val="28"/>
+          <w:szCs w:val="28"/>
+          <w:lang w:val="fr-FR" w:eastAsia="fr-FR"/>
+        </w:rPr>
+        <w:t xml:space="preserve"> 2026</w:t>
+      </w:r>
+      <w:r>
+        <w:rPr>
+          <w:rFonts w:asciiTheme="majorHAnsi" w:eastAsia="Times New Roman" w:hAnsiTheme="majorHAnsi" w:cstheme="majorHAnsi"/>
+          <w:b/>
+          <w:bCs/>
+          <w:color w:val="365F91" w:themeColor="accent1" w:themeShade="BF"/>
+          <w:kern w:val="36"/>
+          <w:sz w:val="28"/>
+          <w:szCs w:val="28"/>
+          <w:lang w:val="fr-FR" w:eastAsia="fr-FR"/>
+        </w:rPr>
+        <w:t xml:space="preserve"> </w:t>
+      </w:r>
+    </w:p>
+    <w:p>
+      <w:pPr>
+        <w:spacing w:before="100" w:beforeAutospacing="1" w:after="100" w:afterAutospacing="1" w:line="240" w:lineRule="auto"/>
+        <w:outlineLvl w:val="0"/>
+        <w:rPr>
+          <w:rFonts w:eastAsia="Times New Roman" w:cstheme="majorHAnsi"/>
+          <w:b/>
+          <w:bCs/>
+          <w:kern w:val="36"/>
+          <w:lang w:val="fr-FR" w:eastAsia="fr-FR"/>
+        </w:rPr>
+      </w:pPr>
+      <w:r>
+        <w:rPr>
+          <w:rFonts w:eastAsia="Times New Roman" w:cstheme="majorHAnsi"/>
+          <w:b/>
+          <w:bCs/>
+          <w:kern w:val="36"/>
+          <w:lang w:val="fr-FR" w:eastAsia="fr-FR"/>
+        </w:rPr>
+        <w:t>Création du modèle métier (services/document.py).</w:t>
+      </w:r>
+    </w:p>
+    <w:p>
+      <w:pPr>
+        <w:spacing w:before="100" w:beforeAutospacing="1" w:after="100" w:afterAutospacing="1" w:line="240" w:lineRule="auto"/>
+        <w:outlineLvl w:val="0"/>
+        <w:rPr>
+          <w:rFonts w:eastAsia="Times New Roman" w:cstheme="majorHAnsi"/>
+          <w:b/>
+          <w:bCs/>
+          <w:kern w:val="36"/>
+          <w:sz w:val="24"/>
+          <w:szCs w:val="24"/>
+          <w:lang w:val="fr-FR" w:eastAsia="fr-FR"/>
+        </w:rPr>
+      </w:pPr>
+    </w:p>
+    <w:p>
+      <w:pPr>
+        <w:spacing w:before="100" w:beforeAutospacing="1" w:after="100" w:afterAutospacing="1" w:line="240" w:lineRule="auto"/>
+        <w:outlineLvl w:val="0"/>
+        <w:rPr>
+          <w:rFonts w:asciiTheme="majorHAnsi" w:eastAsia="Times New Roman" w:hAnsiTheme="majorHAnsi" w:cstheme="majorHAnsi"/>
+          <w:b/>
+          <w:bCs/>
+          <w:color w:val="365F91" w:themeColor="accent1" w:themeShade="BF"/>
+          <w:kern w:val="36"/>
+          <w:sz w:val="28"/>
+          <w:szCs w:val="28"/>
+          <w:lang w:val="fr-FR" w:eastAsia="fr-FR"/>
+        </w:rPr>
+      </w:pPr>
+      <w:r>
+        <w:rPr>
+          <w:rFonts w:asciiTheme="majorHAnsi" w:eastAsia="Times New Roman" w:hAnsiTheme="majorHAnsi" w:cstheme="majorHAnsi"/>
+          <w:b/>
+          <w:bCs/>
+          <w:color w:val="365F91" w:themeColor="accent1" w:themeShade="BF"/>
+          <w:kern w:val="36"/>
+          <w:sz w:val="28"/>
+          <w:szCs w:val="28"/>
+          <w:lang w:val="fr-FR" w:eastAsia="fr-FR"/>
+        </w:rPr>
+        <w:t>Version</w:t>
+      </w:r>
+      <w:r>
+        <w:rPr>
+          <w:rFonts w:asciiTheme="majorHAnsi" w:eastAsia="Times New Roman" w:hAnsiTheme="majorHAnsi" w:cstheme="majorHAnsi"/>
+          <w:b/>
+          <w:bCs/>
+          <w:color w:val="365F91" w:themeColor="accent1" w:themeShade="BF"/>
+          <w:kern w:val="36"/>
+          <w:sz w:val="28"/>
+          <w:szCs w:val="28"/>
+          <w:lang w:val="fr-FR" w:eastAsia="fr-FR"/>
+        </w:rPr>
+        <w:t xml:space="preserve"> 1.</w:t>
+      </w:r>
+      <w:r>
+        <w:rPr>
+          <w:rFonts w:asciiTheme="majorHAnsi" w:eastAsia="Times New Roman" w:hAnsiTheme="majorHAnsi" w:cstheme="majorHAnsi"/>
+          <w:b/>
+          <w:bCs/>
+          <w:color w:val="365F91" w:themeColor="accent1" w:themeShade="BF"/>
+          <w:kern w:val="36"/>
+          <w:sz w:val="28"/>
+          <w:szCs w:val="28"/>
+          <w:lang w:val="fr-FR" w:eastAsia="fr-FR"/>
+        </w:rPr>
+        <w:t>10</w:t>
+      </w:r>
+      <w:r>
+        <w:rPr>
+          <w:rFonts w:asciiTheme="majorHAnsi" w:eastAsia="Times New Roman" w:hAnsiTheme="majorHAnsi" w:cstheme="majorHAnsi"/>
+          <w:b/>
+          <w:bCs/>
+          <w:color w:val="365F91" w:themeColor="accent1" w:themeShade="BF"/>
+          <w:kern w:val="36"/>
+          <w:sz w:val="28"/>
+          <w:szCs w:val="28"/>
+          <w:lang w:val="fr-FR" w:eastAsia="fr-FR"/>
+        </w:rPr>
         <w:t xml:space="preserve"> – juin 2026</w:t>
       </w:r>
     </w:p>
@@ -1009,6 +1758,7 @@
         <w:rPr>
           <w:lang w:val="fr-FR"/>
         </w:rPr>
+        <w:lastRenderedPageBreak/>
         <w:br/>
       </w:r>
       <w:r>
@@ -1714,7 +2464,6 @@
           <w:szCs w:val="24"/>
           <w:lang w:val="fr-FR" w:eastAsia="fr-FR"/>
         </w:rPr>
-        <w:lastRenderedPageBreak/>
         <w:t>Harmonisation de plusieurs traductions allemandes.</w:t>
       </w:r>
     </w:p>
@@ -1912,6 +2661,7 @@
           <w:szCs w:val="24"/>
           <w:lang w:val="fr-FR" w:eastAsia="fr-FR"/>
         </w:rPr>
+        <w:lastRenderedPageBreak/>
         <w:t>Mise en place d'une page de maintenance dédiée.</w:t>
       </w:r>
     </w:p>
@@ -2348,7 +3098,6 @@
           <w:szCs w:val="26"/>
           <w:lang w:val="fr-FR"/>
         </w:rPr>
-        <w:lastRenderedPageBreak/>
         <w:t>Nouvelles fonctionnalités</w:t>
       </w:r>
     </w:p>
@@ -2585,6 +3334,7 @@
           <w:szCs w:val="26"/>
           <w:lang w:val="fr-FR"/>
         </w:rPr>
+        <w:lastRenderedPageBreak/>
         <w:t>Documentation</w:t>
       </w:r>
     </w:p>
@@ -2979,171 +3729,171 @@
         <w:rPr>
           <w:lang w:val="fr-FR"/>
         </w:rPr>
+        <w:t>Correction de la gestion de la langue lors du rechargement de la page.</w:t>
+      </w:r>
+    </w:p>
+    <w:p>
+      <w:pPr>
+        <w:pStyle w:val="Listepuces"/>
+        <w:rPr>
+          <w:lang w:val="fr-FR"/>
+        </w:rPr>
+      </w:pPr>
+      <w:r>
+        <w:rPr>
+          <w:lang w:val="fr-FR"/>
+        </w:rPr>
+        <w:t>Correction du sélecteur de langue (Français / English / Deutsch).</w:t>
+      </w:r>
+    </w:p>
+    <w:p>
+      <w:pPr>
+        <w:pStyle w:val="Listepuces"/>
+        <w:rPr>
+          <w:lang w:val="fr-FR"/>
+        </w:rPr>
+      </w:pPr>
+      <w:r>
+        <w:rPr>
+          <w:lang w:val="fr-FR"/>
+        </w:rPr>
+        <w:t>Correction de la conservation de l’historique lors d’un changement de langue.</w:t>
+      </w:r>
+    </w:p>
+    <w:p>
+      <w:pPr>
+        <w:pStyle w:val="Listepuces"/>
+        <w:rPr>
+          <w:lang w:val="fr-FR"/>
+        </w:rPr>
+      </w:pPr>
+      <w:r>
+        <w:rPr>
+          <w:lang w:val="fr-FR"/>
+        </w:rPr>
+        <w:t>Traduction complète du panneau « Calcul précédent » dans les trois langues.</w:t>
+      </w:r>
+    </w:p>
+    <w:p>
+      <w:pPr>
+        <w:pStyle w:val="Titre2"/>
+      </w:pPr>
+      <w:proofErr w:type="spellStart"/>
+      <w:r>
+        <w:t>Améliorations</w:t>
+      </w:r>
+      <w:proofErr w:type="spellEnd"/>
+      <w:r>
+        <w:t xml:space="preserve"> techniques</w:t>
+      </w:r>
+    </w:p>
+    <w:p>
+      <w:pPr>
+        <w:pStyle w:val="Listepuces"/>
+        <w:rPr>
+          <w:lang w:val="fr-FR"/>
+        </w:rPr>
+      </w:pPr>
+      <w:r>
+        <w:rPr>
+          <w:lang w:val="fr-FR"/>
+        </w:rPr>
+        <w:t>Amélioration de la robustesse de la gestion de session Flask.</w:t>
+      </w:r>
+    </w:p>
+    <w:p>
+      <w:pPr>
+        <w:pStyle w:val="Listepuces"/>
+        <w:rPr>
+          <w:lang w:val="fr-FR"/>
+        </w:rPr>
+      </w:pPr>
+      <w:r>
+        <w:rPr>
+          <w:lang w:val="fr-FR"/>
+        </w:rPr>
+        <w:t>Ajout du script update.sh pour simplifier les mises à jour sous Ubuntu/Debian.</w:t>
+      </w:r>
+    </w:p>
+    <w:p>
+      <w:pPr>
+        <w:pStyle w:val="Listepuces"/>
+        <w:rPr>
+          <w:lang w:val="fr-FR"/>
+        </w:rPr>
+      </w:pPr>
+      <w:r>
+        <w:rPr>
+          <w:lang w:val="fr-FR"/>
+        </w:rPr>
+        <w:t xml:space="preserve">Validation du fonctionnement avec </w:t>
+      </w:r>
+      <w:proofErr w:type="spellStart"/>
+      <w:r>
+        <w:rPr>
+          <w:lang w:val="fr-FR"/>
+        </w:rPr>
+        <w:t>Gunicorn</w:t>
+      </w:r>
+      <w:proofErr w:type="spellEnd"/>
+      <w:r>
+        <w:rPr>
+          <w:lang w:val="fr-FR"/>
+        </w:rPr>
+        <w:t xml:space="preserve"> et service </w:t>
+      </w:r>
+      <w:proofErr w:type="spellStart"/>
+      <w:r>
+        <w:rPr>
+          <w:lang w:val="fr-FR"/>
+        </w:rPr>
+        <w:t>systemd</w:t>
+      </w:r>
+      <w:proofErr w:type="spellEnd"/>
+      <w:r>
+        <w:rPr>
+          <w:lang w:val="fr-FR"/>
+        </w:rPr>
+        <w:t>.</w:t>
+      </w:r>
+    </w:p>
+    <w:p>
+      <w:pPr>
+        <w:pStyle w:val="Listepuces"/>
+        <w:rPr>
+          <w:lang w:val="fr-FR"/>
+        </w:rPr>
+      </w:pPr>
+      <w:r>
+        <w:rPr>
+          <w:lang w:val="fr-FR"/>
+        </w:rPr>
+        <w:t>Mise à jour de la documentation de déploiement Ubuntu/Debian.</w:t>
+      </w:r>
+    </w:p>
+    <w:p>
+      <w:pPr>
+        <w:pStyle w:val="Listepuces"/>
+        <w:rPr>
+          <w:lang w:val="fr-FR"/>
+        </w:rPr>
+      </w:pPr>
+      <w:r>
+        <w:rPr>
+          <w:lang w:val="fr-FR"/>
+        </w:rPr>
+        <w:t>Nettoyage des traces temporaires de débogage.</w:t>
+      </w:r>
+    </w:p>
+    <w:p>
+      <w:pPr>
+        <w:pStyle w:val="Listepuces"/>
+        <w:rPr>
+          <w:lang w:val="fr-FR"/>
+        </w:rPr>
+      </w:pPr>
+      <w:r>
         <w:lastRenderedPageBreak/>
-        <w:t>Correction de la gestion de la langue lors du rechargement de la page.</w:t>
-      </w:r>
-    </w:p>
-    <w:p>
-      <w:pPr>
-        <w:pStyle w:val="Listepuces"/>
-        <w:rPr>
-          <w:lang w:val="fr-FR"/>
-        </w:rPr>
-      </w:pPr>
-      <w:r>
-        <w:rPr>
-          <w:lang w:val="fr-FR"/>
-        </w:rPr>
-        <w:t>Correction du sélecteur de langue (Français / English / Deutsch).</w:t>
-      </w:r>
-    </w:p>
-    <w:p>
-      <w:pPr>
-        <w:pStyle w:val="Listepuces"/>
-        <w:rPr>
-          <w:lang w:val="fr-FR"/>
-        </w:rPr>
-      </w:pPr>
-      <w:r>
-        <w:rPr>
-          <w:lang w:val="fr-FR"/>
-        </w:rPr>
-        <w:t>Correction de la conservation de l’historique lors d’un changement de langue.</w:t>
-      </w:r>
-    </w:p>
-    <w:p>
-      <w:pPr>
-        <w:pStyle w:val="Listepuces"/>
-        <w:rPr>
-          <w:lang w:val="fr-FR"/>
-        </w:rPr>
-      </w:pPr>
-      <w:r>
-        <w:rPr>
-          <w:lang w:val="fr-FR"/>
-        </w:rPr>
-        <w:t>Traduction complète du panneau « Calcul précédent » dans les trois langues.</w:t>
-      </w:r>
-    </w:p>
-    <w:p>
-      <w:pPr>
-        <w:pStyle w:val="Titre2"/>
-      </w:pPr>
-      <w:proofErr w:type="spellStart"/>
-      <w:r>
-        <w:t>Améliorations</w:t>
-      </w:r>
-      <w:proofErr w:type="spellEnd"/>
-      <w:r>
-        <w:t xml:space="preserve"> techniques</w:t>
-      </w:r>
-    </w:p>
-    <w:p>
-      <w:pPr>
-        <w:pStyle w:val="Listepuces"/>
-        <w:rPr>
-          <w:lang w:val="fr-FR"/>
-        </w:rPr>
-      </w:pPr>
-      <w:r>
-        <w:rPr>
-          <w:lang w:val="fr-FR"/>
-        </w:rPr>
-        <w:t>Amélioration de la robustesse de la gestion de session Flask.</w:t>
-      </w:r>
-    </w:p>
-    <w:p>
-      <w:pPr>
-        <w:pStyle w:val="Listepuces"/>
-        <w:rPr>
-          <w:lang w:val="fr-FR"/>
-        </w:rPr>
-      </w:pPr>
-      <w:r>
-        <w:rPr>
-          <w:lang w:val="fr-FR"/>
-        </w:rPr>
-        <w:t>Ajout du script update.sh pour simplifier les mises à jour sous Ubuntu/Debian.</w:t>
-      </w:r>
-    </w:p>
-    <w:p>
-      <w:pPr>
-        <w:pStyle w:val="Listepuces"/>
-        <w:rPr>
-          <w:lang w:val="fr-FR"/>
-        </w:rPr>
-      </w:pPr>
-      <w:r>
-        <w:rPr>
-          <w:lang w:val="fr-FR"/>
-        </w:rPr>
-        <w:t xml:space="preserve">Validation du fonctionnement avec </w:t>
-      </w:r>
-      <w:proofErr w:type="spellStart"/>
-      <w:r>
-        <w:rPr>
-          <w:lang w:val="fr-FR"/>
-        </w:rPr>
-        <w:t>Gunicorn</w:t>
-      </w:r>
-      <w:proofErr w:type="spellEnd"/>
-      <w:r>
-        <w:rPr>
-          <w:lang w:val="fr-FR"/>
-        </w:rPr>
-        <w:t xml:space="preserve"> et service </w:t>
-      </w:r>
-      <w:proofErr w:type="spellStart"/>
-      <w:r>
-        <w:rPr>
-          <w:lang w:val="fr-FR"/>
-        </w:rPr>
-        <w:t>systemd</w:t>
-      </w:r>
-      <w:proofErr w:type="spellEnd"/>
-      <w:r>
-        <w:rPr>
-          <w:lang w:val="fr-FR"/>
-        </w:rPr>
-        <w:t>.</w:t>
-      </w:r>
-    </w:p>
-    <w:p>
-      <w:pPr>
-        <w:pStyle w:val="Listepuces"/>
-        <w:rPr>
-          <w:lang w:val="fr-FR"/>
-        </w:rPr>
-      </w:pPr>
-      <w:r>
-        <w:rPr>
-          <w:lang w:val="fr-FR"/>
-        </w:rPr>
-        <w:t>Mise à jour de la documentation de déploiement Ubuntu/Debian.</w:t>
-      </w:r>
-    </w:p>
-    <w:p>
-      <w:pPr>
-        <w:pStyle w:val="Listepuces"/>
-        <w:rPr>
-          <w:lang w:val="fr-FR"/>
-        </w:rPr>
-      </w:pPr>
-      <w:r>
-        <w:rPr>
-          <w:lang w:val="fr-FR"/>
-        </w:rPr>
-        <w:t>Nettoyage des traces temporaires de débogage.</w:t>
-      </w:r>
-    </w:p>
-    <w:p>
-      <w:pPr>
-        <w:pStyle w:val="Listepuces"/>
-        <w:rPr>
-          <w:lang w:val="fr-FR"/>
-        </w:rPr>
-      </w:pPr>
-      <w:r>
         <w:t>Sessions Flask</w:t>
       </w:r>
     </w:p>
@@ -3622,68 +4372,349 @@
       </w:pPr>
       <w:proofErr w:type="spellStart"/>
       <w:r>
+        <w:t>Améliorations</w:t>
+      </w:r>
+      <w:proofErr w:type="spellEnd"/>
+      <w:r>
+        <w:t xml:space="preserve"> techniques</w:t>
+      </w:r>
+    </w:p>
+    <w:p>
+      <w:pPr>
+        <w:pStyle w:val="Listepuces"/>
+        <w:rPr>
+          <w:lang w:val="fr-FR"/>
+        </w:rPr>
+      </w:pPr>
+      <w:r>
+        <w:rPr>
+          <w:lang w:val="fr-FR"/>
+        </w:rPr>
+        <w:t xml:space="preserve">Factorisation des </w:t>
+      </w:r>
+      <w:proofErr w:type="spellStart"/>
+      <w:r>
+        <w:rPr>
+          <w:lang w:val="fr-FR"/>
+        </w:rPr>
+        <w:t>templates</w:t>
+      </w:r>
+      <w:proofErr w:type="spellEnd"/>
+      <w:r>
+        <w:rPr>
+          <w:lang w:val="fr-FR"/>
+        </w:rPr>
+        <w:t xml:space="preserve"> HTML via base.html.</w:t>
+      </w:r>
+    </w:p>
+    <w:p>
+      <w:pPr>
+        <w:pStyle w:val="Listepuces"/>
+        <w:rPr>
+          <w:lang w:val="fr-FR"/>
+        </w:rPr>
+      </w:pPr>
+      <w:r>
+        <w:rPr>
+          <w:lang w:val="fr-FR"/>
+        </w:rPr>
+        <w:t>Séparation du code métier dans le répertoire services.</w:t>
+      </w:r>
+    </w:p>
+    <w:p>
+      <w:pPr>
+        <w:pStyle w:val="Listepuces"/>
+      </w:pPr>
+      <w:r>
+        <w:t xml:space="preserve">Gestion des versions </w:t>
+      </w:r>
+      <w:proofErr w:type="spellStart"/>
+      <w:r>
+        <w:t>centralisée</w:t>
+      </w:r>
+      <w:proofErr w:type="spellEnd"/>
+      <w:r>
+        <w:t>.</w:t>
+      </w:r>
+    </w:p>
+    <w:p>
+      <w:pPr>
+        <w:pStyle w:val="Listepuces"/>
+        <w:rPr>
+          <w:lang w:val="fr-FR"/>
+        </w:rPr>
+      </w:pPr>
+      <w:r>
+        <w:rPr>
+          <w:lang w:val="fr-FR"/>
+        </w:rPr>
+        <w:t>Mise en place d’un favicon.</w:t>
+      </w:r>
+    </w:p>
+    <w:p>
+      <w:pPr>
+        <w:pStyle w:val="Listepuces"/>
+        <w:rPr>
+          <w:lang w:val="fr-FR"/>
+        </w:rPr>
+      </w:pPr>
+      <w:r>
+        <w:rPr>
+          <w:lang w:val="fr-FR"/>
+        </w:rPr>
+        <w:t>Validation renforcée des heures du jour (0&lt;=</w:t>
+      </w:r>
+      <w:proofErr w:type="spellStart"/>
+      <w:r>
+        <w:rPr>
+          <w:lang w:val="fr-FR"/>
+        </w:rPr>
+        <w:t>hh</w:t>
+      </w:r>
+      <w:proofErr w:type="spellEnd"/>
+      <w:r>
+        <w:rPr>
+          <w:lang w:val="fr-FR"/>
+        </w:rPr>
+        <w:t>&lt;=23, 0&lt;=mm&lt;=59, 0&lt;=</w:t>
+      </w:r>
+      <w:proofErr w:type="spellStart"/>
+      <w:r>
+        <w:rPr>
+          <w:lang w:val="fr-FR"/>
+        </w:rPr>
+        <w:t>ss</w:t>
+      </w:r>
+      <w:proofErr w:type="spellEnd"/>
+      <w:r>
+        <w:rPr>
+          <w:lang w:val="fr-FR"/>
+        </w:rPr>
+        <w:t>&lt;=59).</w:t>
+      </w:r>
+    </w:p>
+    <w:p>
+      <w:pPr>
+        <w:pStyle w:val="Listepuces"/>
+        <w:rPr>
+          <w:lang w:val="fr-FR"/>
+        </w:rPr>
+      </w:pPr>
+      <w:r>
+        <w:rPr>
+          <w:lang w:val="fr-FR"/>
+        </w:rPr>
+        <w:t>Amélioration de la robustesse des calculs.</w:t>
+      </w:r>
+    </w:p>
+    <w:p>
+      <w:pPr>
+        <w:pStyle w:val="Listepuces"/>
+        <w:rPr>
+          <w:lang w:val="fr-FR"/>
+        </w:rPr>
+      </w:pPr>
+      <w:r>
+        <w:rPr>
+          <w:lang w:val="fr-FR"/>
+        </w:rPr>
+        <w:t>Optimisation de la gestion des sessions Flask.</w:t>
+      </w:r>
+    </w:p>
+    <w:p>
+      <w:pPr>
+        <w:pStyle w:val="Titre3"/>
+      </w:pPr>
+      <w:r>
+        <w:t>Documentation</w:t>
+      </w:r>
+    </w:p>
+    <w:p>
+      <w:pPr>
+        <w:pStyle w:val="Listepuces"/>
+        <w:rPr>
+          <w:lang w:val="fr-FR"/>
+        </w:rPr>
+      </w:pPr>
+      <w:r>
+        <w:rPr>
+          <w:lang w:val="fr-FR"/>
+        </w:rPr>
+        <w:t>Guide des prérequis de déploiement.</w:t>
+      </w:r>
+    </w:p>
+    <w:p>
+      <w:pPr>
+        <w:pStyle w:val="Listepuces"/>
+      </w:pPr>
+      <w:r>
+        <w:t>Checklist de sécurité.</w:t>
+      </w:r>
+    </w:p>
+    <w:p>
+      <w:pPr>
+        <w:pStyle w:val="Listepuces"/>
+      </w:pPr>
+      <w:r>
         <w:lastRenderedPageBreak/>
-        <w:t>Améliorations</w:t>
+        <w:t xml:space="preserve">Documentation </w:t>
+      </w:r>
+      <w:proofErr w:type="spellStart"/>
+      <w:r>
+        <w:t>d’administration</w:t>
       </w:r>
       <w:proofErr w:type="spellEnd"/>
       <w:r>
-        <w:t xml:space="preserve"> techniques</w:t>
+        <w:t>.</w:t>
       </w:r>
     </w:p>
     <w:p>
       <w:pPr>
         <w:pStyle w:val="Listepuces"/>
-        <w:rPr>
-          <w:lang w:val="fr-FR"/>
-        </w:rPr>
-      </w:pPr>
-      <w:r>
-        <w:rPr>
-          <w:lang w:val="fr-FR"/>
-        </w:rPr>
-        <w:t xml:space="preserve">Factorisation des </w:t>
+      </w:pPr>
+      <w:r>
+        <w:t xml:space="preserve">Documentation de </w:t>
       </w:r>
       <w:proofErr w:type="spellStart"/>
       <w:r>
-        <w:rPr>
-          <w:lang w:val="fr-FR"/>
-        </w:rPr>
-        <w:t>templates</w:t>
+        <w:t>déploiement</w:t>
       </w:r>
       <w:proofErr w:type="spellEnd"/>
       <w:r>
-        <w:rPr>
-          <w:lang w:val="fr-FR"/>
-        </w:rPr>
-        <w:t xml:space="preserve"> HTML via base.html.</w:t>
+        <w:t>.</w:t>
       </w:r>
     </w:p>
     <w:p>
       <w:pPr>
         <w:pStyle w:val="Listepuces"/>
-        <w:rPr>
-          <w:lang w:val="fr-FR"/>
-        </w:rPr>
-      </w:pPr>
-      <w:r>
-        <w:rPr>
-          <w:lang w:val="fr-FR"/>
-        </w:rPr>
-        <w:t>Séparation du code métier dans le répertoire services.</w:t>
-      </w:r>
+      </w:pPr>
+      <w:r>
+        <w:t xml:space="preserve">README du </w:t>
+      </w:r>
+      <w:proofErr w:type="spellStart"/>
+      <w:r>
+        <w:t>projet</w:t>
+      </w:r>
+      <w:proofErr w:type="spellEnd"/>
+      <w:r>
+        <w:t>.</w:t>
+      </w:r>
+    </w:p>
+    <w:p>
+      <w:pPr>
+        <w:pStyle w:val="Titre3"/>
+      </w:pPr>
+      <w:r>
+        <w:t xml:space="preserve">Tests </w:t>
+      </w:r>
+      <w:proofErr w:type="spellStart"/>
+      <w:r>
+        <w:t>validés</w:t>
+      </w:r>
+      <w:proofErr w:type="spellEnd"/>
     </w:p>
     <w:p>
       <w:pPr>
         <w:pStyle w:val="Listepuces"/>
       </w:pPr>
       <w:r>
-        <w:t xml:space="preserve">Gestion des versions </w:t>
-      </w:r>
+        <w:t>Windows</w:t>
+      </w:r>
+    </w:p>
+    <w:p>
+      <w:pPr>
+        <w:pStyle w:val="Listepuces"/>
+      </w:pPr>
+      <w:r>
+        <w:t>Ubuntu Linux</w:t>
+      </w:r>
+    </w:p>
+    <w:p>
+      <w:pPr>
+        <w:pStyle w:val="Listepuces"/>
+      </w:pPr>
+      <w:r>
+        <w:t>Android (smartphone Samsung)</w:t>
+      </w:r>
+    </w:p>
+    <w:p>
+      <w:pPr>
+        <w:pStyle w:val="Listepuces"/>
+      </w:pPr>
+      <w:r>
+        <w:t>Réseau local Wi‑Fi</w:t>
+      </w:r>
+    </w:p>
+    <w:p>
+      <w:pPr>
+        <w:pStyle w:val="Listepuces"/>
+        <w:rPr>
+          <w:lang w:val="fr-FR"/>
+        </w:rPr>
+      </w:pPr>
+      <w:r>
+        <w:rPr>
+          <w:lang w:val="fr-FR"/>
+        </w:rPr>
+        <w:t>Génération PDF dans les trois langues</w:t>
+      </w:r>
+    </w:p>
+    <w:p>
+      <w:pPr>
+        <w:pStyle w:val="Titre3"/>
+      </w:pPr>
       <w:proofErr w:type="spellStart"/>
       <w:r>
-        <w:t>centralisée</w:t>
+        <w:t>Déploiement</w:t>
       </w:r>
       <w:proofErr w:type="spellEnd"/>
+    </w:p>
+    <w:p>
+      <w:pPr>
+        <w:pStyle w:val="Listepuces"/>
+      </w:pPr>
+      <w:proofErr w:type="spellStart"/>
+      <w:r>
+        <w:t>Déploiement</w:t>
+      </w:r>
+      <w:proofErr w:type="spellEnd"/>
+      <w:r>
+        <w:t xml:space="preserve"> </w:t>
+      </w:r>
+      <w:proofErr w:type="spellStart"/>
+      <w:r>
+        <w:t>validé</w:t>
+      </w:r>
+      <w:proofErr w:type="spellEnd"/>
+      <w:r>
+        <w:t xml:space="preserve"> sous Ubuntu.</w:t>
+      </w:r>
+    </w:p>
+    <w:p>
+      <w:pPr>
+        <w:pStyle w:val="Listepuces"/>
+      </w:pPr>
+      <w:proofErr w:type="spellStart"/>
+      <w:r>
+        <w:t>Fonctionnement</w:t>
+      </w:r>
+      <w:proofErr w:type="spellEnd"/>
+      <w:r>
+        <w:t xml:space="preserve"> </w:t>
+      </w:r>
+      <w:proofErr w:type="spellStart"/>
+      <w:r>
+        <w:t>validé</w:t>
+      </w:r>
+      <w:proofErr w:type="spellEnd"/>
+      <w:r>
+        <w:t xml:space="preserve"> avec </w:t>
+      </w:r>
+      <w:proofErr w:type="spellStart"/>
+      <w:r>
+        <w:t>Gunicorn</w:t>
+      </w:r>
+      <w:proofErr w:type="spellEnd"/>
       <w:r>
         <w:t>.</w:t>
       </w:r>
@@ -3691,15 +4722,30 @@
     <w:p>
       <w:pPr>
         <w:pStyle w:val="Listepuces"/>
-        <w:rPr>
-          <w:lang w:val="fr-FR"/>
-        </w:rPr>
-      </w:pPr>
-      <w:r>
-        <w:rPr>
-          <w:lang w:val="fr-FR"/>
-        </w:rPr>
-        <w:t>Mise en place d’un favicon.</w:t>
+      </w:pPr>
+      <w:proofErr w:type="spellStart"/>
+      <w:r>
+        <w:t>Fonctionnement</w:t>
+      </w:r>
+      <w:proofErr w:type="spellEnd"/>
+      <w:r>
+        <w:t xml:space="preserve"> </w:t>
+      </w:r>
+      <w:proofErr w:type="spellStart"/>
+      <w:r>
+        <w:t>validé</w:t>
+      </w:r>
+      <w:proofErr w:type="spellEnd"/>
+      <w:r>
+        <w:t xml:space="preserve"> avec </w:t>
+      </w:r>
+      <w:proofErr w:type="spellStart"/>
+      <w:r>
+        <w:t>systemd</w:t>
+      </w:r>
+      <w:proofErr w:type="spellEnd"/>
+      <w:r>
+        <w:t>.</w:t>
       </w:r>
     </w:p>
     <w:p>
@@ -3713,35 +4759,97 @@
         <w:rPr>
           <w:lang w:val="fr-FR"/>
         </w:rPr>
-        <w:t>Validation renforcée des heures du jour (0&lt;=</w:t>
+        <w:t>Préparation pour intégration sur infrastructure FFS.</w:t>
+      </w:r>
+    </w:p>
+    <w:p>
+      <w:pPr>
+        <w:pStyle w:val="Titre2"/>
+      </w:pPr>
+      <w:r>
+        <w:t>Version 1.00 - Mai 2026</w:t>
+      </w:r>
+    </w:p>
+    <w:p>
+      <w:pPr>
+        <w:pStyle w:val="Titre3"/>
+      </w:pPr>
+      <w:r>
+        <w:t xml:space="preserve">Première version </w:t>
       </w:r>
       <w:proofErr w:type="spellStart"/>
       <w:r>
-        <w:rPr>
-          <w:lang w:val="fr-FR"/>
-        </w:rPr>
-        <w:t>hh</w:t>
+        <w:t>opérationnelle</w:t>
       </w:r>
       <w:proofErr w:type="spellEnd"/>
-      <w:r>
-        <w:rPr>
-          <w:lang w:val="fr-FR"/>
-        </w:rPr>
-        <w:t>&lt;=23, 0&lt;=mm&lt;=59, 0&lt;=</w:t>
-      </w:r>
+    </w:p>
+    <w:p>
+      <w:pPr>
+        <w:pStyle w:val="Listepuces"/>
+        <w:rPr>
+          <w:lang w:val="fr-FR"/>
+        </w:rPr>
+      </w:pPr>
+      <w:r>
+        <w:rPr>
+          <w:lang w:val="fr-FR"/>
+        </w:rPr>
+        <w:t>Calcul du Temps Électronique Équivalent (EET).</w:t>
+      </w:r>
+    </w:p>
+    <w:p>
+      <w:pPr>
+        <w:pStyle w:val="Listepuces"/>
+        <w:rPr>
+          <w:lang w:val="fr-FR"/>
+        </w:rPr>
+      </w:pPr>
+      <w:r>
+        <w:rPr>
+          <w:lang w:val="fr-FR"/>
+        </w:rPr>
+        <w:t>Gestion des références de chronométrage.</w:t>
+      </w:r>
+    </w:p>
+    <w:p>
+      <w:pPr>
+        <w:pStyle w:val="Listepuces"/>
+        <w:rPr>
+          <w:lang w:val="fr-FR"/>
+        </w:rPr>
+      </w:pPr>
+      <w:r>
+        <w:rPr>
+          <w:lang w:val="fr-FR"/>
+        </w:rPr>
+        <w:t>Calcul automatique de la correction.</w:t>
+      </w:r>
+    </w:p>
+    <w:p>
+      <w:pPr>
+        <w:pStyle w:val="Listepuces"/>
+        <w:rPr>
+          <w:lang w:val="fr-FR"/>
+        </w:rPr>
+      </w:pPr>
+      <w:r>
+        <w:rPr>
+          <w:lang w:val="fr-FR"/>
+        </w:rPr>
+        <w:t>Calcul de l’EET selon les règles FIS.</w:t>
+      </w:r>
+    </w:p>
+    <w:p>
+      <w:pPr>
+        <w:pStyle w:val="Listepuces"/>
+      </w:pPr>
       <w:proofErr w:type="spellStart"/>
       <w:r>
-        <w:rPr>
-          <w:lang w:val="fr-FR"/>
-        </w:rPr>
-        <w:t>ss</w:t>
+        <w:t>Affichage</w:t>
       </w:r>
       <w:proofErr w:type="spellEnd"/>
       <w:r>
-        <w:rPr>
-          <w:lang w:val="fr-FR"/>
-        </w:rPr>
-        <w:t>&lt;=59).</w:t>
+        <w:t xml:space="preserve"> des deltas.</w:t>
       </w:r>
     </w:p>
     <w:p>
@@ -3755,21 +4863,51 @@
         <w:rPr>
           <w:lang w:val="fr-FR"/>
         </w:rPr>
-        <w:t>Amélioration de la robustesse des calculs.</w:t>
+        <w:t>Sélection des précisions TM et TE.</w:t>
       </w:r>
     </w:p>
     <w:p>
       <w:pPr>
         <w:pStyle w:val="Listepuces"/>
-        <w:rPr>
-          <w:lang w:val="fr-FR"/>
-        </w:rPr>
-      </w:pPr>
-      <w:r>
-        <w:rPr>
-          <w:lang w:val="fr-FR"/>
-        </w:rPr>
-        <w:t>Optimisation de la gestion des sessions Flask.</w:t>
+      </w:pPr>
+      <w:r>
+        <w:t>Interface web Flask.</w:t>
+      </w:r>
+    </w:p>
+    <w:p>
+      <w:pPr>
+        <w:pStyle w:val="Listepuces"/>
+      </w:pPr>
+      <w:r>
+        <w:t>Export PDF.</w:t>
+      </w:r>
+    </w:p>
+    <w:p>
+      <w:pPr>
+        <w:pStyle w:val="Listepuces"/>
+        <w:rPr>
+          <w:lang w:val="fr-FR"/>
+        </w:rPr>
+      </w:pPr>
+      <w:r>
+        <w:rPr>
+          <w:lang w:val="fr-FR"/>
+        </w:rPr>
+        <w:t>Pages Aide et À propos.</w:t>
+      </w:r>
+    </w:p>
+    <w:p>
+      <w:pPr>
+        <w:pStyle w:val="Listepuces"/>
+        <w:rPr>
+          <w:lang w:val="fr-FR"/>
+        </w:rPr>
+      </w:pPr>
+      <w:r>
+        <w:rPr>
+          <w:lang w:val="fr-FR"/>
+        </w:rPr>
+        <w:t>Support multilingue (Français, English, Deutsch).</w:t>
       </w:r>
     </w:p>
     <w:p>
@@ -3777,21 +4915,20 @@
         <w:pStyle w:val="Titre3"/>
       </w:pPr>
       <w:r>
-        <w:t>Documentation</w:t>
-      </w:r>
+        <w:t xml:space="preserve">Architecture </w:t>
+      </w:r>
+      <w:proofErr w:type="spellStart"/>
+      <w:r>
+        <w:t>initiale</w:t>
+      </w:r>
+      <w:proofErr w:type="spellEnd"/>
     </w:p>
     <w:p>
       <w:pPr>
         <w:pStyle w:val="Listepuces"/>
-        <w:rPr>
-          <w:lang w:val="fr-FR"/>
-        </w:rPr>
-      </w:pPr>
-      <w:r>
-        <w:rPr>
-          <w:lang w:val="fr-FR"/>
-        </w:rPr>
-        <w:t>Guide des prérequis de déploiement.</w:t>
+      </w:pPr>
+      <w:r>
+        <w:t>Application Flask.</w:t>
       </w:r>
     </w:p>
     <w:p>
@@ -3799,403 +4936,15 @@
         <w:pStyle w:val="Listepuces"/>
       </w:pPr>
       <w:r>
-        <w:t>Checklist de sécurité.</w:t>
+        <w:t>Templates HTML.</w:t>
       </w:r>
     </w:p>
     <w:p>
       <w:pPr>
         <w:pStyle w:val="Listepuces"/>
       </w:pPr>
-      <w:r>
-        <w:t xml:space="preserve">Documentation </w:t>
-      </w:r>
       <w:proofErr w:type="spellStart"/>
       <w:r>
-        <w:t>d’administration</w:t>
-      </w:r>
-      <w:proofErr w:type="spellEnd"/>
-      <w:r>
-        <w:t>.</w:t>
-      </w:r>
-    </w:p>
-    <w:p>
-      <w:pPr>
-        <w:pStyle w:val="Listepuces"/>
-      </w:pPr>
-      <w:r>
-        <w:t xml:space="preserve">Documentation de </w:t>
-      </w:r>
-      <w:proofErr w:type="spellStart"/>
-      <w:r>
-        <w:t>déploiement</w:t>
-      </w:r>
-      <w:proofErr w:type="spellEnd"/>
-      <w:r>
-        <w:t>.</w:t>
-      </w:r>
-    </w:p>
-    <w:p>
-      <w:pPr>
-        <w:pStyle w:val="Listepuces"/>
-      </w:pPr>
-      <w:r>
-        <w:t xml:space="preserve">README du </w:t>
-      </w:r>
-      <w:proofErr w:type="spellStart"/>
-      <w:r>
-        <w:t>projet</w:t>
-      </w:r>
-      <w:proofErr w:type="spellEnd"/>
-      <w:r>
-        <w:t>.</w:t>
-      </w:r>
-    </w:p>
-    <w:p>
-      <w:pPr>
-        <w:pStyle w:val="Titre3"/>
-      </w:pPr>
-      <w:r>
-        <w:t xml:space="preserve">Tests </w:t>
-      </w:r>
-      <w:proofErr w:type="spellStart"/>
-      <w:r>
-        <w:t>validés</w:t>
-      </w:r>
-      <w:proofErr w:type="spellEnd"/>
-    </w:p>
-    <w:p>
-      <w:pPr>
-        <w:pStyle w:val="Listepuces"/>
-      </w:pPr>
-      <w:r>
-        <w:t>Windows</w:t>
-      </w:r>
-    </w:p>
-    <w:p>
-      <w:pPr>
-        <w:pStyle w:val="Listepuces"/>
-      </w:pPr>
-      <w:r>
-        <w:t>Ubuntu Linux</w:t>
-      </w:r>
-    </w:p>
-    <w:p>
-      <w:pPr>
-        <w:pStyle w:val="Listepuces"/>
-      </w:pPr>
-      <w:r>
-        <w:t>Android (smartphone Samsung)</w:t>
-      </w:r>
-    </w:p>
-    <w:p>
-      <w:pPr>
-        <w:pStyle w:val="Listepuces"/>
-      </w:pPr>
-      <w:r>
-        <w:t>Réseau local Wi‑Fi</w:t>
-      </w:r>
-    </w:p>
-    <w:p>
-      <w:pPr>
-        <w:pStyle w:val="Listepuces"/>
-        <w:rPr>
-          <w:lang w:val="fr-FR"/>
-        </w:rPr>
-      </w:pPr>
-      <w:r>
-        <w:rPr>
-          <w:lang w:val="fr-FR"/>
-        </w:rPr>
-        <w:t>Génération PDF dans les trois langues</w:t>
-      </w:r>
-    </w:p>
-    <w:p>
-      <w:pPr>
-        <w:pStyle w:val="Titre3"/>
-      </w:pPr>
-      <w:proofErr w:type="spellStart"/>
-      <w:r>
-        <w:t>Déploiement</w:t>
-      </w:r>
-      <w:proofErr w:type="spellEnd"/>
-    </w:p>
-    <w:p>
-      <w:pPr>
-        <w:pStyle w:val="Listepuces"/>
-      </w:pPr>
-      <w:proofErr w:type="spellStart"/>
-      <w:r>
-        <w:t>Déploiement</w:t>
-      </w:r>
-      <w:proofErr w:type="spellEnd"/>
-      <w:r>
-        <w:t xml:space="preserve"> </w:t>
-      </w:r>
-      <w:proofErr w:type="spellStart"/>
-      <w:r>
-        <w:t>validé</w:t>
-      </w:r>
-      <w:proofErr w:type="spellEnd"/>
-      <w:r>
-        <w:t xml:space="preserve"> sous Ubuntu.</w:t>
-      </w:r>
-    </w:p>
-    <w:p>
-      <w:pPr>
-        <w:pStyle w:val="Listepuces"/>
-      </w:pPr>
-      <w:proofErr w:type="spellStart"/>
-      <w:r>
-        <w:t>Fonctionnement</w:t>
-      </w:r>
-      <w:proofErr w:type="spellEnd"/>
-      <w:r>
-        <w:t xml:space="preserve"> </w:t>
-      </w:r>
-      <w:proofErr w:type="spellStart"/>
-      <w:r>
-        <w:t>validé</w:t>
-      </w:r>
-      <w:proofErr w:type="spellEnd"/>
-      <w:r>
-        <w:t xml:space="preserve"> avec </w:t>
-      </w:r>
-      <w:proofErr w:type="spellStart"/>
-      <w:r>
-        <w:t>Gunicorn</w:t>
-      </w:r>
-      <w:proofErr w:type="spellEnd"/>
-      <w:r>
-        <w:t>.</w:t>
-      </w:r>
-    </w:p>
-    <w:p>
-      <w:pPr>
-        <w:pStyle w:val="Listepuces"/>
-      </w:pPr>
-      <w:proofErr w:type="spellStart"/>
-      <w:r>
-        <w:t>Fonctionnement</w:t>
-      </w:r>
-      <w:proofErr w:type="spellEnd"/>
-      <w:r>
-        <w:t xml:space="preserve"> </w:t>
-      </w:r>
-      <w:proofErr w:type="spellStart"/>
-      <w:r>
-        <w:t>validé</w:t>
-      </w:r>
-      <w:proofErr w:type="spellEnd"/>
-      <w:r>
-        <w:t xml:space="preserve"> avec </w:t>
-      </w:r>
-      <w:proofErr w:type="spellStart"/>
-      <w:r>
-        <w:t>systemd</w:t>
-      </w:r>
-      <w:proofErr w:type="spellEnd"/>
-      <w:r>
-        <w:t>.</w:t>
-      </w:r>
-    </w:p>
-    <w:p>
-      <w:pPr>
-        <w:pStyle w:val="Listepuces"/>
-        <w:rPr>
-          <w:lang w:val="fr-FR"/>
-        </w:rPr>
-      </w:pPr>
-      <w:r>
-        <w:rPr>
-          <w:lang w:val="fr-FR"/>
-        </w:rPr>
-        <w:t>Préparation pour intégration sur infrastructure FFS.</w:t>
-      </w:r>
-    </w:p>
-    <w:p>
-      <w:pPr>
-        <w:pStyle w:val="Titre2"/>
-      </w:pPr>
-      <w:r>
-        <w:t>Version 1.00 - Mai 2026</w:t>
-      </w:r>
-    </w:p>
-    <w:p>
-      <w:pPr>
-        <w:pStyle w:val="Titre3"/>
-      </w:pPr>
-      <w:r>
-        <w:t xml:space="preserve">Première version </w:t>
-      </w:r>
-      <w:proofErr w:type="spellStart"/>
-      <w:r>
-        <w:t>opérationnelle</w:t>
-      </w:r>
-      <w:proofErr w:type="spellEnd"/>
-    </w:p>
-    <w:p>
-      <w:pPr>
-        <w:pStyle w:val="Listepuces"/>
-        <w:rPr>
-          <w:lang w:val="fr-FR"/>
-        </w:rPr>
-      </w:pPr>
-      <w:r>
-        <w:rPr>
-          <w:lang w:val="fr-FR"/>
-        </w:rPr>
-        <w:t>Calcul du Temps Électronique Équivalent (EET).</w:t>
-      </w:r>
-    </w:p>
-    <w:p>
-      <w:pPr>
-        <w:pStyle w:val="Listepuces"/>
-        <w:rPr>
-          <w:lang w:val="fr-FR"/>
-        </w:rPr>
-      </w:pPr>
-      <w:r>
-        <w:rPr>
-          <w:lang w:val="fr-FR"/>
-        </w:rPr>
-        <w:t>Gestion des références de chronométrage.</w:t>
-      </w:r>
-    </w:p>
-    <w:p>
-      <w:pPr>
-        <w:pStyle w:val="Listepuces"/>
-        <w:rPr>
-          <w:lang w:val="fr-FR"/>
-        </w:rPr>
-      </w:pPr>
-      <w:r>
-        <w:rPr>
-          <w:lang w:val="fr-FR"/>
-        </w:rPr>
-        <w:t>Calcul automatique de la correction.</w:t>
-      </w:r>
-    </w:p>
-    <w:p>
-      <w:pPr>
-        <w:pStyle w:val="Listepuces"/>
-        <w:rPr>
-          <w:lang w:val="fr-FR"/>
-        </w:rPr>
-      </w:pPr>
-      <w:r>
-        <w:rPr>
-          <w:lang w:val="fr-FR"/>
-        </w:rPr>
-        <w:t>Calcul de l’EET selon les règles FIS.</w:t>
-      </w:r>
-    </w:p>
-    <w:p>
-      <w:pPr>
-        <w:pStyle w:val="Listepuces"/>
-      </w:pPr>
-      <w:proofErr w:type="spellStart"/>
-      <w:r>
-        <w:t>Affichage</w:t>
-      </w:r>
-      <w:proofErr w:type="spellEnd"/>
-      <w:r>
-        <w:t xml:space="preserve"> des deltas.</w:t>
-      </w:r>
-    </w:p>
-    <w:p>
-      <w:pPr>
-        <w:pStyle w:val="Listepuces"/>
-        <w:rPr>
-          <w:lang w:val="fr-FR"/>
-        </w:rPr>
-      </w:pPr>
-      <w:r>
-        <w:rPr>
-          <w:lang w:val="fr-FR"/>
-        </w:rPr>
-        <w:t>Sélection des précisions TM et TE.</w:t>
-      </w:r>
-    </w:p>
-    <w:p>
-      <w:pPr>
-        <w:pStyle w:val="Listepuces"/>
-      </w:pPr>
-      <w:r>
-        <w:t>Interface web Flask.</w:t>
-      </w:r>
-    </w:p>
-    <w:p>
-      <w:pPr>
-        <w:pStyle w:val="Listepuces"/>
-      </w:pPr>
-      <w:r>
-        <w:t>Export PDF.</w:t>
-      </w:r>
-    </w:p>
-    <w:p>
-      <w:pPr>
-        <w:pStyle w:val="Listepuces"/>
-        <w:rPr>
-          <w:lang w:val="fr-FR"/>
-        </w:rPr>
-      </w:pPr>
-      <w:r>
-        <w:rPr>
-          <w:lang w:val="fr-FR"/>
-        </w:rPr>
-        <w:t>Pages Aide et À propos.</w:t>
-      </w:r>
-    </w:p>
-    <w:p>
-      <w:pPr>
-        <w:pStyle w:val="Listepuces"/>
-        <w:rPr>
-          <w:lang w:val="fr-FR"/>
-        </w:rPr>
-      </w:pPr>
-      <w:r>
-        <w:rPr>
-          <w:lang w:val="fr-FR"/>
-        </w:rPr>
-        <w:t>Support multilingue (Français, English, Deutsch).</w:t>
-      </w:r>
-    </w:p>
-    <w:p>
-      <w:pPr>
-        <w:pStyle w:val="Titre3"/>
-      </w:pPr>
-      <w:r>
-        <w:t xml:space="preserve">Architecture </w:t>
-      </w:r>
-      <w:proofErr w:type="spellStart"/>
-      <w:r>
-        <w:t>initiale</w:t>
-      </w:r>
-      <w:proofErr w:type="spellEnd"/>
-    </w:p>
-    <w:p>
-      <w:pPr>
-        <w:pStyle w:val="Listepuces"/>
-      </w:pPr>
-      <w:r>
-        <w:t>Application Flask.</w:t>
-      </w:r>
-    </w:p>
-    <w:p>
-      <w:pPr>
-        <w:pStyle w:val="Listepuces"/>
-      </w:pPr>
-      <w:r>
-        <w:t>Templates HTML.</w:t>
-      </w:r>
-    </w:p>
-    <w:p>
-      <w:pPr>
-        <w:pStyle w:val="Listepuces"/>
-      </w:pPr>
-      <w:proofErr w:type="spellStart"/>
-      <w:r>
-        <w:lastRenderedPageBreak/>
         <w:t>Feuilles</w:t>
       </w:r>
       <w:proofErr w:type="spellEnd"/>
@@ -4334,6 +5083,7 @@
         <w:pStyle w:val="Listepuces"/>
       </w:pPr>
       <w:r>
+        <w:lastRenderedPageBreak/>
         <w:t xml:space="preserve">- </w:t>
       </w:r>
       <w:proofErr w:type="spellStart"/>
@@ -5592,6 +6342,155 @@
     </w:lvl>
   </w:abstractNum>
   <w:abstractNum w:abstractNumId="16" w15:restartNumberingAfterBreak="0">
+    <w:nsid w:val="302547E7"/>
+    <w:multiLevelType w:val="multilevel"/>
+    <w:tmpl w:val="7F3EE216"/>
+    <w:lvl w:ilvl="0">
+      <w:start w:val="1"/>
+      <w:numFmt w:val="bullet"/>
+      <w:lvlText w:val=""/>
+      <w:lvlJc w:val="left"/>
+      <w:pPr>
+        <w:tabs>
+          <w:tab w:val="num" w:pos="720"/>
+        </w:tabs>
+        <w:ind w:left="720" w:hanging="360"/>
+      </w:pPr>
+      <w:rPr>
+        <w:rFonts w:ascii="Symbol" w:hAnsi="Symbol" w:hint="default"/>
+        <w:sz w:val="20"/>
+      </w:rPr>
+    </w:lvl>
+    <w:lvl w:ilvl="1" w:tentative="1">
+      <w:start w:val="1"/>
+      <w:numFmt w:val="bullet"/>
+      <w:lvlText w:val="o"/>
+      <w:lvlJc w:val="left"/>
+      <w:pPr>
+        <w:tabs>
+          <w:tab w:val="num" w:pos="1440"/>
+        </w:tabs>
+        <w:ind w:left="1440" w:hanging="360"/>
+      </w:pPr>
+      <w:rPr>
+        <w:rFonts w:ascii="Courier New" w:hAnsi="Courier New" w:hint="default"/>
+        <w:sz w:val="20"/>
+      </w:rPr>
+    </w:lvl>
+    <w:lvl w:ilvl="2" w:tentative="1">
+      <w:start w:val="1"/>
+      <w:numFmt w:val="bullet"/>
+      <w:lvlText w:val=""/>
+      <w:lvlJc w:val="left"/>
+      <w:pPr>
+        <w:tabs>
+          <w:tab w:val="num" w:pos="2160"/>
+        </w:tabs>
+        <w:ind w:left="2160" w:hanging="360"/>
+      </w:pPr>
+      <w:rPr>
+        <w:rFonts w:ascii="Wingdings" w:hAnsi="Wingdings" w:hint="default"/>
+        <w:sz w:val="20"/>
+      </w:rPr>
+    </w:lvl>
+    <w:lvl w:ilvl="3" w:tentative="1">
+      <w:start w:val="1"/>
+      <w:numFmt w:val="bullet"/>
+      <w:lvlText w:val=""/>
+      <w:lvlJc w:val="left"/>
+      <w:pPr>
+        <w:tabs>
+          <w:tab w:val="num" w:pos="2880"/>
+        </w:tabs>
+        <w:ind w:left="2880" w:hanging="360"/>
+      </w:pPr>
+      <w:rPr>
+        <w:rFonts w:ascii="Wingdings" w:hAnsi="Wingdings" w:hint="default"/>
+        <w:sz w:val="20"/>
+      </w:rPr>
+    </w:lvl>
+    <w:lvl w:ilvl="4" w:tentative="1">
+      <w:start w:val="1"/>
+      <w:numFmt w:val="bullet"/>
+      <w:lvlText w:val=""/>
+      <w:lvlJc w:val="left"/>
+      <w:pPr>
+        <w:tabs>
+          <w:tab w:val="num" w:pos="3600"/>
+        </w:tabs>
+        <w:ind w:left="3600" w:hanging="360"/>
+      </w:pPr>
+      <w:rPr>
+        <w:rFonts w:ascii="Wingdings" w:hAnsi="Wingdings" w:hint="default"/>
+        <w:sz w:val="20"/>
+      </w:rPr>
+    </w:lvl>
+    <w:lvl w:ilvl="5" w:tentative="1">
+      <w:start w:val="1"/>
+      <w:numFmt w:val="bullet"/>
+      <w:lvlText w:val=""/>
+      <w:lvlJc w:val="left"/>
+      <w:pPr>
+        <w:tabs>
+          <w:tab w:val="num" w:pos="4320"/>
+        </w:tabs>
+        <w:ind w:left="4320" w:hanging="360"/>
+      </w:pPr>
+      <w:rPr>
+        <w:rFonts w:ascii="Wingdings" w:hAnsi="Wingdings" w:hint="default"/>
+        <w:sz w:val="20"/>
+      </w:rPr>
+    </w:lvl>
+    <w:lvl w:ilvl="6" w:tentative="1">
+      <w:start w:val="1"/>
+      <w:numFmt w:val="bullet"/>
+      <w:lvlText w:val=""/>
+      <w:lvlJc w:val="left"/>
+      <w:pPr>
+        <w:tabs>
+          <w:tab w:val="num" w:pos="5040"/>
+        </w:tabs>
+        <w:ind w:left="5040" w:hanging="360"/>
+      </w:pPr>
+      <w:rPr>
+        <w:rFonts w:ascii="Wingdings" w:hAnsi="Wingdings" w:hint="default"/>
+        <w:sz w:val="20"/>
+      </w:rPr>
+    </w:lvl>
+    <w:lvl w:ilvl="7" w:tentative="1">
+      <w:start w:val="1"/>
+      <w:numFmt w:val="bullet"/>
+      <w:lvlText w:val=""/>
+      <w:lvlJc w:val="left"/>
+      <w:pPr>
+        <w:tabs>
+          <w:tab w:val="num" w:pos="5760"/>
+        </w:tabs>
+        <w:ind w:left="5760" w:hanging="360"/>
+      </w:pPr>
+      <w:rPr>
+        <w:rFonts w:ascii="Wingdings" w:hAnsi="Wingdings" w:hint="default"/>
+        <w:sz w:val="20"/>
+      </w:rPr>
+    </w:lvl>
+    <w:lvl w:ilvl="8" w:tentative="1">
+      <w:start w:val="1"/>
+      <w:numFmt w:val="bullet"/>
+      <w:lvlText w:val=""/>
+      <w:lvlJc w:val="left"/>
+      <w:pPr>
+        <w:tabs>
+          <w:tab w:val="num" w:pos="6480"/>
+        </w:tabs>
+        <w:ind w:left="6480" w:hanging="360"/>
+      </w:pPr>
+      <w:rPr>
+        <w:rFonts w:ascii="Wingdings" w:hAnsi="Wingdings" w:hint="default"/>
+        <w:sz w:val="20"/>
+      </w:rPr>
+    </w:lvl>
+  </w:abstractNum>
+  <w:abstractNum w:abstractNumId="17" w15:restartNumberingAfterBreak="0">
     <w:nsid w:val="427F332C"/>
     <w:multiLevelType w:val="hybridMultilevel"/>
     <w:tmpl w:val="B89478DC"/>
@@ -5703,7 +6602,7 @@
       </w:rPr>
     </w:lvl>
   </w:abstractNum>
-  <w:abstractNum w:abstractNumId="17" w15:restartNumberingAfterBreak="0">
+  <w:abstractNum w:abstractNumId="18" w15:restartNumberingAfterBreak="0">
     <w:nsid w:val="4AE273F0"/>
     <w:multiLevelType w:val="hybridMultilevel"/>
     <w:tmpl w:val="0C94FAFC"/>
@@ -5816,7 +6715,7 @@
       </w:rPr>
     </w:lvl>
   </w:abstractNum>
-  <w:abstractNum w:abstractNumId="18" w15:restartNumberingAfterBreak="0">
+  <w:abstractNum w:abstractNumId="19" w15:restartNumberingAfterBreak="0">
     <w:nsid w:val="4B0D024A"/>
     <w:multiLevelType w:val="hybridMultilevel"/>
     <w:tmpl w:val="0396E3DC"/>
@@ -5929,7 +6828,7 @@
       </w:rPr>
     </w:lvl>
   </w:abstractNum>
-  <w:abstractNum w:abstractNumId="19" w15:restartNumberingAfterBreak="0">
+  <w:abstractNum w:abstractNumId="20" w15:restartNumberingAfterBreak="0">
     <w:nsid w:val="4BE545FA"/>
     <w:multiLevelType w:val="hybridMultilevel"/>
     <w:tmpl w:val="77740F48"/>
@@ -6042,7 +6941,156 @@
       </w:rPr>
     </w:lvl>
   </w:abstractNum>
-  <w:abstractNum w:abstractNumId="20" w15:restartNumberingAfterBreak="0">
+  <w:abstractNum w:abstractNumId="21" w15:restartNumberingAfterBreak="0">
+    <w:nsid w:val="523617CF"/>
+    <w:multiLevelType w:val="multilevel"/>
+    <w:tmpl w:val="44841348"/>
+    <w:lvl w:ilvl="0">
+      <w:start w:val="1"/>
+      <w:numFmt w:val="bullet"/>
+      <w:lvlText w:val=""/>
+      <w:lvlJc w:val="left"/>
+      <w:pPr>
+        <w:tabs>
+          <w:tab w:val="num" w:pos="720"/>
+        </w:tabs>
+        <w:ind w:left="720" w:hanging="360"/>
+      </w:pPr>
+      <w:rPr>
+        <w:rFonts w:ascii="Symbol" w:hAnsi="Symbol" w:hint="default"/>
+        <w:sz w:val="20"/>
+      </w:rPr>
+    </w:lvl>
+    <w:lvl w:ilvl="1">
+      <w:start w:val="1"/>
+      <w:numFmt w:val="bullet"/>
+      <w:lvlText w:val="o"/>
+      <w:lvlJc w:val="left"/>
+      <w:pPr>
+        <w:tabs>
+          <w:tab w:val="num" w:pos="1440"/>
+        </w:tabs>
+        <w:ind w:left="1440" w:hanging="360"/>
+      </w:pPr>
+      <w:rPr>
+        <w:rFonts w:ascii="Courier New" w:hAnsi="Courier New" w:hint="default"/>
+        <w:sz w:val="20"/>
+      </w:rPr>
+    </w:lvl>
+    <w:lvl w:ilvl="2" w:tentative="1">
+      <w:start w:val="1"/>
+      <w:numFmt w:val="bullet"/>
+      <w:lvlText w:val=""/>
+      <w:lvlJc w:val="left"/>
+      <w:pPr>
+        <w:tabs>
+          <w:tab w:val="num" w:pos="2160"/>
+        </w:tabs>
+        <w:ind w:left="2160" w:hanging="360"/>
+      </w:pPr>
+      <w:rPr>
+        <w:rFonts w:ascii="Wingdings" w:hAnsi="Wingdings" w:hint="default"/>
+        <w:sz w:val="20"/>
+      </w:rPr>
+    </w:lvl>
+    <w:lvl w:ilvl="3" w:tentative="1">
+      <w:start w:val="1"/>
+      <w:numFmt w:val="bullet"/>
+      <w:lvlText w:val=""/>
+      <w:lvlJc w:val="left"/>
+      <w:pPr>
+        <w:tabs>
+          <w:tab w:val="num" w:pos="2880"/>
+        </w:tabs>
+        <w:ind w:left="2880" w:hanging="360"/>
+      </w:pPr>
+      <w:rPr>
+        <w:rFonts w:ascii="Wingdings" w:hAnsi="Wingdings" w:hint="default"/>
+        <w:sz w:val="20"/>
+      </w:rPr>
+    </w:lvl>
+    <w:lvl w:ilvl="4" w:tentative="1">
+      <w:start w:val="1"/>
+      <w:numFmt w:val="bullet"/>
+      <w:lvlText w:val=""/>
+      <w:lvlJc w:val="left"/>
+      <w:pPr>
+        <w:tabs>
+          <w:tab w:val="num" w:pos="3600"/>
+        </w:tabs>
+        <w:ind w:left="3600" w:hanging="360"/>
+      </w:pPr>
+      <w:rPr>
+        <w:rFonts w:ascii="Wingdings" w:hAnsi="Wingdings" w:hint="default"/>
+        <w:sz w:val="20"/>
+      </w:rPr>
+    </w:lvl>
+    <w:lvl w:ilvl="5" w:tentative="1">
+      <w:start w:val="1"/>
+      <w:numFmt w:val="bullet"/>
+      <w:lvlText w:val=""/>
+      <w:lvlJc w:val="left"/>
+      <w:pPr>
+        <w:tabs>
+          <w:tab w:val="num" w:pos="4320"/>
+        </w:tabs>
+        <w:ind w:left="4320" w:hanging="360"/>
+      </w:pPr>
+      <w:rPr>
+        <w:rFonts w:ascii="Wingdings" w:hAnsi="Wingdings" w:hint="default"/>
+        <w:sz w:val="20"/>
+      </w:rPr>
+    </w:lvl>
+    <w:lvl w:ilvl="6" w:tentative="1">
+      <w:start w:val="1"/>
+      <w:numFmt w:val="bullet"/>
+      <w:lvlText w:val=""/>
+      <w:lvlJc w:val="left"/>
+      <w:pPr>
+        <w:tabs>
+          <w:tab w:val="num" w:pos="5040"/>
+        </w:tabs>
+        <w:ind w:left="5040" w:hanging="360"/>
+      </w:pPr>
+      <w:rPr>
+        <w:rFonts w:ascii="Wingdings" w:hAnsi="Wingdings" w:hint="default"/>
+        <w:sz w:val="20"/>
+      </w:rPr>
+    </w:lvl>
+    <w:lvl w:ilvl="7" w:tentative="1">
+      <w:start w:val="1"/>
+      <w:numFmt w:val="bullet"/>
+      <w:lvlText w:val=""/>
+      <w:lvlJc w:val="left"/>
+      <w:pPr>
+        <w:tabs>
+          <w:tab w:val="num" w:pos="5760"/>
+        </w:tabs>
+        <w:ind w:left="5760" w:hanging="360"/>
+      </w:pPr>
+      <w:rPr>
+        <w:rFonts w:ascii="Wingdings" w:hAnsi="Wingdings" w:hint="default"/>
+        <w:sz w:val="20"/>
+      </w:rPr>
+    </w:lvl>
+    <w:lvl w:ilvl="8" w:tentative="1">
+      <w:start w:val="1"/>
+      <w:numFmt w:val="bullet"/>
+      <w:lvlText w:val=""/>
+      <w:lvlJc w:val="left"/>
+      <w:pPr>
+        <w:tabs>
+          <w:tab w:val="num" w:pos="6480"/>
+        </w:tabs>
+        <w:ind w:left="6480" w:hanging="360"/>
+      </w:pPr>
+      <w:rPr>
+        <w:rFonts w:ascii="Wingdings" w:hAnsi="Wingdings" w:hint="default"/>
+        <w:sz w:val="20"/>
+      </w:rPr>
+    </w:lvl>
+  </w:abstractNum>
+  <w:abstractNum w:abstractNumId="22" w15:restartNumberingAfterBreak="0">
     <w:nsid w:val="5E361331"/>
     <w:multiLevelType w:val="multilevel"/>
     <w:tmpl w:val="017AE51E"/>
@@ -6191,7 +7239,7 @@
       </w:rPr>
     </w:lvl>
   </w:abstractNum>
-  <w:abstractNum w:abstractNumId="21" w15:restartNumberingAfterBreak="0">
+  <w:abstractNum w:abstractNumId="23" w15:restartNumberingAfterBreak="0">
     <w:nsid w:val="670F70ED"/>
     <w:multiLevelType w:val="hybridMultilevel"/>
     <w:tmpl w:val="2CF4EA26"/>
@@ -6303,7 +7351,7 @@
       </w:rPr>
     </w:lvl>
   </w:abstractNum>
-  <w:abstractNum w:abstractNumId="22" w15:restartNumberingAfterBreak="0">
+  <w:abstractNum w:abstractNumId="24" w15:restartNumberingAfterBreak="0">
     <w:nsid w:val="6C28160A"/>
     <w:multiLevelType w:val="hybridMultilevel"/>
     <w:tmpl w:val="7B12E8AE"/>
@@ -6415,7 +7463,7 @@
       </w:rPr>
     </w:lvl>
   </w:abstractNum>
-  <w:abstractNum w:abstractNumId="23" w15:restartNumberingAfterBreak="0">
+  <w:abstractNum w:abstractNumId="25" w15:restartNumberingAfterBreak="0">
     <w:nsid w:val="6FAE38E3"/>
     <w:multiLevelType w:val="hybridMultilevel"/>
     <w:tmpl w:val="46FC94A4"/>
@@ -6527,7 +7575,7 @@
       </w:rPr>
     </w:lvl>
   </w:abstractNum>
-  <w:abstractNum w:abstractNumId="24" w15:restartNumberingAfterBreak="0">
+  <w:abstractNum w:abstractNumId="26" w15:restartNumberingAfterBreak="0">
     <w:nsid w:val="742D20C4"/>
     <w:multiLevelType w:val="multilevel"/>
     <w:tmpl w:val="689A6A9A"/>
@@ -6548,6 +7596,155 @@
       </w:rPr>
     </w:lvl>
     <w:lvl w:ilvl="1">
+      <w:start w:val="1"/>
+      <w:numFmt w:val="bullet"/>
+      <w:lvlText w:val="o"/>
+      <w:lvlJc w:val="left"/>
+      <w:pPr>
+        <w:tabs>
+          <w:tab w:val="num" w:pos="1440"/>
+        </w:tabs>
+        <w:ind w:left="1440" w:hanging="360"/>
+      </w:pPr>
+      <w:rPr>
+        <w:rFonts w:ascii="Courier New" w:hAnsi="Courier New" w:hint="default"/>
+        <w:sz w:val="20"/>
+      </w:rPr>
+    </w:lvl>
+    <w:lvl w:ilvl="2" w:tentative="1">
+      <w:start w:val="1"/>
+      <w:numFmt w:val="bullet"/>
+      <w:lvlText w:val=""/>
+      <w:lvlJc w:val="left"/>
+      <w:pPr>
+        <w:tabs>
+          <w:tab w:val="num" w:pos="2160"/>
+        </w:tabs>
+        <w:ind w:left="2160" w:hanging="360"/>
+      </w:pPr>
+      <w:rPr>
+        <w:rFonts w:ascii="Wingdings" w:hAnsi="Wingdings" w:hint="default"/>
+        <w:sz w:val="20"/>
+      </w:rPr>
+    </w:lvl>
+    <w:lvl w:ilvl="3" w:tentative="1">
+      <w:start w:val="1"/>
+      <w:numFmt w:val="bullet"/>
+      <w:lvlText w:val=""/>
+      <w:lvlJc w:val="left"/>
+      <w:pPr>
+        <w:tabs>
+          <w:tab w:val="num" w:pos="2880"/>
+        </w:tabs>
+        <w:ind w:left="2880" w:hanging="360"/>
+      </w:pPr>
+      <w:rPr>
+        <w:rFonts w:ascii="Wingdings" w:hAnsi="Wingdings" w:hint="default"/>
+        <w:sz w:val="20"/>
+      </w:rPr>
+    </w:lvl>
+    <w:lvl w:ilvl="4" w:tentative="1">
+      <w:start w:val="1"/>
+      <w:numFmt w:val="bullet"/>
+      <w:lvlText w:val=""/>
+      <w:lvlJc w:val="left"/>
+      <w:pPr>
+        <w:tabs>
+          <w:tab w:val="num" w:pos="3600"/>
+        </w:tabs>
+        <w:ind w:left="3600" w:hanging="360"/>
+      </w:pPr>
+      <w:rPr>
+        <w:rFonts w:ascii="Wingdings" w:hAnsi="Wingdings" w:hint="default"/>
+        <w:sz w:val="20"/>
+      </w:rPr>
+    </w:lvl>
+    <w:lvl w:ilvl="5" w:tentative="1">
+      <w:start w:val="1"/>
+      <w:numFmt w:val="bullet"/>
+      <w:lvlText w:val=""/>
+      <w:lvlJc w:val="left"/>
+      <w:pPr>
+        <w:tabs>
+          <w:tab w:val="num" w:pos="4320"/>
+        </w:tabs>
+        <w:ind w:left="4320" w:hanging="360"/>
+      </w:pPr>
+      <w:rPr>
+        <w:rFonts w:ascii="Wingdings" w:hAnsi="Wingdings" w:hint="default"/>
+        <w:sz w:val="20"/>
+      </w:rPr>
+    </w:lvl>
+    <w:lvl w:ilvl="6" w:tentative="1">
+      <w:start w:val="1"/>
+      <w:numFmt w:val="bullet"/>
+      <w:lvlText w:val=""/>
+      <w:lvlJc w:val="left"/>
+      <w:pPr>
+        <w:tabs>
+          <w:tab w:val="num" w:pos="5040"/>
+        </w:tabs>
+        <w:ind w:left="5040" w:hanging="360"/>
+      </w:pPr>
+      <w:rPr>
+        <w:rFonts w:ascii="Wingdings" w:hAnsi="Wingdings" w:hint="default"/>
+        <w:sz w:val="20"/>
+      </w:rPr>
+    </w:lvl>
+    <w:lvl w:ilvl="7" w:tentative="1">
+      <w:start w:val="1"/>
+      <w:numFmt w:val="bullet"/>
+      <w:lvlText w:val=""/>
+      <w:lvlJc w:val="left"/>
+      <w:pPr>
+        <w:tabs>
+          <w:tab w:val="num" w:pos="5760"/>
+        </w:tabs>
+        <w:ind w:left="5760" w:hanging="360"/>
+      </w:pPr>
+      <w:rPr>
+        <w:rFonts w:ascii="Wingdings" w:hAnsi="Wingdings" w:hint="default"/>
+        <w:sz w:val="20"/>
+      </w:rPr>
+    </w:lvl>
+    <w:lvl w:ilvl="8" w:tentative="1">
+      <w:start w:val="1"/>
+      <w:numFmt w:val="bullet"/>
+      <w:lvlText w:val=""/>
+      <w:lvlJc w:val="left"/>
+      <w:pPr>
+        <w:tabs>
+          <w:tab w:val="num" w:pos="6480"/>
+        </w:tabs>
+        <w:ind w:left="6480" w:hanging="360"/>
+      </w:pPr>
+      <w:rPr>
+        <w:rFonts w:ascii="Wingdings" w:hAnsi="Wingdings" w:hint="default"/>
+        <w:sz w:val="20"/>
+      </w:rPr>
+    </w:lvl>
+  </w:abstractNum>
+  <w:abstractNum w:abstractNumId="27" w15:restartNumberingAfterBreak="0">
+    <w:nsid w:val="752615F1"/>
+    <w:multiLevelType w:val="multilevel"/>
+    <w:tmpl w:val="CD1062B0"/>
+    <w:lvl w:ilvl="0">
+      <w:start w:val="1"/>
+      <w:numFmt w:val="bullet"/>
+      <w:lvlText w:val=""/>
+      <w:lvlJc w:val="left"/>
+      <w:pPr>
+        <w:tabs>
+          <w:tab w:val="num" w:pos="720"/>
+        </w:tabs>
+        <w:ind w:left="720" w:hanging="360"/>
+      </w:pPr>
+      <w:rPr>
+        <w:rFonts w:ascii="Symbol" w:hAnsi="Symbol" w:hint="default"/>
+        <w:sz w:val="20"/>
+      </w:rPr>
+    </w:lvl>
+    <w:lvl w:ilvl="1" w:tentative="1">
       <w:start w:val="1"/>
       <w:numFmt w:val="bullet"/>
       <w:lvlText w:val="o"/>
@@ -6704,10 +7901,10 @@
     <w:abstractNumId w:val="0"/>
   </w:num>
   <w:num w:numId="10" w16cid:durableId="657928507">
-    <w:abstractNumId w:val="20"/>
+    <w:abstractNumId w:val="22"/>
   </w:num>
   <w:num w:numId="11" w16cid:durableId="4333970">
-    <w:abstractNumId w:val="24"/>
+    <w:abstractNumId w:val="26"/>
   </w:num>
   <w:num w:numId="12" w16cid:durableId="1619754819">
     <w:abstractNumId w:val="10"/>
@@ -6716,7 +7913,7 @@
     <w:abstractNumId w:val="13"/>
   </w:num>
   <w:num w:numId="14" w16cid:durableId="1894925761">
-    <w:abstractNumId w:val="17"/>
+    <w:abstractNumId w:val="18"/>
   </w:num>
   <w:num w:numId="15" w16cid:durableId="1334408597">
     <w:abstractNumId w:val="14"/>
@@ -6731,25 +7928,34 @@
     <w:abstractNumId w:val="9"/>
   </w:num>
   <w:num w:numId="19" w16cid:durableId="1086613626">
-    <w:abstractNumId w:val="19"/>
+    <w:abstractNumId w:val="20"/>
   </w:num>
   <w:num w:numId="20" w16cid:durableId="1121534631">
-    <w:abstractNumId w:val="18"/>
+    <w:abstractNumId w:val="19"/>
   </w:num>
   <w:num w:numId="21" w16cid:durableId="1681852733">
     <w:abstractNumId w:val="12"/>
   </w:num>
   <w:num w:numId="22" w16cid:durableId="398136196">
-    <w:abstractNumId w:val="22"/>
+    <w:abstractNumId w:val="24"/>
   </w:num>
   <w:num w:numId="23" w16cid:durableId="812215742">
+    <w:abstractNumId w:val="23"/>
+  </w:num>
+  <w:num w:numId="24" w16cid:durableId="631327678">
+    <w:abstractNumId w:val="25"/>
+  </w:num>
+  <w:num w:numId="25" w16cid:durableId="216741209">
+    <w:abstractNumId w:val="17"/>
+  </w:num>
+  <w:num w:numId="26" w16cid:durableId="2054764179">
+    <w:abstractNumId w:val="16"/>
+  </w:num>
+  <w:num w:numId="27" w16cid:durableId="41173772">
     <w:abstractNumId w:val="21"/>
   </w:num>
-  <w:num w:numId="24" w16cid:durableId="631327678">
-    <w:abstractNumId w:val="23"/>
-  </w:num>
-  <w:num w:numId="25" w16cid:durableId="216741209">
-    <w:abstractNumId w:val="16"/>
+  <w:num w:numId="28" w16cid:durableId="929890411">
+    <w:abstractNumId w:val="27"/>
   </w:num>
 </w:numbering>
 </file>
@@ -7357,7 +8563,6 @@
   <w:style w:type="character" w:default="1" w:styleId="Policepardfaut">
     <w:name w:val="Default Paragraph Font"/>
     <w:uiPriority w:val="1"/>
-    <w:semiHidden/>
     <w:unhideWhenUsed/>
   </w:style>
   <w:style w:type="table" w:default="1" w:styleId="TableauNormal">

</xml_diff>